<commit_message>
Keep Individual Guide available while running other Shiny apps
Open app.R files and ui.R/server.R folders in a branded, nearly full-window
viewer. Preserve the main project and both apps' inputs when switching views.
Run the guest in supervised R and a separate browser renderer, with explicit
close/replace controls, bounded logs, startup recovery and process cleanup.
Cancel close confirmations when returning to the workspace, and finish R
shutdown before closing the last window.

Integrate desktop menus, keyboard shortcuts, English and Canadian French.
Include two complete practice apps and a verified release ZIP. Update both
beginner handbooks and their real screenshots, and add release acceptance
coverage for downloads, retained projects and a deliberately frozen guest.

Validate with 31 focused R assertions, 15 Chromium browser checks, 12 native
acceptance checks, desktop Node suites and matching handbook verification.
</commit_message>
<xml_diff>
--- a/docs/handbook/Individual-Guide-Handbook.docx
+++ b/docs/handbook/Individual-Guide-Handbook.docx
@@ -43,7 +43,7 @@
         <w:rPr>
           <w:lang w:val="en-CA"/>
         </w:rPr>
-        <w:t xml:space="preserve">Beginner edition · Release 0.5.0 · 19 October 2026</w:t>
+        <w:t xml:space="preserve">Beginner edition · Release 0.6.0 · 20 October 2026</w:t>
       </w:r>
     </w:p>
     <w:sdt>
@@ -188,7 +188,7 @@
           <w:bCs/>
           <w:lang w:val="en-CA"/>
         </w:rPr>
-        <w:t xml:space="preserve">Individual Guide 0.5.0</w:t>
+        <w:t xml:space="preserve">Individual Guide 0.6.0</w:t>
       </w:r>
       <w:r>
         <w:rPr>
@@ -1293,7 +1293,7 @@
           <w:bCs/>
           <w:lang w:val="en-CA"/>
         </w:rPr>
-        <w:t xml:space="preserve">IndividualGuide-0.5.0-Setup-Windows-x64.exe</w:t>
+        <w:t xml:space="preserve">IndividualGuide-0.6.0-Setup-Windows-x64.exe</w:t>
       </w:r>
       <w:r>
         <w:rPr>
@@ -1319,7 +1319,7 @@
             <w:rStyle w:val="Hyperlink"/>
             <w:lang w:val="en-CA"/>
           </w:rPr>
-          <w:t xml:space="preserve">0.5.0 release page</w:t>
+          <w:t xml:space="preserve">0.6.0 release page</w:t>
         </w:r>
       </w:hyperlink>
       <w:r>
@@ -1588,7 +1588,7 @@
       <w:r>
         <w:drawing>
           <wp:inline>
-            <wp:extent cx="4319999" cy="3772799"/>
+            <wp:extent cx="4319999" cy="4240799"/>
             <wp:effectExtent b="0" l="0" r="0" t="0"/>
             <wp:docPr descr="Figure 2. At the welcome screen, choose Start with a blank canvas to reach the workspace and its Help menu." title="" id="25" name="Picture"/>
             <a:graphic>
@@ -1609,7 +1609,7 @@
                   <pic:spPr bwMode="auto">
                     <a:xfrm>
                       <a:off x="0" y="0"/>
-                      <a:ext cx="4319999" cy="3772799"/>
+                      <a:ext cx="4319999" cy="4240799"/>
                     </a:xfrm>
                     <a:prstGeom prst="rect">
                       <a:avLst/>
@@ -4611,7 +4611,7 @@
       <w:r>
         <w:drawing>
           <wp:inline>
-            <wp:extent cx="5334000" cy="1071634"/>
+            <wp:extent cx="5334000" cy="1118962"/>
             <wp:effectExtent b="0" l="0" r="0" t="0"/>
             <wp:docPr descr="Figure 6. In Outputs, flowers: table declares the table to keep. Its name matches flowers in the copied code." title="" id="51" name="Picture"/>
             <a:graphic>
@@ -4632,7 +4632,7 @@
                   <pic:spPr bwMode="auto">
                     <a:xfrm>
                       <a:off x="0" y="0"/>
-                      <a:ext cx="5334000" cy="1071634"/>
+                      <a:ext cx="5334000" cy="1118962"/>
                     </a:xfrm>
                     <a:prstGeom prst="rect">
                       <a:avLst/>
@@ -14615,7 +14615,7 @@
       <w:r>
         <w:drawing>
           <wp:inline>
-            <wp:extent cx="5334000" cy="4599554"/>
+            <wp:extent cx="5334000" cy="4792869"/>
             <wp:effectExtent b="0" l="0" r="0" t="0"/>
             <wp:docPr descr="Figure 13. Stack Columns keeps unselected identifier columns and puts the selected measurements into two new columns: their names and values." title="" id="115" name="Picture"/>
             <a:graphic>
@@ -14636,7 +14636,7 @@
                   <pic:spPr bwMode="auto">
                     <a:xfrm>
                       <a:off x="0" y="0"/>
-                      <a:ext cx="5334000" cy="4599554"/>
+                      <a:ext cx="5334000" cy="4792869"/>
                     </a:xfrm>
                     <a:prstGeom prst="rect">
                       <a:avLst/>
@@ -19136,7 +19136,7 @@
       <w:r>
         <w:drawing>
           <wp:inline>
-            <wp:extent cx="5334000" cy="4599554"/>
+            <wp:extent cx="5334000" cy="4792869"/>
             <wp:effectExtent b="0" l="0" r="0" t="0"/>
             <wp:docPr descr="Figure 15. One-Way Frequencies counts the selected Variable. Sort by frequency changes the order, while Results lets you check the counts." title="" id="139" name="Picture"/>
             <a:graphic>
@@ -19157,7 +19157,7 @@
                   <pic:spPr bwMode="auto">
                     <a:xfrm>
                       <a:off x="0" y="0"/>
-                      <a:ext cx="5334000" cy="4599554"/>
+                      <a:ext cx="5334000" cy="4792869"/>
                     </a:xfrm>
                     <a:prstGeom prst="rect">
                       <a:avLst/>
@@ -21393,7 +21393,7 @@
       <w:r>
         <w:drawing>
           <wp:inline>
-            <wp:extent cx="5334000" cy="4599554"/>
+            <wp:extent cx="5334000" cy="4792869"/>
             <wp:effectExtent b="0" l="0" r="0" t="0"/>
             <wp:docPr descr="Figure 17. Leaving Value blank makes Bar Chart count observations. Select Species as Category / X to compare the three flower groups." title="" id="154" name="Picture"/>
             <a:graphic>
@@ -21414,7 +21414,7 @@
                   <pic:spPr bwMode="auto">
                     <a:xfrm>
                       <a:off x="0" y="0"/>
-                      <a:ext cx="5334000" cy="4599554"/>
+                      <a:ext cx="5334000" cy="4792869"/>
                     </a:xfrm>
                     <a:prstGeom prst="rect">
                       <a:avLst/>
@@ -28556,7 +28556,7 @@
       <w:r>
         <w:drawing>
           <wp:inline>
-            <wp:extent cx="5334000" cy="4599554"/>
+            <wp:extent cx="5334000" cy="4792869"/>
             <wp:effectExtent b="0" l="0" r="0" t="0"/>
             <wp:docPr descr="Figure 20. The forecasting form uses an ordered value column and a horizon measured in steps. It does not infer the calendar interval from a date column." title="" id="191" name="Picture"/>
             <a:graphic>
@@ -28577,7 +28577,7 @@
                   <pic:spPr bwMode="auto">
                     <a:xfrm>
                       <a:off x="0" y="0"/>
-                      <a:ext cx="5334000" cy="4599554"/>
+                      <a:ext cx="5334000" cy="4792869"/>
                     </a:xfrm>
                     <a:prstGeom prst="rect">
                       <a:avLst/>
@@ -30765,7 +30765,7 @@
       <w:r>
         <w:drawing>
           <wp:inline>
-            <wp:extent cx="5334000" cy="4599554"/>
+            <wp:extent cx="5334000" cy="4792869"/>
             <wp:effectExtent b="0" l="0" r="0" t="0"/>
             <wp:docPr descr="Figure 23. Loop settings choose the source of repeated work. Preview loop lets you check the planned groups before running the flow." title="" id="209" name="Picture"/>
             <a:graphic>
@@ -30786,7 +30786,7 @@
                   <pic:spPr bwMode="auto">
                     <a:xfrm>
                       <a:off x="0" y="0"/>
-                      <a:ext cx="5334000" cy="4599554"/>
+                      <a:ext cx="5334000" cy="4792869"/>
                     </a:xfrm>
                     <a:prstGeom prst="rect">
                       <a:avLst/>
@@ -31840,7 +31840,7 @@
       <w:r>
         <w:drawing>
           <wp:inline>
-            <wp:extent cx="5334000" cy="4636648"/>
+            <wp:extent cx="5334000" cy="4831521"/>
             <wp:effectExtent b="0" l="0" r="0" t="0"/>
             <wp:docPr descr="Figure 24. Task Logging lets you choose events, levels, and message fields. Test the wording in the preview before running the task." title="" id="218" name="Picture"/>
             <a:graphic>
@@ -31861,7 +31861,7 @@
                   <pic:spPr bwMode="auto">
                     <a:xfrm>
                       <a:off x="0" y="0"/>
-                      <a:ext cx="5334000" cy="4636648"/>
+                      <a:ext cx="5334000" cy="4831521"/>
                     </a:xfrm>
                     <a:prstGeom prst="rect">
                       <a:avLst/>
@@ -31934,7 +31934,7 @@
       <w:r>
         <w:drawing>
           <wp:inline>
-            <wp:extent cx="5334000" cy="3246120"/>
+            <wp:extent cx="5334000" cy="3386414"/>
             <wp:effectExtent b="0" l="0" r="0" t="0"/>
             <wp:docPr descr="Figure 25. Read the rendered entry before running the task. File output preview lets you inspect Text, CSV, or JSON without writing a file." title="" id="222" name="Picture"/>
             <a:graphic>
@@ -31955,7 +31955,7 @@
                   <pic:spPr bwMode="auto">
                     <a:xfrm>
                       <a:off x="0" y="0"/>
-                      <a:ext cx="5334000" cy="3246120"/>
+                      <a:ext cx="5334000" cy="3386414"/>
                     </a:xfrm>
                     <a:prstGeom prst="rect">
                       <a:avLst/>
@@ -35082,7 +35082,7 @@
       <w:r>
         <w:drawing>
           <wp:inline>
-            <wp:extent cx="5334000" cy="4599554"/>
+            <wp:extent cx="5334000" cy="4792869"/>
             <wp:effectExtent b="0" l="0" r="0" t="0"/>
             <wp:docPr descr="Figure 30. The R Console has a command area and transcript. Project-data controls supply working copies for trials; they do not add a step to the flow." title="" id="256" name="Picture"/>
             <a:graphic>
@@ -35103,7 +35103,7 @@
                   <pic:spPr bwMode="auto">
                     <a:xfrm>
                       <a:off x="0" y="0"/>
-                      <a:ext cx="5334000" cy="4599554"/>
+                      <a:ext cx="5334000" cy="4792869"/>
                     </a:xfrm>
                     <a:prstGeom prst="rect">
                       <a:avLst/>
@@ -36107,7 +36107,7 @@
       <w:r>
         <w:drawing>
           <wp:inline>
-            <wp:extent cx="5334000" cy="4599554"/>
+            <wp:extent cx="5334000" cy="4792869"/>
             <wp:effectExtent b="0" l="0" r="0" t="0"/>
             <wp:docPr descr="Figure 31. The Code tab separates the pipeline from supporting functions. Download .R includes both in one file; Download bundle keeps them together in a ZIP." title="" id="266" name="Picture"/>
             <a:graphic>
@@ -36128,7 +36128,7 @@
                   <pic:spPr bwMode="auto">
                     <a:xfrm>
                       <a:off x="0" y="0"/>
-                      <a:ext cx="5334000" cy="4599554"/>
+                      <a:ext cx="5334000" cy="4792869"/>
                     </a:xfrm>
                     <a:prstGeom prst="rect">
                       <a:avLst/>
@@ -37786,7 +37786,7 @@
       <w:pPr>
         <w:pStyle w:val="Heading1"/>
       </w:pPr>
-      <w:bookmarkStart w:id="290" w:name="_performance"/>
+      <w:bookmarkStart w:id="290" w:name="_d7446b71cfcb430df49d33749f78a202c4fc9b8"/>
       <w:r>
         <w:rPr>
           <w:rStyle w:val="SectionNumber"/>
@@ -37801,9 +37801,1279 @@
         <w:rPr>
           <w:lang w:val="en-CA"/>
         </w:rPr>
+        <w:t xml:space="preserve">Open other Shiny apps</w:t>
+      </w:r>
+      <w:bookmarkEnd w:id="290"/>
+    </w:p>
+    <w:p>
+      <w:pPr>
+        <w:pStyle w:val="FirstParagraph"/>
+      </w:pPr>
+      <w:r>
+        <w:rPr>
+          <w:lang w:val="en-CA"/>
+        </w:rPr>
+        <w:t xml:space="preserve">A Shiny app is an interactive page that uses R behind the scenes. It may show a dashboard, a chart, or a form. You can open an app someone has shared with you inside Individual Guide. You do not need to copy its code into a pipeline.</w:t>
+      </w:r>
+    </w:p>
+    <w:p>
+      <w:pPr>
+        <w:pStyle w:val="BodyText"/>
+      </w:pPr>
+      <w:r>
+        <w:rPr>
+          <w:lang w:val="en-CA"/>
+        </w:rPr>
+        <w:t xml:space="preserve">Your Individual Guide project stays open. The other app runs in a separate copy of R. Its view fills most of the window, with an Individual Guide bar across the top.</w:t>
+      </w:r>
+    </w:p>
+    <w:p>
+      <w:pPr>
+        <w:pStyle w:val="Heading2"/>
+      </w:pPr>
+      <w:bookmarkStart w:id="291" w:name="_3b1a859b6741dfbc5762e571121795b31225f24"/>
+      <w:r>
+        <w:rPr>
+          <w:rStyle w:val="SectionNumber"/>
+          <w:lang w:val="en-CA"/>
+        </w:rPr>
+        <w:t xml:space="preserve">23.1</w:t>
+      </w:r>
+      <w:r>
+        <w:tab/>
+      </w:r>
+      <w:r>
+        <w:rPr>
+          <w:lang w:val="en-CA"/>
+        </w:rPr>
+        <w:t xml:space="preserve">What you need</w:t>
+      </w:r>
+      <w:bookmarkEnd w:id="291"/>
+    </w:p>
+    <w:p>
+      <w:pPr>
+        <w:pStyle w:val="FirstParagraph"/>
+      </w:pPr>
+      <w:r>
+        <w:rPr>
+          <w:lang w:val="en-CA"/>
+        </w:rPr>
+        <w:t xml:space="preserve">Ask the app’s author for its complete folder and any setup instructions. A supported folder has either:</w:t>
+      </w:r>
+    </w:p>
+    <w:p>
+      <w:pPr>
+        <w:pStyle w:val="Compact"/>
+        <w:numPr>
+          <w:ilvl w:val="0"/>
+          <w:numId w:val="1090"/>
+        </w:numPr>
+      </w:pPr>
+      <w:r>
+        <w:rPr>
+          <w:lang w:val="en-CA"/>
+        </w:rPr>
+        <w:t xml:space="preserve">One</w:t>
+      </w:r>
+      <w:r>
+        <w:rPr>
+          <w:lang w:val="en-CA"/>
+        </w:rPr>
+        <w:t xml:space="preserve"> </w:t>
+      </w:r>
+      <w:r>
+        <w:rPr>
+          <w:b/>
+          <w:bCs/>
+          <w:lang w:val="en-CA"/>
+        </w:rPr>
+        <w:t xml:space="preserve">app.R</w:t>
+      </w:r>
+      <w:r>
+        <w:rPr>
+          <w:lang w:val="en-CA"/>
+        </w:rPr>
+        <w:t xml:space="preserve"> </w:t>
+      </w:r>
+      <w:r>
+        <w:rPr>
+          <w:lang w:val="en-CA"/>
+        </w:rPr>
+        <w:t xml:space="preserve">file, plus any data and helper files it uses.</w:t>
+      </w:r>
+    </w:p>
+    <w:p>
+      <w:pPr>
+        <w:pStyle w:val="Compact"/>
+        <w:numPr>
+          <w:ilvl w:val="0"/>
+          <w:numId w:val="1090"/>
+        </w:numPr>
+      </w:pPr>
+      <w:r>
+        <w:rPr>
+          <w:lang w:val="en-CA"/>
+        </w:rPr>
+        <w:t xml:space="preserve">Both</w:t>
+      </w:r>
+      <w:r>
+        <w:rPr>
+          <w:lang w:val="en-CA"/>
+        </w:rPr>
+        <w:t xml:space="preserve"> </w:t>
+      </w:r>
+      <w:r>
+        <w:rPr>
+          <w:b/>
+          <w:bCs/>
+          <w:lang w:val="en-CA"/>
+        </w:rPr>
+        <w:t xml:space="preserve">ui.R</w:t>
+      </w:r>
+      <w:r>
+        <w:rPr>
+          <w:lang w:val="en-CA"/>
+        </w:rPr>
+        <w:t xml:space="preserve"> </w:t>
+      </w:r>
+      <w:r>
+        <w:rPr>
+          <w:lang w:val="en-CA"/>
+        </w:rPr>
+        <w:t xml:space="preserve">and</w:t>
+      </w:r>
+      <w:r>
+        <w:rPr>
+          <w:lang w:val="en-CA"/>
+        </w:rPr>
+        <w:t xml:space="preserve"> </w:t>
+      </w:r>
+      <w:r>
+        <w:rPr>
+          <w:b/>
+          <w:bCs/>
+          <w:lang w:val="en-CA"/>
+        </w:rPr>
+        <w:t xml:space="preserve">server.R</w:t>
+      </w:r>
+      <w:r>
+        <w:rPr>
+          <w:lang w:val="en-CA"/>
+        </w:rPr>
+        <w:t xml:space="preserve">, plus any other files it uses.</w:t>
+      </w:r>
+    </w:p>
+    <w:p>
+      <w:pPr>
+        <w:pStyle w:val="FirstParagraph"/>
+      </w:pPr>
+      <w:r>
+        <w:rPr>
+          <w:lang w:val="en-CA"/>
+        </w:rPr>
+        <w:t xml:space="preserve">Keep the folder together. If it came in a ZIP file, extract it first. Selecting a file does not upload it or install packages. The app runs on this computer and can read or change files with your permissions. Use apps only from a source you trust.</w:t>
+      </w:r>
+    </w:p>
+    <w:p>
+      <w:pPr>
+        <w:pStyle w:val="Heading2"/>
+      </w:pPr>
+      <w:bookmarkStart w:id="292" w:name="_29ae360ae6e948183496a3ff05aab1575157d71"/>
+      <w:r>
+        <w:rPr>
+          <w:rStyle w:val="SectionNumber"/>
+          <w:lang w:val="en-CA"/>
+        </w:rPr>
+        <w:t xml:space="preserve">23.2</w:t>
+      </w:r>
+      <w:r>
+        <w:tab/>
+      </w:r>
+      <w:r>
+        <w:rPr>
+          <w:lang w:val="en-CA"/>
+        </w:rPr>
+        <w:t xml:space="preserve">Try the practice apps</w:t>
+      </w:r>
+      <w:bookmarkEnd w:id="292"/>
+    </w:p>
+    <w:p>
+      <w:pPr>
+        <w:pStyle w:val="Compact"/>
+        <w:numPr>
+          <w:ilvl w:val="0"/>
+          <w:numId w:val="1091"/>
+        </w:numPr>
+      </w:pPr>
+      <w:r>
+        <w:rPr>
+          <w:lang w:val="en-CA"/>
+        </w:rPr>
+        <w:t xml:space="preserve">Download the</w:t>
+      </w:r>
+      <w:r>
+        <w:rPr>
+          <w:lang w:val="en-CA"/>
+        </w:rPr>
+        <w:t xml:space="preserve"> </w:t>
+      </w:r>
+      <w:hyperlink r:id="rId293">
+        <w:r>
+          <w:rPr>
+            <w:rStyle w:val="Hyperlink"/>
+            <w:lang w:val="en-CA"/>
+          </w:rPr>
+          <w:t xml:space="preserve">Shiny practice apps for this release</w:t>
+        </w:r>
+      </w:hyperlink>
+      <w:r>
+        <w:rPr>
+          <w:lang w:val="en-CA"/>
+        </w:rPr>
+        <w:t xml:space="preserve">.</w:t>
+      </w:r>
+    </w:p>
+    <w:p>
+      <w:pPr>
+        <w:pStyle w:val="Compact"/>
+        <w:numPr>
+          <w:ilvl w:val="0"/>
+          <w:numId w:val="1091"/>
+        </w:numPr>
+      </w:pPr>
+      <w:r>
+        <w:rPr>
+          <w:lang w:val="en-CA"/>
+        </w:rPr>
+        <w:t xml:space="preserve">Right-click the ZIP in Windows and choose</w:t>
+      </w:r>
+      <w:r>
+        <w:rPr>
+          <w:lang w:val="en-CA"/>
+        </w:rPr>
+        <w:t xml:space="preserve"> </w:t>
+      </w:r>
+      <w:r>
+        <w:rPr>
+          <w:b/>
+          <w:bCs/>
+          <w:lang w:val="en-CA"/>
+        </w:rPr>
+        <w:t xml:space="preserve">Extract All</w:t>
+      </w:r>
+      <w:r>
+        <w:rPr>
+          <w:lang w:val="en-CA"/>
+        </w:rPr>
+        <w:t xml:space="preserve">. Choose a folder you can find again.</w:t>
+      </w:r>
+    </w:p>
+    <w:p>
+      <w:pPr>
+        <w:pStyle w:val="Compact"/>
+        <w:numPr>
+          <w:ilvl w:val="0"/>
+          <w:numId w:val="1091"/>
+        </w:numPr>
+      </w:pPr>
+      <w:r>
+        <w:rPr>
+          <w:lang w:val="en-CA"/>
+        </w:rPr>
+        <w:t xml:space="preserve">Follow the steps below. Select</w:t>
+      </w:r>
+      <w:r>
+        <w:rPr>
+          <w:lang w:val="en-CA"/>
+        </w:rPr>
+        <w:t xml:space="preserve"> </w:t>
+      </w:r>
+      <w:r>
+        <w:rPr>
+          <w:b/>
+          <w:bCs/>
+          <w:lang w:val="en-CA"/>
+        </w:rPr>
+        <w:t xml:space="preserve">iris-explorer/app.R</w:t>
+      </w:r>
+      <w:r>
+        <w:rPr>
+          <w:lang w:val="en-CA"/>
+        </w:rPr>
+        <w:t xml:space="preserve"> </w:t>
+      </w:r>
+      <w:r>
+        <w:rPr>
+          <w:lang w:val="en-CA"/>
+        </w:rPr>
+        <w:t xml:space="preserve">for the flower app. Select the</w:t>
+      </w:r>
+      <w:r>
+        <w:rPr>
+          <w:lang w:val="en-CA"/>
+        </w:rPr>
+        <w:t xml:space="preserve"> </w:t>
+      </w:r>
+      <w:r>
+        <w:rPr>
+          <w:b/>
+          <w:bCs/>
+          <w:lang w:val="en-CA"/>
+        </w:rPr>
+        <w:t xml:space="preserve">local-sales</w:t>
+      </w:r>
+      <w:r>
+        <w:rPr>
+          <w:lang w:val="en-CA"/>
+        </w:rPr>
+        <w:t xml:space="preserve"> </w:t>
+      </w:r>
+      <w:r>
+        <w:rPr>
+          <w:lang w:val="en-CA"/>
+        </w:rPr>
+        <w:t xml:space="preserve">folder for the two-file app, which reads a CSV and can download a filtered copy. Both use packages included with Individual Guide.</w:t>
+      </w:r>
+    </w:p>
+    <w:p>
+      <w:pPr>
+        <w:pStyle w:val="FirstParagraph"/>
+      </w:pPr>
+      <w:r>
+        <w:rPr>
+          <w:lang w:val="en-CA"/>
+        </w:rPr>
+        <w:t xml:space="preserve">The flower app has its own</w:t>
+      </w:r>
+      <w:r>
+        <w:rPr>
+          <w:lang w:val="en-CA"/>
+        </w:rPr>
+        <w:t xml:space="preserve"> </w:t>
+      </w:r>
+      <w:r>
+        <w:rPr>
+          <w:b/>
+          <w:bCs/>
+          <w:lang w:val="en-CA"/>
+        </w:rPr>
+        <w:t xml:space="preserve">Language / Langue</w:t>
+      </w:r>
+      <w:r>
+        <w:rPr>
+          <w:lang w:val="en-CA"/>
+        </w:rPr>
+        <w:t xml:space="preserve"> </w:t>
+      </w:r>
+      <w:r>
+        <w:rPr>
+          <w:lang w:val="en-CA"/>
+        </w:rPr>
+        <w:t xml:space="preserve">list. Choose</w:t>
+      </w:r>
+      <w:r>
+        <w:rPr>
+          <w:lang w:val="en-CA"/>
+        </w:rPr>
+        <w:t xml:space="preserve"> </w:t>
+      </w:r>
+      <w:r>
+        <w:rPr>
+          <w:b/>
+          <w:bCs/>
+          <w:lang w:val="en-CA"/>
+        </w:rPr>
+        <w:t xml:space="preserve">Français (Canada)</w:t>
+      </w:r>
+      <w:r>
+        <w:rPr>
+          <w:lang w:val="en-CA"/>
+        </w:rPr>
+        <w:t xml:space="preserve"> </w:t>
+      </w:r>
+      <w:r>
+        <w:rPr>
+          <w:lang w:val="en-CA"/>
+        </w:rPr>
+        <w:t xml:space="preserve">there to see French labels inside that app. That list changes the practice app only.</w:t>
+      </w:r>
+    </w:p>
+    <w:p>
+      <w:pPr>
+        <w:pStyle w:val="Heading2"/>
+      </w:pPr>
+      <w:bookmarkStart w:id="294" w:name="_e5b1f98f9d048705c5948025eafd99d120149eb"/>
+      <w:r>
+        <w:rPr>
+          <w:rStyle w:val="SectionNumber"/>
+          <w:lang w:val="en-CA"/>
+        </w:rPr>
+        <w:t xml:space="preserve">23.3</w:t>
+      </w:r>
+      <w:r>
+        <w:tab/>
+      </w:r>
+      <w:r>
+        <w:rPr>
+          <w:lang w:val="en-CA"/>
+        </w:rPr>
+        <w:t xml:space="preserve">Open and run an app</w:t>
+      </w:r>
+      <w:bookmarkEnd w:id="294"/>
+    </w:p>
+    <w:bookmarkStart w:id="298" w:name="_4ad829aa092ea5da191cef59950112c3610d9d0"/>
+    <w:p>
+      <w:pPr>
+        <w:pStyle w:val="CaptionedFigure"/>
+      </w:pPr>
+      <w:r>
+        <w:drawing>
+          <wp:inline>
+            <wp:extent cx="5334000" cy="3655116"/>
+            <wp:effectExtent b="0" l="0" r="0" t="0"/>
+            <wp:docPr descr="Figure 35. Choose a single app.R file or a folder containing both ui.R and server.R. Your Individual Guide project stays open behind this view." title="" id="296" name="Picture"/>
+            <a:graphic>
+              <a:graphicData uri="http://schemas.openxmlformats.org/drawingml/2006/picture">
+                <pic:pic>
+                  <pic:nvPicPr>
+                    <pic:cNvPr descr="assets/ui-shiny-app-picker.png" id="297" name="Picture"/>
+                    <pic:cNvPicPr>
+                      <a:picLocks noChangeArrowheads="1" noChangeAspect="1"/>
+                    </pic:cNvPicPr>
+                  </pic:nvPicPr>
+                  <pic:blipFill>
+                    <a:blip r:embed="rId295"/>
+                    <a:stretch>
+                      <a:fillRect/>
+                    </a:stretch>
+                  </pic:blipFill>
+                  <pic:spPr bwMode="auto">
+                    <a:xfrm>
+                      <a:off x="0" y="0"/>
+                      <a:ext cx="5334000" cy="3655116"/>
+                    </a:xfrm>
+                    <a:prstGeom prst="rect">
+                      <a:avLst/>
+                    </a:prstGeom>
+                    <a:noFill/>
+                    <a:ln w="9525">
+                      <a:noFill/>
+                      <a:headEnd/>
+                      <a:tailEnd/>
+                    </a:ln>
+                  </pic:spPr>
+                </pic:pic>
+              </a:graphicData>
+            </a:graphic>
+          </wp:inline>
+        </w:drawing>
+      </w:r>
+    </w:p>
+    <w:p>
+      <w:pPr>
+        <w:pStyle w:val="ImageCaption"/>
+      </w:pPr>
+      <w:r>
+        <w:rPr>
+          <w:lang w:val="en-CA"/>
+        </w:rPr>
+        <w:t xml:space="preserve">Figure 35. Choose a single app.R file or a folder containing both ui.R and server.R. Your Individual Guide project stays open behind this view.</w:t>
+      </w:r>
+    </w:p>
+    <w:bookmarkEnd w:id="298"/>
+    <w:p>
+      <w:pPr>
+        <w:pStyle w:val="Compact"/>
+        <w:numPr>
+          <w:ilvl w:val="0"/>
+          <w:numId w:val="1092"/>
+        </w:numPr>
+      </w:pPr>
+      <w:r>
+        <w:rPr>
+          <w:lang w:val="en-CA"/>
+        </w:rPr>
+        <w:t xml:space="preserve">On the welcome screen, choose</w:t>
+      </w:r>
+      <w:r>
+        <w:rPr>
+          <w:lang w:val="en-CA"/>
+        </w:rPr>
+        <w:t xml:space="preserve"> </w:t>
+      </w:r>
+      <w:r>
+        <w:rPr>
+          <w:b/>
+          <w:bCs/>
+          <w:lang w:val="en-CA"/>
+        </w:rPr>
+        <w:t xml:space="preserve">Open Shiny app</w:t>
+      </w:r>
+      <w:r>
+        <w:rPr>
+          <w:lang w:val="en-CA"/>
+        </w:rPr>
+        <w:t xml:space="preserve">. From your workspace, use the window icon beside the app name. In the desktop menu,</w:t>
+      </w:r>
+      <w:r>
+        <w:rPr>
+          <w:lang w:val="en-CA"/>
+        </w:rPr>
+        <w:t xml:space="preserve"> </w:t>
+      </w:r>
+      <w:r>
+        <w:rPr>
+          <w:b/>
+          <w:bCs/>
+          <w:lang w:val="en-CA"/>
+        </w:rPr>
+        <w:t xml:space="preserve">File &gt; Open Shiny app…</w:t>
+      </w:r>
+      <w:r>
+        <w:rPr>
+          <w:lang w:val="en-CA"/>
+        </w:rPr>
+        <w:t xml:space="preserve"> </w:t>
+      </w:r>
+      <w:r>
+        <w:rPr>
+          <w:lang w:val="en-CA"/>
+        </w:rPr>
+        <w:t xml:space="preserve">opens the same view.</w:t>
+      </w:r>
+    </w:p>
+    <w:p>
+      <w:pPr>
+        <w:pStyle w:val="Compact"/>
+        <w:numPr>
+          <w:ilvl w:val="0"/>
+          <w:numId w:val="1092"/>
+        </w:numPr>
+      </w:pPr>
+      <w:r>
+        <w:rPr>
+          <w:lang w:val="en-CA"/>
+        </w:rPr>
+        <w:t xml:space="preserve">Choose</w:t>
+      </w:r>
+      <w:r>
+        <w:rPr>
+          <w:lang w:val="en-CA"/>
+        </w:rPr>
+        <w:t xml:space="preserve"> </w:t>
+      </w:r>
+      <w:r>
+        <w:rPr>
+          <w:b/>
+          <w:bCs/>
+          <w:lang w:val="en-CA"/>
+        </w:rPr>
+        <w:t xml:space="preserve">Choose app.R…</w:t>
+      </w:r>
+      <w:r>
+        <w:rPr>
+          <w:lang w:val="en-CA"/>
+        </w:rPr>
+        <w:t xml:space="preserve"> </w:t>
+      </w:r>
+      <w:r>
+        <w:rPr>
+          <w:lang w:val="en-CA"/>
+        </w:rPr>
+        <w:t xml:space="preserve">for a single-file app, or</w:t>
+      </w:r>
+      <w:r>
+        <w:rPr>
+          <w:lang w:val="en-CA"/>
+        </w:rPr>
+        <w:t xml:space="preserve"> </w:t>
+      </w:r>
+      <w:r>
+        <w:rPr>
+          <w:b/>
+          <w:bCs/>
+          <w:lang w:val="en-CA"/>
+        </w:rPr>
+        <w:t xml:space="preserve">Choose app folder…</w:t>
+      </w:r>
+      <w:r>
+        <w:rPr>
+          <w:lang w:val="en-CA"/>
+        </w:rPr>
+        <w:t xml:space="preserve"> </w:t>
+      </w:r>
+      <w:r>
+        <w:rPr>
+          <w:lang w:val="en-CA"/>
+        </w:rPr>
+        <w:t xml:space="preserve">for a folder. For the two-file format, choose the folder that contains both files.</w:t>
+      </w:r>
+    </w:p>
+    <w:p>
+      <w:pPr>
+        <w:pStyle w:val="Compact"/>
+        <w:numPr>
+          <w:ilvl w:val="0"/>
+          <w:numId w:val="1092"/>
+        </w:numPr>
+      </w:pPr>
+      <w:r>
+        <w:rPr>
+          <w:lang w:val="en-CA"/>
+        </w:rPr>
+        <w:t xml:space="preserve">Check the selected path. Keep any data, helper scripts, and</w:t>
+      </w:r>
+      <w:r>
+        <w:rPr>
+          <w:lang w:val="en-CA"/>
+        </w:rPr>
+        <w:t xml:space="preserve"> </w:t>
+      </w:r>
+      <w:r>
+        <w:rPr>
+          <w:b/>
+          <w:bCs/>
+          <w:lang w:val="en-CA"/>
+        </w:rPr>
+        <w:t xml:space="preserve">www</w:t>
+      </w:r>
+      <w:r>
+        <w:rPr>
+          <w:lang w:val="en-CA"/>
+        </w:rPr>
+        <w:t xml:space="preserve"> </w:t>
+      </w:r>
+      <w:r>
+        <w:rPr>
+          <w:lang w:val="en-CA"/>
+        </w:rPr>
+        <w:t xml:space="preserve">folder in their original places.</w:t>
+      </w:r>
+    </w:p>
+    <w:p>
+      <w:pPr>
+        <w:pStyle w:val="Compact"/>
+        <w:numPr>
+          <w:ilvl w:val="0"/>
+          <w:numId w:val="1092"/>
+        </w:numPr>
+      </w:pPr>
+      <w:r>
+        <w:rPr>
+          <w:lang w:val="en-CA"/>
+        </w:rPr>
+        <w:t xml:space="preserve">If you trust the source, select</w:t>
+      </w:r>
+      <w:r>
+        <w:rPr>
+          <w:lang w:val="en-CA"/>
+        </w:rPr>
+        <w:t xml:space="preserve"> </w:t>
+      </w:r>
+      <w:r>
+        <w:rPr>
+          <w:b/>
+          <w:bCs/>
+          <w:lang w:val="en-CA"/>
+        </w:rPr>
+        <w:t xml:space="preserve">I trust this app</w:t>
+      </w:r>
+      <w:r>
+        <w:rPr>
+          <w:lang w:val="en-CA"/>
+        </w:rPr>
+        <w:t xml:space="preserve">, then</w:t>
+      </w:r>
+      <w:r>
+        <w:rPr>
+          <w:lang w:val="en-CA"/>
+        </w:rPr>
+        <w:t xml:space="preserve"> </w:t>
+      </w:r>
+      <w:r>
+        <w:rPr>
+          <w:b/>
+          <w:bCs/>
+          <w:lang w:val="en-CA"/>
+        </w:rPr>
+        <w:t xml:space="preserve">Run app</w:t>
+      </w:r>
+      <w:r>
+        <w:rPr>
+          <w:lang w:val="en-CA"/>
+        </w:rPr>
+        <w:t xml:space="preserve">.</w:t>
+      </w:r>
+    </w:p>
+    <w:p>
+      <w:pPr>
+        <w:pStyle w:val="Compact"/>
+        <w:numPr>
+          <w:ilvl w:val="0"/>
+          <w:numId w:val="1092"/>
+        </w:numPr>
+      </w:pPr>
+      <w:r>
+        <w:rPr>
+          <w:lang w:val="en-CA"/>
+        </w:rPr>
+        <w:t xml:space="preserve">Wait for the app to appear. Use its own controls to work with its data. The Individual Guide bar stays above it.</w:t>
+      </w:r>
+    </w:p>
+    <w:p>
+      <w:pPr>
+        <w:pStyle w:val="Heading2"/>
+      </w:pPr>
+      <w:bookmarkStart w:id="299" w:name="_811c5088e32268b256b6f64a481164f452a3aba"/>
+      <w:r>
+        <w:rPr>
+          <w:rStyle w:val="SectionNumber"/>
+          <w:lang w:val="en-CA"/>
+        </w:rPr>
+        <w:t xml:space="preserve">23.4</w:t>
+      </w:r>
+      <w:r>
+        <w:tab/>
+      </w:r>
+      <w:r>
+        <w:rPr>
+          <w:lang w:val="en-CA"/>
+        </w:rPr>
+        <w:t xml:space="preserve">Return to your project</w:t>
+      </w:r>
+      <w:bookmarkEnd w:id="299"/>
+    </w:p>
+    <w:bookmarkStart w:id="303" w:name="_25792172c3d369c12517d351fb2c92381441bb3"/>
+    <w:p>
+      <w:pPr>
+        <w:pStyle w:val="CaptionedFigure"/>
+      </w:pPr>
+      <w:r>
+        <w:drawing>
+          <wp:inline>
+            <wp:extent cx="5334000" cy="3655116"/>
+            <wp:effectExtent b="0" l="0" r="0" t="0"/>
+            <wp:docPr descr="Figure 36. The loaded app fills most of the window. The Individual Guide bar keeps the workspace, app switcher, log and close controls within reach." title="" id="301" name="Picture"/>
+            <a:graphic>
+              <a:graphicData uri="http://schemas.openxmlformats.org/drawingml/2006/picture">
+                <pic:pic>
+                  <pic:nvPicPr>
+                    <pic:cNvPr descr="assets/ui-shiny-app-running.png" id="302" name="Picture"/>
+                    <pic:cNvPicPr>
+                      <a:picLocks noChangeArrowheads="1" noChangeAspect="1"/>
+                    </pic:cNvPicPr>
+                  </pic:nvPicPr>
+                  <pic:blipFill>
+                    <a:blip r:embed="rId300"/>
+                    <a:stretch>
+                      <a:fillRect/>
+                    </a:stretch>
+                  </pic:blipFill>
+                  <pic:spPr bwMode="auto">
+                    <a:xfrm>
+                      <a:off x="0" y="0"/>
+                      <a:ext cx="5334000" cy="3655116"/>
+                    </a:xfrm>
+                    <a:prstGeom prst="rect">
+                      <a:avLst/>
+                    </a:prstGeom>
+                    <a:noFill/>
+                    <a:ln w="9525">
+                      <a:noFill/>
+                      <a:headEnd/>
+                      <a:tailEnd/>
+                    </a:ln>
+                  </pic:spPr>
+                </pic:pic>
+              </a:graphicData>
+            </a:graphic>
+          </wp:inline>
+        </w:drawing>
+      </w:r>
+    </w:p>
+    <w:p>
+      <w:pPr>
+        <w:pStyle w:val="ImageCaption"/>
+      </w:pPr>
+      <w:r>
+        <w:rPr>
+          <w:lang w:val="en-CA"/>
+        </w:rPr>
+        <w:t xml:space="preserve">Figure 36. The loaded app fills most of the window. The Individual Guide bar keeps the workspace, app switcher, log and close controls within reach.</w:t>
+      </w:r>
+    </w:p>
+    <w:bookmarkEnd w:id="303"/>
+    <w:p>
+      <w:pPr>
+        <w:pStyle w:val="FirstParagraph"/>
+      </w:pPr>
+      <w:r>
+        <w:rPr>
+          <w:lang w:val="en-CA"/>
+        </w:rPr>
+        <w:t xml:space="preserve">Choose</w:t>
+      </w:r>
+      <w:r>
+        <w:rPr>
+          <w:lang w:val="en-CA"/>
+        </w:rPr>
+        <w:t xml:space="preserve"> </w:t>
+      </w:r>
+      <w:r>
+        <w:rPr>
+          <w:b/>
+          <w:bCs/>
+          <w:lang w:val="en-CA"/>
+        </w:rPr>
+        <w:t xml:space="preserve">Individual Guide</w:t>
+      </w:r>
+      <w:r>
+        <w:rPr>
+          <w:lang w:val="en-CA"/>
+        </w:rPr>
+        <w:t xml:space="preserve"> </w:t>
+      </w:r>
+      <w:r>
+        <w:rPr>
+          <w:lang w:val="en-CA"/>
+        </w:rPr>
+        <w:t xml:space="preserve">at the left of the top bar. Your project is still there, with its inputs and results. The other app keeps running in the background.</w:t>
+      </w:r>
+    </w:p>
+    <w:p>
+      <w:pPr>
+        <w:pStyle w:val="BodyText"/>
+      </w:pPr>
+      <w:r>
+        <w:rPr>
+          <w:lang w:val="en-CA"/>
+        </w:rPr>
+        <w:t xml:space="preserve">Use the window icon again to return to the other app. Its inputs stay as you left them. In the desktop app,</w:t>
+      </w:r>
+      <w:r>
+        <w:rPr>
+          <w:lang w:val="en-CA"/>
+        </w:rPr>
+        <w:t xml:space="preserve"> </w:t>
+      </w:r>
+      <w:r>
+        <w:rPr>
+          <w:b/>
+          <w:bCs/>
+          <w:lang w:val="en-CA"/>
+        </w:rPr>
+        <w:t xml:space="preserve">View &gt; Individual Guide workspace</w:t>
+      </w:r>
+      <w:r>
+        <w:rPr>
+          <w:lang w:val="en-CA"/>
+        </w:rPr>
+        <w:t xml:space="preserve"> </w:t>
+      </w:r>
+      <w:r>
+        <w:rPr>
+          <w:lang w:val="en-CA"/>
+        </w:rPr>
+        <w:t xml:space="preserve">also brings you back to your project.</w:t>
+      </w:r>
+    </w:p>
+    <w:p>
+      <w:pPr>
+        <w:pStyle w:val="BodyText"/>
+      </w:pPr>
+      <w:r>
+        <w:rPr>
+          <w:lang w:val="en-CA"/>
+        </w:rPr>
+        <w:t xml:space="preserve">Switching views does not restart either R process. If you are finished with the other app, close it to free its resources.</w:t>
+      </w:r>
+    </w:p>
+    <w:p>
+      <w:pPr>
+        <w:pStyle w:val="Heading2"/>
+      </w:pPr>
+      <w:bookmarkStart w:id="304" w:name="_c67d8c1b968ba0ef4a3b3a5f60c9916269960b2"/>
+      <w:r>
+        <w:rPr>
+          <w:rStyle w:val="SectionNumber"/>
+          <w:lang w:val="en-CA"/>
+        </w:rPr>
+        <w:t xml:space="preserve">23.5</w:t>
+      </w:r>
+      <w:r>
+        <w:tab/>
+      </w:r>
+      <w:r>
+        <w:rPr>
+          <w:lang w:val="en-CA"/>
+        </w:rPr>
+        <w:t xml:space="preserve">Close an app or open another</w:t>
+      </w:r>
+      <w:bookmarkEnd w:id="304"/>
+    </w:p>
+    <w:p>
+      <w:pPr>
+        <w:pStyle w:val="FirstParagraph"/>
+      </w:pPr>
+      <w:r>
+        <w:rPr>
+          <w:lang w:val="en-CA"/>
+        </w:rPr>
+        <w:t xml:space="preserve">To stop an app, choose</w:t>
+      </w:r>
+      <w:r>
+        <w:rPr>
+          <w:lang w:val="en-CA"/>
+        </w:rPr>
+        <w:t xml:space="preserve"> </w:t>
+      </w:r>
+      <w:r>
+        <w:rPr>
+          <w:b/>
+          <w:bCs/>
+          <w:lang w:val="en-CA"/>
+        </w:rPr>
+        <w:t xml:space="preserve">Close app</w:t>
+      </w:r>
+      <w:r>
+        <w:rPr>
+          <w:lang w:val="en-CA"/>
+        </w:rPr>
+        <w:t xml:space="preserve"> </w:t>
+      </w:r>
+      <w:r>
+        <w:rPr>
+          <w:lang w:val="en-CA"/>
+        </w:rPr>
+        <w:t xml:space="preserve">in its top bar. Save any work using that app’s own controls first. Read the confirmation, then choose</w:t>
+      </w:r>
+      <w:r>
+        <w:rPr>
+          <w:lang w:val="en-CA"/>
+        </w:rPr>
+        <w:t xml:space="preserve"> </w:t>
+      </w:r>
+      <w:r>
+        <w:rPr>
+          <w:b/>
+          <w:bCs/>
+          <w:lang w:val="en-CA"/>
+        </w:rPr>
+        <w:t xml:space="preserve">Close app</w:t>
+      </w:r>
+      <w:r>
+        <w:rPr>
+          <w:lang w:val="en-CA"/>
+        </w:rPr>
+        <w:t xml:space="preserve"> </w:t>
+      </w:r>
+      <w:r>
+        <w:rPr>
+          <w:lang w:val="en-CA"/>
+        </w:rPr>
+        <w:t xml:space="preserve">again.</w:t>
+      </w:r>
+      <w:r>
+        <w:rPr>
+          <w:lang w:val="en-CA"/>
+        </w:rPr>
+        <w:t xml:space="preserve"> </w:t>
+      </w:r>
+      <w:r>
+        <w:rPr>
+          <w:b/>
+          <w:bCs/>
+          <w:lang w:val="en-CA"/>
+        </w:rPr>
+        <w:t xml:space="preserve">Cancel</w:t>
+      </w:r>
+      <w:r>
+        <w:rPr>
+          <w:lang w:val="en-CA"/>
+        </w:rPr>
+        <w:t xml:space="preserve"> </w:t>
+      </w:r>
+      <w:r>
+        <w:rPr>
+          <w:lang w:val="en-CA"/>
+        </w:rPr>
+        <w:t xml:space="preserve">keeps it running. Closing it leaves Individual Guide and your project open.</w:t>
+      </w:r>
+    </w:p>
+    <w:p>
+      <w:pPr>
+        <w:pStyle w:val="BodyText"/>
+      </w:pPr>
+      <w:r>
+        <w:rPr>
+          <w:lang w:val="en-CA"/>
+        </w:rPr>
+        <w:t xml:space="preserve">To switch apps, choose</w:t>
+      </w:r>
+      <w:r>
+        <w:rPr>
+          <w:lang w:val="en-CA"/>
+        </w:rPr>
+        <w:t xml:space="preserve"> </w:t>
+      </w:r>
+      <w:r>
+        <w:rPr>
+          <w:b/>
+          <w:bCs/>
+          <w:lang w:val="en-CA"/>
+        </w:rPr>
+        <w:t xml:space="preserve">Open app…</w:t>
+      </w:r>
+      <w:r>
+        <w:rPr>
+          <w:lang w:val="en-CA"/>
+        </w:rPr>
+        <w:t xml:space="preserve">, then select another file or folder. Picking a file alone does not close the running app. You can choose</w:t>
+      </w:r>
+      <w:r>
+        <w:rPr>
+          <w:lang w:val="en-CA"/>
+        </w:rPr>
+        <w:t xml:space="preserve"> </w:t>
+      </w:r>
+      <w:r>
+        <w:rPr>
+          <w:b/>
+          <w:bCs/>
+          <w:lang w:val="en-CA"/>
+        </w:rPr>
+        <w:t xml:space="preserve">Back to running app</w:t>
+      </w:r>
+      <w:r>
+        <w:rPr>
+          <w:lang w:val="en-CA"/>
+        </w:rPr>
+        <w:t xml:space="preserve"> </w:t>
+      </w:r>
+      <w:r>
+        <w:rPr>
+          <w:lang w:val="en-CA"/>
+        </w:rPr>
+        <w:t xml:space="preserve">if you change your mind. When you select</w:t>
+      </w:r>
+      <w:r>
+        <w:rPr>
+          <w:lang w:val="en-CA"/>
+        </w:rPr>
+        <w:t xml:space="preserve"> </w:t>
+      </w:r>
+      <w:r>
+        <w:rPr>
+          <w:b/>
+          <w:bCs/>
+          <w:lang w:val="en-CA"/>
+        </w:rPr>
+        <w:t xml:space="preserve">Run app</w:t>
+      </w:r>
+      <w:r>
+        <w:rPr>
+          <w:lang w:val="en-CA"/>
+        </w:rPr>
+        <w:t xml:space="preserve">, the previous app closes and the new one starts. Save work in the previous app before that step.</w:t>
+      </w:r>
+    </w:p>
+    <w:p>
+      <w:pPr>
+        <w:pStyle w:val="BodyText"/>
+      </w:pPr>
+      <w:r>
+        <w:rPr>
+          <w:lang w:val="en-CA"/>
+        </w:rPr>
+        <w:t xml:space="preserve">Closing Individual Guide stops the loaded app too. Its temporary session is not saved inside your</w:t>
+      </w:r>
+      <w:r>
+        <w:rPr>
+          <w:lang w:val="en-CA"/>
+        </w:rPr>
+        <w:t xml:space="preserve"> </w:t>
+      </w:r>
+      <w:r>
+        <w:rPr>
+          <w:b/>
+          <w:bCs/>
+          <w:lang w:val="en-CA"/>
+        </w:rPr>
+        <w:t xml:space="preserve">.igpx</w:t>
+      </w:r>
+      <w:r>
+        <w:rPr>
+          <w:lang w:val="en-CA"/>
+        </w:rPr>
+        <w:t xml:space="preserve"> </w:t>
+      </w:r>
+      <w:r>
+        <w:rPr>
+          <w:lang w:val="en-CA"/>
+        </w:rPr>
+        <w:t xml:space="preserve">project. Each app decides how to save its own data and settings.</w:t>
+      </w:r>
+    </w:p>
+    <w:p>
+      <w:pPr>
+        <w:pStyle w:val="BodyText"/>
+      </w:pPr>
+      <w:r>
+        <w:rPr>
+          <w:lang w:val="en-CA"/>
+        </w:rPr>
+        <w:t xml:space="preserve">Restarting the main R server also closes the loaded app. Save work in both apps before restarting.</w:t>
+      </w:r>
+    </w:p>
+    <w:p>
+      <w:pPr>
+        <w:pStyle w:val="Heading2"/>
+      </w:pPr>
+      <w:bookmarkStart w:id="305" w:name="_d14e65a8989d00b1265618fc2206b32825c5120"/>
+      <w:r>
+        <w:rPr>
+          <w:rStyle w:val="SectionNumber"/>
+          <w:lang w:val="en-CA"/>
+        </w:rPr>
+        <w:t xml:space="preserve">23.6</w:t>
+      </w:r>
+      <w:r>
+        <w:tab/>
+      </w:r>
+      <w:r>
+        <w:rPr>
+          <w:lang w:val="en-CA"/>
+        </w:rPr>
+        <w:t xml:space="preserve">If an app will not start</w:t>
+      </w:r>
+      <w:bookmarkEnd w:id="305"/>
+    </w:p>
+    <w:p>
+      <w:pPr>
+        <w:pStyle w:val="FirstParagraph"/>
+      </w:pPr>
+      <w:r>
+        <w:rPr>
+          <w:lang w:val="en-CA"/>
+        </w:rPr>
+        <w:t xml:space="preserve">Choose</w:t>
+      </w:r>
+      <w:r>
+        <w:rPr>
+          <w:lang w:val="en-CA"/>
+        </w:rPr>
+        <w:t xml:space="preserve"> </w:t>
+      </w:r>
+      <w:r>
+        <w:rPr>
+          <w:b/>
+          <w:bCs/>
+          <w:lang w:val="en-CA"/>
+        </w:rPr>
+        <w:t xml:space="preserve">App log</w:t>
+      </w:r>
+      <w:r>
+        <w:rPr>
+          <w:lang w:val="en-CA"/>
+        </w:rPr>
+        <w:t xml:space="preserve"> </w:t>
+      </w:r>
+      <w:r>
+        <w:rPr>
+          <w:lang w:val="en-CA"/>
+        </w:rPr>
+        <w:t xml:space="preserve">to read its messages. The same control works while an app is running. Logs keep the app’s original language. Copy the exact error when asking its author for help.</w:t>
+      </w:r>
+    </w:p>
+    <w:p>
+      <w:pPr>
+        <w:pStyle w:val="Compact"/>
+        <w:numPr>
+          <w:ilvl w:val="0"/>
+          <w:numId w:val="1093"/>
+        </w:numPr>
+      </w:pPr>
+      <w:r>
+        <w:rPr>
+          <w:lang w:val="en-CA"/>
+        </w:rPr>
+        <w:t xml:space="preserve">If a file is missing, check that you extracted and kept the complete folder.</w:t>
+      </w:r>
+    </w:p>
+    <w:p>
+      <w:pPr>
+        <w:pStyle w:val="Compact"/>
+        <w:numPr>
+          <w:ilvl w:val="0"/>
+          <w:numId w:val="1093"/>
+        </w:numPr>
+      </w:pPr>
+      <w:r>
+        <w:rPr>
+          <w:lang w:val="en-CA"/>
+        </w:rPr>
+        <w:t xml:space="preserve">If a package is missing, follow the author’s public package instructions. Individual Guide includes its own packages, but it cannot include every package another app might need. Individual Guide does not install extra packages for that app.</w:t>
+      </w:r>
+    </w:p>
+    <w:p>
+      <w:pPr>
+        <w:pStyle w:val="Compact"/>
+        <w:numPr>
+          <w:ilvl w:val="0"/>
+          <w:numId w:val="1093"/>
+        </w:numPr>
+      </w:pPr>
+      <w:r>
+        <w:rPr>
+          <w:lang w:val="en-CA"/>
+        </w:rPr>
+        <w:t xml:space="preserve">If the app stops or takes too long to start, the top bar stays available. You can run it again, choose another app, or return to your project.</w:t>
+      </w:r>
+    </w:p>
+    <w:p>
+      <w:pPr>
+        <w:pStyle w:val="FirstParagraph"/>
+      </w:pPr>
+      <w:r>
+        <w:rPr>
+          <w:lang w:val="en-CA"/>
+        </w:rPr>
+        <w:t xml:space="preserve">The language choice in Individual Guide changes its own top bar and controls. The loaded app keeps the language and appearance supplied by its author. Its R code runs separately, with the package libraries available to Individual Guide. Apps that need another R version, external software, or a database still need their own setup.</w:t>
+      </w:r>
+    </w:p>
+    <w:p>
+      <w:pPr>
+        <w:pStyle w:val="BodyText"/>
+      </w:pPr>
+      <w:r>
+        <w:rPr>
+          <w:lang w:val="en-CA"/>
+        </w:rPr>
+        <w:t xml:space="preserve">This feature opens local apps. In the ordinary browser version, use a browser on the same computer that runs Individual Guide.</w:t>
+      </w:r>
+    </w:p>
+    <w:p>
+      <w:pPr>
+        <w:pStyle w:val="Heading1"/>
+      </w:pPr>
+      <w:bookmarkStart w:id="306" w:name="_performance"/>
+      <w:r>
+        <w:rPr>
+          <w:rStyle w:val="SectionNumber"/>
+          <w:lang w:val="en-CA"/>
+        </w:rPr>
+        <w:t xml:space="preserve">24</w:t>
+      </w:r>
+      <w:r>
+        <w:tab/>
+      </w:r>
+      <w:r>
+        <w:rPr>
+          <w:lang w:val="en-CA"/>
+        </w:rPr>
         <w:t xml:space="preserve">Keep work running smoothly</w:t>
       </w:r>
-      <w:bookmarkEnd w:id="290"/>
+      <w:bookmarkEnd w:id="306"/>
     </w:p>
     <w:p>
       <w:pPr>
@@ -37820,13 +39090,13 @@
       <w:pPr>
         <w:pStyle w:val="Heading2"/>
       </w:pPr>
-      <w:bookmarkStart w:id="291" w:name="_db1f62276df68210f4c9963a369001fc6459fd1"/>
+      <w:bookmarkStart w:id="307" w:name="_db1f62276df68210f4c9963a369001fc6459fd1"/>
       <w:r>
         <w:rPr>
           <w:rStyle w:val="SectionNumber"/>
           <w:lang w:val="en-CA"/>
         </w:rPr>
-        <w:t xml:space="preserve">23.1</w:t>
+        <w:t xml:space="preserve">24.1</w:t>
       </w:r>
       <w:r>
         <w:tab/>
@@ -37837,7 +39107,7 @@
         </w:rPr>
         <w:t xml:space="preserve">When editing feels slow</w:t>
       </w:r>
-      <w:bookmarkEnd w:id="291"/>
+      <w:bookmarkEnd w:id="307"/>
     </w:p>
     <w:p>
       <w:pPr>
@@ -37911,13 +39181,13 @@
       <w:pPr>
         <w:pStyle w:val="Heading1"/>
       </w:pPr>
-      <w:bookmarkStart w:id="292" w:name="_troubleshooting"/>
+      <w:bookmarkStart w:id="308" w:name="_troubleshooting"/>
       <w:r>
         <w:rPr>
           <w:rStyle w:val="SectionNumber"/>
           <w:lang w:val="en-CA"/>
         </w:rPr>
-        <w:t xml:space="preserve">24</w:t>
+        <w:t xml:space="preserve">25</w:t>
       </w:r>
       <w:r>
         <w:tab/>
@@ -37928,7 +39198,7 @@
         </w:rPr>
         <w:t xml:space="preserve">Troubleshooting</w:t>
       </w:r>
-      <w:bookmarkEnd w:id="292"/>
+      <w:bookmarkEnd w:id="308"/>
     </w:p>
     <w:p>
       <w:pPr>
@@ -37945,13 +39215,13 @@
       <w:pPr>
         <w:pStyle w:val="Heading2"/>
       </w:pPr>
-      <w:bookmarkStart w:id="293" w:name="_e5495e6e6ea6ce07271bfcc11c785fafe89b5c0"/>
+      <w:bookmarkStart w:id="309" w:name="_e5495e6e6ea6ce07271bfcc11c785fafe89b5c0"/>
       <w:r>
         <w:rPr>
           <w:rStyle w:val="SectionNumber"/>
           <w:lang w:val="en-CA"/>
         </w:rPr>
-        <w:t xml:space="preserve">24.1</w:t>
+        <w:t xml:space="preserve">25.1</w:t>
       </w:r>
       <w:r>
         <w:tab/>
@@ -37962,7 +39232,7 @@
         </w:rPr>
         <w:t xml:space="preserve">The app seems not to open</w:t>
       </w:r>
-      <w:bookmarkEnd w:id="293"/>
+      <w:bookmarkEnd w:id="309"/>
     </w:p>
     <w:p>
       <w:pPr>
@@ -38017,13 +39287,13 @@
       <w:pPr>
         <w:pStyle w:val="Heading2"/>
       </w:pPr>
-      <w:bookmarkStart w:id="294" w:name="_96baa00e4d923e5583237b886548965da170e61"/>
+      <w:bookmarkStart w:id="310" w:name="_96baa00e4d923e5583237b886548965da170e61"/>
       <w:r>
         <w:rPr>
           <w:rStyle w:val="SectionNumber"/>
           <w:lang w:val="en-CA"/>
         </w:rPr>
-        <w:t xml:space="preserve">24.2</w:t>
+        <w:t xml:space="preserve">25.2</w:t>
       </w:r>
       <w:r>
         <w:tab/>
@@ -38034,14 +39304,14 @@
         </w:rPr>
         <w:t xml:space="preserve">The app disconnects or the R server stops</w:t>
       </w:r>
-      <w:bookmarkEnd w:id="294"/>
+      <w:bookmarkEnd w:id="310"/>
     </w:p>
     <w:p>
       <w:pPr>
         <w:pStyle w:val="Compact"/>
         <w:numPr>
           <w:ilvl w:val="0"/>
-          <w:numId w:val="1090"/>
+          <w:numId w:val="1094"/>
         </w:numPr>
       </w:pPr>
       <w:r>
@@ -38056,7 +39326,7 @@
         <w:pStyle w:val="Compact"/>
         <w:numPr>
           <w:ilvl w:val="0"/>
-          <w:numId w:val="1090"/>
+          <w:numId w:val="1094"/>
         </w:numPr>
       </w:pPr>
       <w:r>
@@ -38117,7 +39387,7 @@
         <w:pStyle w:val="Compact"/>
         <w:numPr>
           <w:ilvl w:val="0"/>
-          <w:numId w:val="1090"/>
+          <w:numId w:val="1094"/>
         </w:numPr>
       </w:pPr>
       <w:r>
@@ -38132,7 +39402,7 @@
         <w:pStyle w:val="Compact"/>
         <w:numPr>
           <w:ilvl w:val="0"/>
-          <w:numId w:val="1090"/>
+          <w:numId w:val="1094"/>
         </w:numPr>
       </w:pPr>
       <w:r>
@@ -38199,7 +39469,7 @@
         <w:pStyle w:val="Compact"/>
         <w:numPr>
           <w:ilvl w:val="0"/>
-          <w:numId w:val="1090"/>
+          <w:numId w:val="1094"/>
         </w:numPr>
       </w:pPr>
       <w:r>
@@ -38209,7 +39479,7 @@
         <w:t xml:space="preserve">Check the input paths and results before running the flow again.</w:t>
       </w:r>
     </w:p>
-    <w:bookmarkStart w:id="298" w:name="_bbb89eaaa9ba192022a0b81f45da67fcfc3764a"/>
+    <w:bookmarkStart w:id="314" w:name="_bbb89eaaa9ba192022a0b81f45da67fcfc3764a"/>
     <w:p>
       <w:pPr>
         <w:pStyle w:val="CaptionedFigure"/>
@@ -38219,18 +39489,18 @@
           <wp:inline>
             <wp:extent cx="3959999" cy="2810322"/>
             <wp:effectExtent b="0" l="0" r="0" t="0"/>
-            <wp:docPr descr="Figure 35. The desktop Session menu provides server restart and startup diagnostics. Use task logs instead when investigating an analysis result." title="" id="296" name="Picture"/>
+            <wp:docPr descr="Figure 37. The desktop Session menu provides server restart and startup diagnostics. Use task logs instead when investigating an analysis result." title="" id="312" name="Picture"/>
             <a:graphic>
               <a:graphicData uri="http://schemas.openxmlformats.org/drawingml/2006/picture">
                 <pic:pic>
                   <pic:nvPicPr>
-                    <pic:cNvPr descr="assets/ui-session-menu.png" id="297" name="Picture"/>
+                    <pic:cNvPr descr="assets/ui-session-menu.png" id="313" name="Picture"/>
                     <pic:cNvPicPr>
                       <a:picLocks noChangeArrowheads="1" noChangeAspect="1"/>
                     </pic:cNvPicPr>
                   </pic:nvPicPr>
                   <pic:blipFill>
-                    <a:blip r:embed="rId295"/>
+                    <a:blip r:embed="rId311"/>
                     <a:stretch>
                       <a:fillRect/>
                     </a:stretch>
@@ -38265,10 +39535,10 @@
         <w:rPr>
           <w:lang w:val="en-CA"/>
         </w:rPr>
-        <w:t xml:space="preserve">Figure 35. The desktop Session menu provides server restart and startup diagnostics. Use task logs instead when investigating an analysis result.</w:t>
-      </w:r>
-    </w:p>
-    <w:bookmarkEnd w:id="298"/>
+        <w:t xml:space="preserve">Figure 37. The desktop Session menu provides server restart and startup diagnostics. Use task logs instead when investigating an analysis result.</w:t>
+      </w:r>
+    </w:p>
+    <w:bookmarkEnd w:id="314"/>
     <w:p>
       <w:pPr>
         <w:pStyle w:val="FirstParagraph"/>
@@ -38305,13 +39575,13 @@
       <w:pPr>
         <w:pStyle w:val="Heading2"/>
       </w:pPr>
-      <w:bookmarkStart w:id="299" w:name="_82e06af1aff5a5e21deb90712fc0f610b42cc44"/>
+      <w:bookmarkStart w:id="315" w:name="_82e06af1aff5a5e21deb90712fc0f610b42cc44"/>
       <w:r>
         <w:rPr>
           <w:rStyle w:val="SectionNumber"/>
           <w:lang w:val="en-CA"/>
         </w:rPr>
-        <w:t xml:space="preserve">24.3</w:t>
+        <w:t xml:space="preserve">25.3</w:t>
       </w:r>
       <w:r>
         <w:tab/>
@@ -38322,7 +39592,7 @@
         </w:rPr>
         <w:t xml:space="preserve">A button or menu item is disabled</w:t>
       </w:r>
-      <w:bookmarkEnd w:id="299"/>
+      <w:bookmarkEnd w:id="315"/>
     </w:p>
     <w:p>
       <w:pPr>
@@ -38339,13 +39609,13 @@
       <w:pPr>
         <w:pStyle w:val="Heading2"/>
       </w:pPr>
-      <w:bookmarkStart w:id="300" w:name="_a00129cde15cb7d7a4c13b6883deac076cb12b3"/>
+      <w:bookmarkStart w:id="316" w:name="_a00129cde15cb7d7a4c13b6883deac076cb12b3"/>
       <w:r>
         <w:rPr>
           <w:rStyle w:val="SectionNumber"/>
           <w:lang w:val="en-CA"/>
         </w:rPr>
-        <w:t xml:space="preserve">24.4</w:t>
+        <w:t xml:space="preserve">25.4</w:t>
       </w:r>
       <w:r>
         <w:tab/>
@@ -38356,7 +39626,7 @@
         </w:rPr>
         <w:t xml:space="preserve">A file will not import</w:t>
       </w:r>
-      <w:bookmarkEnd w:id="300"/>
+      <w:bookmarkEnd w:id="316"/>
     </w:p>
     <w:p>
       <w:pPr>
@@ -38405,13 +39675,13 @@
       <w:pPr>
         <w:pStyle w:val="Heading2"/>
       </w:pPr>
-      <w:bookmarkStart w:id="301" w:name="_02eec9c2fdfb94311e9bebb72282f2ee8d79354"/>
+      <w:bookmarkStart w:id="317" w:name="_02eec9c2fdfb94311e9bebb72282f2ee8d79354"/>
       <w:r>
         <w:rPr>
           <w:rStyle w:val="SectionNumber"/>
           <w:lang w:val="en-CA"/>
         </w:rPr>
-        <w:t xml:space="preserve">24.5</w:t>
+        <w:t xml:space="preserve">25.5</w:t>
       </w:r>
       <w:r>
         <w:tab/>
@@ -38422,7 +39692,7 @@
         </w:rPr>
         <w:t xml:space="preserve">A table or column is missing from a choice list</w:t>
       </w:r>
-      <w:bookmarkEnd w:id="301"/>
+      <w:bookmarkEnd w:id="317"/>
     </w:p>
     <w:p>
       <w:pPr>
@@ -38439,13 +39709,13 @@
       <w:pPr>
         <w:pStyle w:val="Heading2"/>
       </w:pPr>
-      <w:bookmarkStart w:id="302" w:name="_c021d42d6a470de52446e7e69c678153025beb8"/>
+      <w:bookmarkStart w:id="318" w:name="_c021d42d6a470de52446e7e69c678153025beb8"/>
       <w:r>
         <w:rPr>
           <w:rStyle w:val="SectionNumber"/>
           <w:lang w:val="en-CA"/>
         </w:rPr>
-        <w:t xml:space="preserve">24.6</w:t>
+        <w:t xml:space="preserve">25.6</w:t>
       </w:r>
       <w:r>
         <w:tab/>
@@ -38456,7 +39726,7 @@
         </w:rPr>
         <w:t xml:space="preserve">A result is old, empty, or different from the preview</w:t>
       </w:r>
-      <w:bookmarkEnd w:id="302"/>
+      <w:bookmarkEnd w:id="318"/>
     </w:p>
     <w:p>
       <w:pPr>
@@ -38484,13 +39754,13 @@
       <w:pPr>
         <w:pStyle w:val="Heading2"/>
       </w:pPr>
-      <w:bookmarkStart w:id="303" w:name="_a7936bae1d0dae09fa18baebd700d25fc09e1f5"/>
+      <w:bookmarkStart w:id="319" w:name="_a7936bae1d0dae09fa18baebd700d25fc09e1f5"/>
       <w:r>
         <w:rPr>
           <w:rStyle w:val="SectionNumber"/>
           <w:lang w:val="en-CA"/>
         </w:rPr>
-        <w:t xml:space="preserve">24.7</w:t>
+        <w:t xml:space="preserve">25.7</w:t>
       </w:r>
       <w:r>
         <w:tab/>
@@ -38501,7 +39771,7 @@
         </w:rPr>
         <w:t xml:space="preserve">A model fails or looks strange</w:t>
       </w:r>
-      <w:bookmarkEnd w:id="303"/>
+      <w:bookmarkEnd w:id="319"/>
     </w:p>
     <w:p>
       <w:pPr>
@@ -38518,13 +39788,13 @@
       <w:pPr>
         <w:pStyle w:val="Heading2"/>
       </w:pPr>
-      <w:bookmarkStart w:id="304" w:name="_e5b9409a1fe8fe07056593210d6f8947414da6c"/>
+      <w:bookmarkStart w:id="320" w:name="_e5b9409a1fe8fe07056593210d6f8947414da6c"/>
       <w:r>
         <w:rPr>
           <w:rStyle w:val="SectionNumber"/>
           <w:lang w:val="en-CA"/>
         </w:rPr>
-        <w:t xml:space="preserve">24.8</w:t>
+        <w:t xml:space="preserve">25.8</w:t>
       </w:r>
       <w:r>
         <w:tab/>
@@ -38535,7 +39805,7 @@
         </w:rPr>
         <w:t xml:space="preserve">A report is missing a chart</w:t>
       </w:r>
-      <w:bookmarkEnd w:id="304"/>
+      <w:bookmarkEnd w:id="320"/>
     </w:p>
     <w:p>
       <w:pPr>
@@ -38563,13 +39833,13 @@
       <w:pPr>
         <w:pStyle w:val="Heading2"/>
       </w:pPr>
-      <w:bookmarkStart w:id="305" w:name="_43337f50d002d35b7bc91a45b94b7f07b333566"/>
+      <w:bookmarkStart w:id="321" w:name="_43337f50d002d35b7bc91a45b94b7f07b333566"/>
       <w:r>
         <w:rPr>
           <w:rStyle w:val="SectionNumber"/>
           <w:lang w:val="en-CA"/>
         </w:rPr>
-        <w:t xml:space="preserve">24.9</w:t>
+        <w:t xml:space="preserve">25.9</w:t>
       </w:r>
       <w:r>
         <w:tab/>
@@ -38580,7 +39850,7 @@
         </w:rPr>
         <w:t xml:space="preserve">An exported file is missing or will not update</w:t>
       </w:r>
-      <w:bookmarkEnd w:id="305"/>
+      <w:bookmarkEnd w:id="321"/>
     </w:p>
     <w:p>
       <w:pPr>
@@ -38597,13 +39867,13 @@
       <w:pPr>
         <w:pStyle w:val="Heading2"/>
       </w:pPr>
-      <w:bookmarkStart w:id="306" w:name="_d4733c4e5425e712869378169aab27100a2fa17"/>
+      <w:bookmarkStart w:id="322" w:name="_d4733c4e5425e712869378169aab27100a2fa17"/>
       <w:r>
         <w:rPr>
           <w:rStyle w:val="SectionNumber"/>
           <w:lang w:val="en-CA"/>
         </w:rPr>
-        <w:t xml:space="preserve">24.10</w:t>
+        <w:t xml:space="preserve">25.10</w:t>
       </w:r>
       <w:r>
         <w:tab/>
@@ -38614,7 +39884,7 @@
         </w:rPr>
         <w:t xml:space="preserve">A log seems empty</w:t>
       </w:r>
-      <w:bookmarkEnd w:id="306"/>
+      <w:bookmarkEnd w:id="322"/>
     </w:p>
     <w:p>
       <w:pPr>
@@ -38642,13 +39912,13 @@
       <w:pPr>
         <w:pStyle w:val="Heading2"/>
       </w:pPr>
-      <w:bookmarkStart w:id="307" w:name="_6a893ea35fd65a58eb741093f9b37da95db71d9"/>
+      <w:bookmarkStart w:id="323" w:name="_6a893ea35fd65a58eb741093f9b37da95db71d9"/>
       <w:r>
         <w:rPr>
           <w:rStyle w:val="SectionNumber"/>
           <w:lang w:val="en-CA"/>
         </w:rPr>
-        <w:t xml:space="preserve">24.11</w:t>
+        <w:t xml:space="preserve">25.11</w:t>
       </w:r>
       <w:r>
         <w:tab/>
@@ -38659,7 +39929,7 @@
         </w:rPr>
         <w:t xml:space="preserve">Ask for help</w:t>
       </w:r>
-      <w:bookmarkEnd w:id="307"/>
+      <w:bookmarkEnd w:id="323"/>
     </w:p>
     <w:p>
       <w:pPr>
@@ -38677,7 +39947,7 @@
         </w:rPr>
         <w:t xml:space="preserve"> </w:t>
       </w:r>
-      <w:hyperlink r:id="rId308">
+      <w:hyperlink r:id="rId324">
         <w:r>
           <w:rPr>
             <w:rStyle w:val="Hyperlink"/>
@@ -38740,13 +40010,13 @@
       <w:pPr>
         <w:pStyle w:val="Heading1"/>
       </w:pPr>
-      <w:bookmarkStart w:id="309" w:name="_a1499d0f1071ab6f4bd103a6d3c009c0626ab5b"/>
+      <w:bookmarkStart w:id="325" w:name="_a1499d0f1071ab6f4bd103a6d3c009c0626ab5b"/>
       <w:r>
         <w:rPr>
           <w:rStyle w:val="SectionNumber"/>
           <w:lang w:val="en-CA"/>
         </w:rPr>
-        <w:t xml:space="preserve">25</w:t>
+        <w:t xml:space="preserve">26</w:t>
       </w:r>
       <w:r>
         <w:tab/>
@@ -38757,7 +40027,7 @@
         </w:rPr>
         <w:t xml:space="preserve">Optional: install with R</w:t>
       </w:r>
-      <w:bookmarkEnd w:id="309"/>
+      <w:bookmarkEnd w:id="325"/>
     </w:p>
     <w:p>
       <w:pPr>
@@ -38825,13 +40095,13 @@
       <w:pPr>
         <w:pStyle w:val="Heading2"/>
       </w:pPr>
-      <w:bookmarkStart w:id="310" w:name="_e84a9b7d06d0136aff5c644ad21d0cd170e9840"/>
+      <w:bookmarkStart w:id="326" w:name="_e84a9b7d06d0136aff5c644ad21d0cd170e9840"/>
       <w:r>
         <w:rPr>
           <w:rStyle w:val="SectionNumber"/>
           <w:lang w:val="en-CA"/>
         </w:rPr>
-        <w:t xml:space="preserve">25.1</w:t>
+        <w:t xml:space="preserve">26.1</w:t>
       </w:r>
       <w:r>
         <w:tab/>
@@ -38842,14 +40112,14 @@
         </w:rPr>
         <w:t xml:space="preserve">Step 1: install R from its public website</w:t>
       </w:r>
-      <w:bookmarkEnd w:id="310"/>
+      <w:bookmarkEnd w:id="326"/>
     </w:p>
     <w:p>
       <w:pPr>
         <w:pStyle w:val="Compact"/>
         <w:numPr>
           <w:ilvl w:val="0"/>
-          <w:numId w:val="1091"/>
+          <w:numId w:val="1095"/>
         </w:numPr>
       </w:pPr>
       <w:r>
@@ -38864,7 +40134,7 @@
         </w:rPr>
         <w:t xml:space="preserve"> </w:t>
       </w:r>
-      <w:hyperlink r:id="rId311">
+      <w:hyperlink r:id="rId327">
         <w:r>
           <w:rPr>
             <w:rStyle w:val="Hyperlink"/>
@@ -38885,7 +40155,7 @@
         <w:pStyle w:val="Compact"/>
         <w:numPr>
           <w:ilvl w:val="0"/>
-          <w:numId w:val="1091"/>
+          <w:numId w:val="1095"/>
         </w:numPr>
       </w:pPr>
       <w:r>
@@ -38940,7 +40210,7 @@
         <w:pStyle w:val="Compact"/>
         <w:numPr>
           <w:ilvl w:val="0"/>
-          <w:numId w:val="1091"/>
+          <w:numId w:val="1095"/>
         </w:numPr>
       </w:pPr>
       <w:r>
@@ -39052,13 +40322,13 @@
       <w:pPr>
         <w:pStyle w:val="Heading2"/>
       </w:pPr>
-      <w:bookmarkStart w:id="312" w:name="_57da420e24f6bb4133bb0c38b569af410aa3bbd"/>
+      <w:bookmarkStart w:id="328" w:name="_57da420e24f6bb4133bb0c38b569af410aa3bbd"/>
       <w:r>
         <w:rPr>
           <w:rStyle w:val="SectionNumber"/>
           <w:lang w:val="en-CA"/>
         </w:rPr>
-        <w:t xml:space="preserve">25.2</w:t>
+        <w:t xml:space="preserve">26.2</w:t>
       </w:r>
       <w:r>
         <w:tab/>
@@ -39069,7 +40339,7 @@
         </w:rPr>
         <w:t xml:space="preserve">Step 2: install the app from GitHub</w:t>
       </w:r>
-      <w:bookmarkEnd w:id="312"/>
+      <w:bookmarkEnd w:id="328"/>
     </w:p>
     <w:p>
       <w:pPr>
@@ -39271,7 +40541,7 @@
         <w:rPr>
           <w:rStyle w:val="StringTok"/>
         </w:rPr>
-        <w:t xml:space="preserve">"v0.5.0"</w:t>
+        <w:t xml:space="preserve">"v0.6.0"</w:t>
       </w:r>
       <w:r>
         <w:rPr>
@@ -39375,13 +40645,13 @@
       <w:pPr>
         <w:pStyle w:val="Heading2"/>
       </w:pPr>
-      <w:bookmarkStart w:id="313" w:name="_039ecb01ea617f0d4bbc0524b6f12a2faa22484"/>
+      <w:bookmarkStart w:id="329" w:name="_039ecb01ea617f0d4bbc0524b6f12a2faa22484"/>
       <w:r>
         <w:rPr>
           <w:rStyle w:val="SectionNumber"/>
           <w:lang w:val="en-CA"/>
         </w:rPr>
-        <w:t xml:space="preserve">25.3</w:t>
+        <w:t xml:space="preserve">26.3</w:t>
       </w:r>
       <w:r>
         <w:tab/>
@@ -39392,7 +40662,7 @@
         </w:rPr>
         <w:t xml:space="preserve">Step 3: add the features you need</w:t>
       </w:r>
-      <w:bookmarkEnd w:id="313"/>
+      <w:bookmarkEnd w:id="329"/>
     </w:p>
     <w:p>
       <w:pPr>
@@ -39543,7 +40813,7 @@
         </w:rPr>
         <w:t xml:space="preserve"> </w:t>
       </w:r>
-      <w:hyperlink r:id="rId314">
+      <w:hyperlink r:id="rId330">
         <w:r>
           <w:rPr>
             <w:rStyle w:val="Hyperlink"/>
@@ -39755,13 +41025,13 @@
       <w:pPr>
         <w:pStyle w:val="Heading2"/>
       </w:pPr>
-      <w:bookmarkStart w:id="315" w:name="_8bb412bbeb9abe7687d3b1b7f8b7944c9e70455"/>
+      <w:bookmarkStart w:id="331" w:name="_8bb412bbeb9abe7687d3b1b7f8b7944c9e70455"/>
       <w:r>
         <w:rPr>
           <w:rStyle w:val="SectionNumber"/>
           <w:lang w:val="en-CA"/>
         </w:rPr>
-        <w:t xml:space="preserve">25.4</w:t>
+        <w:t xml:space="preserve">26.4</w:t>
       </w:r>
       <w:r>
         <w:tab/>
@@ -39772,7 +41042,7 @@
         </w:rPr>
         <w:t xml:space="preserve">Step 4: open the app</w:t>
       </w:r>
-      <w:bookmarkEnd w:id="315"/>
+      <w:bookmarkEnd w:id="331"/>
     </w:p>
     <w:p>
       <w:pPr>
@@ -39851,13 +41121,13 @@
       <w:pPr>
         <w:pStyle w:val="Heading2"/>
       </w:pPr>
-      <w:bookmarkStart w:id="316" w:name="_c9902a1ecadf5a80036b9c8f4634ac8a440c0d9"/>
+      <w:bookmarkStart w:id="332" w:name="_c9902a1ecadf5a80036b9c8f4634ac8a440c0d9"/>
       <w:r>
         <w:rPr>
           <w:rStyle w:val="SectionNumber"/>
           <w:lang w:val="en-CA"/>
         </w:rPr>
-        <w:t xml:space="preserve">25.5</w:t>
+        <w:t xml:space="preserve">26.5</w:t>
       </w:r>
       <w:r>
         <w:tab/>
@@ -39868,7 +41138,7 @@
         </w:rPr>
         <w:t xml:space="preserve">Open it next time</w:t>
       </w:r>
-      <w:bookmarkEnd w:id="316"/>
+      <w:bookmarkEnd w:id="332"/>
     </w:p>
     <w:p>
       <w:pPr>
@@ -39921,7 +41191,7 @@
           <w:rStyle w:val="VerbatimChar"/>
           <w:lang w:val="en-CA"/>
         </w:rPr>
-        <w:t xml:space="preserve">v0.5.0</w:t>
+        <w:t xml:space="preserve">v0.6.0</w:t>
       </w:r>
       <w:r>
         <w:rPr>
@@ -39940,13 +41210,13 @@
       <w:pPr>
         <w:pStyle w:val="Heading2"/>
       </w:pPr>
-      <w:bookmarkStart w:id="317" w:name="_a66ef44638838a32a702e83c86a7707916e06f4"/>
+      <w:bookmarkStart w:id="333" w:name="_a66ef44638838a32a702e83c86a7707916e06f4"/>
       <w:r>
         <w:rPr>
           <w:rStyle w:val="SectionNumber"/>
           <w:lang w:val="en-CA"/>
         </w:rPr>
-        <w:t xml:space="preserve">25.6</w:t>
+        <w:t xml:space="preserve">26.6</w:t>
       </w:r>
       <w:r>
         <w:tab/>
@@ -39957,7 +41227,7 @@
         </w:rPr>
         <w:t xml:space="preserve">If package installation fails</w:t>
       </w:r>
-      <w:bookmarkEnd w:id="317"/>
+      <w:bookmarkEnd w:id="333"/>
     </w:p>
     <w:p>
       <w:pPr>
@@ -39997,7 +41267,7 @@
         </w:rPr>
         <w:t xml:space="preserve"> </w:t>
       </w:r>
-      <w:hyperlink r:id="rId318">
+      <w:hyperlink r:id="rId334">
         <w:r>
           <w:rPr>
             <w:rStyle w:val="Hyperlink"/>
@@ -40017,13 +41287,13 @@
       <w:pPr>
         <w:pStyle w:val="Heading1"/>
       </w:pPr>
-      <w:bookmarkStart w:id="319" w:name="_examples"/>
+      <w:bookmarkStart w:id="335" w:name="_examples"/>
       <w:r>
         <w:rPr>
           <w:rStyle w:val="SectionNumber"/>
           <w:lang w:val="en-CA"/>
         </w:rPr>
-        <w:t xml:space="preserve">26</w:t>
+        <w:t xml:space="preserve">27</w:t>
       </w:r>
       <w:r>
         <w:tab/>
@@ -40034,7 +41304,7 @@
         </w:rPr>
         <w:t xml:space="preserve">Choose an example project</w:t>
       </w:r>
-      <w:bookmarkEnd w:id="319"/>
+      <w:bookmarkEnd w:id="335"/>
     </w:p>
     <w:p>
       <w:pPr>
@@ -40051,13 +41321,13 @@
       <w:pPr>
         <w:pStyle w:val="Heading2"/>
       </w:pPr>
-      <w:bookmarkStart w:id="320" w:name="_1161df807543c9811f88b6e377f5dac2203ec6f"/>
+      <w:bookmarkStart w:id="336" w:name="_1161df807543c9811f88b6e377f5dac2203ec6f"/>
       <w:r>
         <w:rPr>
           <w:rStyle w:val="SectionNumber"/>
           <w:lang w:val="en-CA"/>
         </w:rPr>
-        <w:t xml:space="preserve">26.1</w:t>
+        <w:t xml:space="preserve">27.1</w:t>
       </w:r>
       <w:r>
         <w:tab/>
@@ -40068,14 +41338,14 @@
         </w:rPr>
         <w:t xml:space="preserve">Find an example by task</w:t>
       </w:r>
-      <w:bookmarkEnd w:id="320"/>
+      <w:bookmarkEnd w:id="336"/>
     </w:p>
     <w:p>
       <w:pPr>
         <w:pStyle w:val="Compact"/>
         <w:numPr>
           <w:ilvl w:val="0"/>
-          <w:numId w:val="1092"/>
+          <w:numId w:val="1096"/>
         </w:numPr>
       </w:pPr>
       <w:r>
@@ -40182,7 +41452,7 @@
         <w:pStyle w:val="Compact"/>
         <w:numPr>
           <w:ilvl w:val="0"/>
-          <w:numId w:val="1092"/>
+          <w:numId w:val="1096"/>
         </w:numPr>
       </w:pPr>
       <w:r>
@@ -40223,7 +41493,7 @@
         <w:pStyle w:val="Compact"/>
         <w:numPr>
           <w:ilvl w:val="0"/>
-          <w:numId w:val="1092"/>
+          <w:numId w:val="1096"/>
         </w:numPr>
       </w:pPr>
       <w:r>
@@ -40264,7 +41534,7 @@
         <w:pStyle w:val="Compact"/>
         <w:numPr>
           <w:ilvl w:val="0"/>
-          <w:numId w:val="1092"/>
+          <w:numId w:val="1096"/>
         </w:numPr>
       </w:pPr>
       <w:r>
@@ -40383,7 +41653,7 @@
         <w:t xml:space="preserve">If nothing appears, clear the search and filters, then try just one filter. You can also use the Task finder at the end of this guide to see which projects contain a task.</w:t>
       </w:r>
     </w:p>
-    <w:bookmarkStart w:id="324" w:name="_9036caf9fae7b328fd74a83d567b5b48ab233d4"/>
+    <w:bookmarkStart w:id="340" w:name="_9036caf9fae7b328fd74a83d567b5b48ab233d4"/>
     <w:p>
       <w:pPr>
         <w:pStyle w:val="CaptionedFigure"/>
@@ -40393,18 +41663,18 @@
           <wp:inline>
             <wp:extent cx="5334000" cy="6507479"/>
             <wp:effectExtent b="0" l="0" r="0" t="0"/>
-            <wp:docPr descr="Figure 36. The Task type filter finds example projects that contain Summary Statistics. Clear a filter to return to the full list." title="" id="322" name="Picture"/>
+            <wp:docPr descr="Figure 38. The Task type filter finds example projects that contain Summary Statistics. Clear a filter to return to the full list." title="" id="338" name="Picture"/>
             <a:graphic>
               <a:graphicData uri="http://schemas.openxmlformats.org/drawingml/2006/picture">
                 <pic:pic>
                   <pic:nvPicPr>
-                    <pic:cNvPr descr="assets/ui-examples.png" id="323" name="Picture"/>
+                    <pic:cNvPr descr="assets/ui-examples.png" id="339" name="Picture"/>
                     <pic:cNvPicPr>
                       <a:picLocks noChangeArrowheads="1" noChangeAspect="1"/>
                     </pic:cNvPicPr>
                   </pic:nvPicPr>
                   <pic:blipFill>
-                    <a:blip r:embed="rId321"/>
+                    <a:blip r:embed="rId337"/>
                     <a:stretch>
                       <a:fillRect/>
                     </a:stretch>
@@ -40439,21 +41709,21 @@
         <w:rPr>
           <w:lang w:val="en-CA"/>
         </w:rPr>
-        <w:t xml:space="preserve">Figure 36. The Task type filter finds example projects that contain Summary Statistics. Clear a filter to return to the full list.</w:t>
-      </w:r>
-    </w:p>
-    <w:bookmarkEnd w:id="324"/>
+        <w:t xml:space="preserve">Figure 38. The Task type filter finds example projects that contain Summary Statistics. Clear a filter to return to the full list.</w:t>
+      </w:r>
+    </w:p>
+    <w:bookmarkEnd w:id="340"/>
     <w:p>
       <w:pPr>
         <w:pStyle w:val="Heading2"/>
       </w:pPr>
-      <w:bookmarkStart w:id="325" w:name="_31555209e5ce0218bc47d1e81094beccdf2f150"/>
+      <w:bookmarkStart w:id="341" w:name="_31555209e5ce0218bc47d1e81094beccdf2f150"/>
       <w:r>
         <w:rPr>
           <w:rStyle w:val="SectionNumber"/>
           <w:lang w:val="en-CA"/>
         </w:rPr>
-        <w:t xml:space="preserve">26.2</w:t>
+        <w:t xml:space="preserve">27.2</w:t>
       </w:r>
       <w:r>
         <w:tab/>
@@ -40464,7 +41734,7 @@
         </w:rPr>
         <w:t xml:space="preserve">A simple learning route</w:t>
       </w:r>
-      <w:bookmarkEnd w:id="325"/>
+      <w:bookmarkEnd w:id="341"/>
     </w:p>
     <w:p>
       <w:pPr>
@@ -40579,13 +41849,13 @@
       <w:pPr>
         <w:pStyle w:val="Heading2"/>
       </w:pPr>
-      <w:bookmarkStart w:id="326" w:name="_1e992ae5d47d8c7e7aba951d07e6a2145646eb4"/>
+      <w:bookmarkStart w:id="342" w:name="_1e992ae5d47d8c7e7aba951d07e6a2145646eb4"/>
       <w:r>
         <w:rPr>
           <w:rStyle w:val="SectionNumber"/>
           <w:lang w:val="en-CA"/>
         </w:rPr>
-        <w:t xml:space="preserve">26.3</w:t>
+        <w:t xml:space="preserve">27.3</w:t>
       </w:r>
       <w:r>
         <w:tab/>
@@ -40596,7 +41866,7 @@
         </w:rPr>
         <w:t xml:space="preserve">Before you rerun an example</w:t>
       </w:r>
-      <w:bookmarkEnd w:id="326"/>
+      <w:bookmarkEnd w:id="342"/>
     </w:p>
     <w:p>
       <w:pPr>
@@ -40624,13 +41894,13 @@
       <w:pPr>
         <w:pStyle w:val="Heading2"/>
       </w:pPr>
-      <w:bookmarkStart w:id="327" w:name="_21bd78632142afcd25484709307580c6d6c6d3a"/>
+      <w:bookmarkStart w:id="343" w:name="_21bd78632142afcd25484709307580c6d6c6d3a"/>
       <w:r>
         <w:rPr>
           <w:rStyle w:val="SectionNumber"/>
           <w:lang w:val="en-CA"/>
         </w:rPr>
-        <w:t xml:space="preserve">26.4</w:t>
+        <w:t xml:space="preserve">27.4</w:t>
       </w:r>
       <w:r>
         <w:tab/>
@@ -40641,7 +41911,7 @@
         </w:rPr>
         <w:t xml:space="preserve">Iris exploration</w:t>
       </w:r>
-      <w:bookmarkEnd w:id="327"/>
+      <w:bookmarkEnd w:id="343"/>
     </w:p>
     <w:p>
       <w:pPr>
@@ -40904,13 +42174,13 @@
       <w:pPr>
         <w:pStyle w:val="Heading2"/>
       </w:pPr>
-      <w:bookmarkStart w:id="328" w:name="_d3b62668685501de97beecafc9cd547dc14a656"/>
+      <w:bookmarkStart w:id="344" w:name="_d3b62668685501de97beecafc9cd547dc14a656"/>
       <w:r>
         <w:rPr>
           <w:rStyle w:val="SectionNumber"/>
           <w:lang w:val="en-CA"/>
         </w:rPr>
-        <w:t xml:space="preserve">26.5</w:t>
+        <w:t xml:space="preserve">27.5</w:t>
       </w:r>
       <w:r>
         <w:tab/>
@@ -40921,7 +42191,7 @@
         </w:rPr>
         <w:t xml:space="preserve">Air quality - clean and compare</w:t>
       </w:r>
-      <w:bookmarkEnd w:id="328"/>
+      <w:bookmarkEnd w:id="344"/>
     </w:p>
     <w:p>
       <w:pPr>
@@ -41184,13 +42454,13 @@
       <w:pPr>
         <w:pStyle w:val="Heading2"/>
       </w:pPr>
-      <w:bookmarkStart w:id="329" w:name="_dcfa5c34d6d37ee3b76e8b0ea5e5fc39240e133"/>
+      <w:bookmarkStart w:id="345" w:name="_dcfa5c34d6d37ee3b76e8b0ea5e5fc39240e133"/>
       <w:r>
         <w:rPr>
           <w:rStyle w:val="SectionNumber"/>
           <w:lang w:val="en-CA"/>
         </w:rPr>
-        <w:t xml:space="preserve">26.6</w:t>
+        <w:t xml:space="preserve">27.6</w:t>
       </w:r>
       <w:r>
         <w:tab/>
@@ -41201,7 +42471,7 @@
         </w:rPr>
         <w:t xml:space="preserve">Fuel economy model</w:t>
       </w:r>
-      <w:bookmarkEnd w:id="329"/>
+      <w:bookmarkEnd w:id="345"/>
     </w:p>
     <w:p>
       <w:pPr>
@@ -41464,13 +42734,13 @@
       <w:pPr>
         <w:pStyle w:val="Heading2"/>
       </w:pPr>
-      <w:bookmarkStart w:id="330" w:name="_7470bfd0df99295531e08b3c6e271fcadd99d5d"/>
+      <w:bookmarkStart w:id="346" w:name="_7470bfd0df99295531e08b3c6e271fcadd99d5d"/>
       <w:r>
         <w:rPr>
           <w:rStyle w:val="SectionNumber"/>
           <w:lang w:val="en-CA"/>
         </w:rPr>
-        <w:t xml:space="preserve">26.7</w:t>
+        <w:t xml:space="preserve">27.7</w:t>
       </w:r>
       <w:r>
         <w:tab/>
@@ -41481,7 +42751,7 @@
         </w:rPr>
         <w:t xml:space="preserve">Cars - prepare an analysis table</w:t>
       </w:r>
-      <w:bookmarkEnd w:id="330"/>
+      <w:bookmarkEnd w:id="346"/>
     </w:p>
     <w:p>
       <w:pPr>
@@ -41849,13 +43119,13 @@
       <w:pPr>
         <w:pStyle w:val="Heading2"/>
       </w:pPr>
-      <w:bookmarkStart w:id="331" w:name="_026277d2e33159d8419b6c3d75e98cd8ffe7800"/>
+      <w:bookmarkStart w:id="347" w:name="_026277d2e33159d8419b6c3d75e98cd8ffe7800"/>
       <w:r>
         <w:rPr>
           <w:rStyle w:val="SectionNumber"/>
           <w:lang w:val="en-CA"/>
         </w:rPr>
-        <w:t xml:space="preserve">26.8</w:t>
+        <w:t xml:space="preserve">27.8</w:t>
       </w:r>
       <w:r>
         <w:tab/>
@@ -41866,7 +43136,7 @@
         </w:rPr>
         <w:t xml:space="preserve">US states - import, join and filter</w:t>
       </w:r>
-      <w:bookmarkEnd w:id="331"/>
+      <w:bookmarkEnd w:id="347"/>
     </w:p>
     <w:p>
       <w:pPr>
@@ -42129,13 +43399,13 @@
       <w:pPr>
         <w:pStyle w:val="Heading2"/>
       </w:pPr>
-      <w:bookmarkStart w:id="332" w:name="_ca5e74b165e062aa30c877b129b60a2936d6cbd"/>
+      <w:bookmarkStart w:id="348" w:name="_ca5e74b165e062aa30c877b129b60a2936d6cbd"/>
       <w:r>
         <w:rPr>
           <w:rStyle w:val="SectionNumber"/>
           <w:lang w:val="en-CA"/>
         </w:rPr>
-        <w:t xml:space="preserve">26.9</w:t>
+        <w:t xml:space="preserve">27.9</w:t>
       </w:r>
       <w:r>
         <w:tab/>
@@ -42146,7 +43416,7 @@
         </w:rPr>
         <w:t xml:space="preserve">Iris - reshape and compare</w:t>
       </w:r>
-      <w:bookmarkEnd w:id="332"/>
+      <w:bookmarkEnd w:id="348"/>
     </w:p>
     <w:p>
       <w:pPr>
@@ -42451,13 +43721,13 @@
       <w:pPr>
         <w:pStyle w:val="Heading2"/>
       </w:pPr>
-      <w:bookmarkStart w:id="333" w:name="_2f95c19651bc388bebc1375c415a903a447b927"/>
+      <w:bookmarkStart w:id="349" w:name="_2f95c19651bc388bebc1375c415a903a447b927"/>
       <w:r>
         <w:rPr>
           <w:rStyle w:val="SectionNumber"/>
           <w:lang w:val="en-CA"/>
         </w:rPr>
-        <w:t xml:space="preserve">26.10</w:t>
+        <w:t xml:space="preserve">27.10</w:t>
       </w:r>
       <w:r>
         <w:tab/>
@@ -42468,7 +43738,7 @@
         </w:rPr>
         <w:t xml:space="preserve">Cars - rank, scale and sample</w:t>
       </w:r>
-      <w:bookmarkEnd w:id="333"/>
+      <w:bookmarkEnd w:id="349"/>
     </w:p>
     <w:p>
       <w:pPr>
@@ -42731,13 +44001,13 @@
       <w:pPr>
         <w:pStyle w:val="Heading2"/>
       </w:pPr>
-      <w:bookmarkStart w:id="334" w:name="_b987ac423c466eb2f7ed60496b3aea5071fbd45"/>
+      <w:bookmarkStart w:id="350" w:name="_b987ac423c466eb2f7ed60496b3aea5071fbd45"/>
       <w:r>
         <w:rPr>
           <w:rStyle w:val="SectionNumber"/>
           <w:lang w:val="en-CA"/>
         </w:rPr>
-        <w:t xml:space="preserve">26.11</w:t>
+        <w:t xml:space="preserve">27.11</w:t>
       </w:r>
       <w:r>
         <w:tab/>
@@ -42748,7 +44018,7 @@
         </w:rPr>
         <w:t xml:space="preserve">Tooth growth - descriptive analysis</w:t>
       </w:r>
-      <w:bookmarkEnd w:id="334"/>
+      <w:bookmarkEnd w:id="350"/>
     </w:p>
     <w:p>
       <w:pPr>
@@ -43095,13 +44365,13 @@
       <w:pPr>
         <w:pStyle w:val="Heading2"/>
       </w:pPr>
-      <w:bookmarkStart w:id="335" w:name="_d11b25457f88aed00a9f208d2cb5a615935a493"/>
+      <w:bookmarkStart w:id="351" w:name="_d11b25457f88aed00a9f208d2cb5a615935a493"/>
       <w:r>
         <w:rPr>
           <w:rStyle w:val="SectionNumber"/>
           <w:lang w:val="en-CA"/>
         </w:rPr>
-        <w:t xml:space="preserve">26.12</w:t>
+        <w:t xml:space="preserve">27.12</w:t>
       </w:r>
       <w:r>
         <w:tab/>
@@ -43112,7 +44382,7 @@
         </w:rPr>
         <w:t xml:space="preserve">Flowers - categorical chart gallery</w:t>
       </w:r>
-      <w:bookmarkEnd w:id="335"/>
+      <w:bookmarkEnd w:id="351"/>
     </w:p>
     <w:p>
       <w:pPr>
@@ -43375,13 +44645,13 @@
       <w:pPr>
         <w:pStyle w:val="Heading2"/>
       </w:pPr>
-      <w:bookmarkStart w:id="336" w:name="_f0a542b3a462c8592703810518f326ac31b23a0"/>
+      <w:bookmarkStart w:id="352" w:name="_f0a542b3a462c8592703810518f326ac31b23a0"/>
       <w:r>
         <w:rPr>
           <w:rStyle w:val="SectionNumber"/>
           <w:lang w:val="en-CA"/>
         </w:rPr>
-        <w:t xml:space="preserve">26.13</w:t>
+        <w:t xml:space="preserve">27.13</w:t>
       </w:r>
       <w:r>
         <w:tab/>
@@ -43392,7 +44662,7 @@
         </w:rPr>
         <w:t xml:space="preserve">Flowers - numeric chart gallery</w:t>
       </w:r>
-      <w:bookmarkEnd w:id="336"/>
+      <w:bookmarkEnd w:id="352"/>
     </w:p>
     <w:p>
       <w:pPr>
@@ -43697,13 +44967,13 @@
       <w:pPr>
         <w:pStyle w:val="Heading2"/>
       </w:pPr>
-      <w:bookmarkStart w:id="337" w:name="_3cd953742c59855a7d11034bc307f64ad2dd0b2"/>
+      <w:bookmarkStart w:id="353" w:name="_3cd953742c59855a7d11034bc307f64ad2dd0b2"/>
       <w:r>
         <w:rPr>
           <w:rStyle w:val="SectionNumber"/>
           <w:lang w:val="en-CA"/>
         </w:rPr>
-        <w:t xml:space="preserve">26.14</w:t>
+        <w:t xml:space="preserve">27.14</w:t>
       </w:r>
       <w:r>
         <w:tab/>
@@ -43714,7 +44984,7 @@
         </w:rPr>
         <w:t xml:space="preserve">Nottingham temperatures - time charts</w:t>
       </w:r>
-      <w:bookmarkEnd w:id="337"/>
+      <w:bookmarkEnd w:id="353"/>
     </w:p>
     <w:p>
       <w:pPr>
@@ -43956,13 +45226,13 @@
       <w:pPr>
         <w:pStyle w:val="Heading2"/>
       </w:pPr>
-      <w:bookmarkStart w:id="338" w:name="_4e8700d2bf07bb1fd6d6ff0e2a4b3da02ec4b73"/>
+      <w:bookmarkStart w:id="354" w:name="_4e8700d2bf07bb1fd6d6ff0e2a4b3da02ec4b73"/>
       <w:r>
         <w:rPr>
           <w:rStyle w:val="SectionNumber"/>
           <w:lang w:val="en-CA"/>
         </w:rPr>
-        <w:t xml:space="preserve">26.15</w:t>
+        <w:t xml:space="preserve">27.15</w:t>
       </w:r>
       <w:r>
         <w:tab/>
@@ -43973,7 +45243,7 @@
         </w:rPr>
         <w:t xml:space="preserve">Plant growth - compare experimental groups</w:t>
       </w:r>
-      <w:bookmarkEnd w:id="338"/>
+      <w:bookmarkEnd w:id="354"/>
     </w:p>
     <w:p>
       <w:pPr>
@@ -44236,13 +45506,13 @@
       <w:pPr>
         <w:pStyle w:val="Heading2"/>
       </w:pPr>
-      <w:bookmarkStart w:id="339" w:name="_1a5ce5e1f719502d5a4018090c6019ea0ab394f"/>
+      <w:bookmarkStart w:id="355" w:name="_1a5ce5e1f719502d5a4018090c6019ea0ab394f"/>
       <w:r>
         <w:rPr>
           <w:rStyle w:val="SectionNumber"/>
           <w:lang w:val="en-CA"/>
         </w:rPr>
-        <w:t xml:space="preserve">26.16</w:t>
+        <w:t xml:space="preserve">27.16</w:t>
       </w:r>
       <w:r>
         <w:tab/>
@@ -44253,7 +45523,7 @@
         </w:rPr>
         <w:t xml:space="preserve">Cars - binary outcome model</w:t>
       </w:r>
-      <w:bookmarkEnd w:id="339"/>
+      <w:bookmarkEnd w:id="355"/>
     </w:p>
     <w:p>
       <w:pPr>
@@ -44474,13 +45744,13 @@
       <w:pPr>
         <w:pStyle w:val="Heading2"/>
       </w:pPr>
-      <w:bookmarkStart w:id="340" w:name="_832ea193a7cc05b426520cab723a7144e862a2b"/>
+      <w:bookmarkStart w:id="356" w:name="_832ea193a7cc05b426520cab723a7144e862a2b"/>
       <w:r>
         <w:rPr>
           <w:rStyle w:val="SectionNumber"/>
           <w:lang w:val="en-CA"/>
         </w:rPr>
-        <w:t xml:space="preserve">26.17</w:t>
+        <w:t xml:space="preserve">27.17</w:t>
       </w:r>
       <w:r>
         <w:tab/>
@@ -44491,7 +45761,7 @@
         </w:rPr>
         <w:t xml:space="preserve">Loom breaks - a count model</w:t>
       </w:r>
-      <w:bookmarkEnd w:id="340"/>
+      <w:bookmarkEnd w:id="356"/>
     </w:p>
     <w:p>
       <w:pPr>
@@ -44712,13 +45982,13 @@
       <w:pPr>
         <w:pStyle w:val="Heading2"/>
       </w:pPr>
-      <w:bookmarkStart w:id="341" w:name="_4f7330b7639faf28d79d7140f2c04ba04b95e6f"/>
+      <w:bookmarkStart w:id="357" w:name="_4f7330b7639faf28d79d7140f2c04ba04b95e6f"/>
       <w:r>
         <w:rPr>
           <w:rStyle w:val="SectionNumber"/>
           <w:lang w:val="en-CA"/>
         </w:rPr>
-        <w:t xml:space="preserve">26.18</w:t>
+        <w:t xml:space="preserve">27.18</w:t>
       </w:r>
       <w:r>
         <w:tab/>
@@ -44729,7 +45999,7 @@
         </w:rPr>
         <w:t xml:space="preserve">Puromycin - fit a nonlinear curve</w:t>
       </w:r>
-      <w:bookmarkEnd w:id="341"/>
+      <w:bookmarkEnd w:id="357"/>
     </w:p>
     <w:p>
       <w:pPr>
@@ -44971,13 +46241,13 @@
       <w:pPr>
         <w:pStyle w:val="Heading2"/>
       </w:pPr>
-      <w:bookmarkStart w:id="342" w:name="_a8fbc4d0256962de451d24f0e7a31943b6dfff1"/>
+      <w:bookmarkStart w:id="358" w:name="_a8fbc4d0256962de451d24f0e7a31943b6dfff1"/>
       <w:r>
         <w:rPr>
           <w:rStyle w:val="SectionNumber"/>
           <w:lang w:val="en-CA"/>
         </w:rPr>
-        <w:t xml:space="preserve">26.19</w:t>
+        <w:t xml:space="preserve">27.19</w:t>
       </w:r>
       <w:r>
         <w:tab/>
@@ -44988,7 +46258,7 @@
         </w:rPr>
         <w:t xml:space="preserve">Flowers - multivariate structure</w:t>
       </w:r>
-      <w:bookmarkEnd w:id="342"/>
+      <w:bookmarkEnd w:id="358"/>
     </w:p>
     <w:p>
       <w:pPr>
@@ -45251,13 +46521,13 @@
       <w:pPr>
         <w:pStyle w:val="Heading2"/>
       </w:pPr>
-      <w:bookmarkStart w:id="343" w:name="_6cc249a99454fee10ba506f19ae7106e9c5dd1f"/>
+      <w:bookmarkStart w:id="359" w:name="_6cc249a99454fee10ba506f19ae7106e9c5dd1f"/>
       <w:r>
         <w:rPr>
           <w:rStyle w:val="SectionNumber"/>
           <w:lang w:val="en-CA"/>
         </w:rPr>
-        <w:t xml:space="preserve">26.20</w:t>
+        <w:t xml:space="preserve">27.20</w:t>
       </w:r>
       <w:r>
         <w:tab/>
@@ -45268,7 +46538,7 @@
         </w:rPr>
         <w:t xml:space="preserve">Lung cancer - survival analysis</w:t>
       </w:r>
-      <w:bookmarkEnd w:id="343"/>
+      <w:bookmarkEnd w:id="359"/>
     </w:p>
     <w:p>
       <w:pPr>
@@ -45510,13 +46780,13 @@
       <w:pPr>
         <w:pStyle w:val="Heading2"/>
       </w:pPr>
-      <w:bookmarkStart w:id="344" w:name="_cbe2f34be92d7e3bc3f13f0aa6a7860a9e25176"/>
+      <w:bookmarkStart w:id="360" w:name="_cbe2f34be92d7e3bc3f13f0aa6a7860a9e25176"/>
       <w:r>
         <w:rPr>
           <w:rStyle w:val="SectionNumber"/>
           <w:lang w:val="en-CA"/>
         </w:rPr>
-        <w:t xml:space="preserve">26.21</w:t>
+        <w:t xml:space="preserve">27.21</w:t>
       </w:r>
       <w:r>
         <w:tab/>
@@ -45527,7 +46797,7 @@
         </w:rPr>
         <w:t xml:space="preserve">Air passengers - forecast a monthly series</w:t>
       </w:r>
-      <w:bookmarkEnd w:id="344"/>
+      <w:bookmarkEnd w:id="360"/>
     </w:p>
     <w:p>
       <w:pPr>
@@ -45748,13 +47018,13 @@
       <w:pPr>
         <w:pStyle w:val="Heading2"/>
       </w:pPr>
-      <w:bookmarkStart w:id="345" w:name="_e40fb31b66e496f3977fc632e1d1ff4f8a62c48"/>
+      <w:bookmarkStart w:id="361" w:name="_e40fb31b66e496f3977fc632e1d1ff4f8a62c48"/>
       <w:r>
         <w:rPr>
           <w:rStyle w:val="SectionNumber"/>
           <w:lang w:val="en-CA"/>
         </w:rPr>
-        <w:t xml:space="preserve">26.22</w:t>
+        <w:t xml:space="preserve">27.22</w:t>
       </w:r>
       <w:r>
         <w:tab/>
@@ -45765,7 +47035,7 @@
         </w:rPr>
         <w:t xml:space="preserve">Nile flow - distribution and stability</w:t>
       </w:r>
-      <w:bookmarkEnd w:id="345"/>
+      <w:bookmarkEnd w:id="361"/>
     </w:p>
     <w:p>
       <w:pPr>
@@ -46028,13 +47298,13 @@
       <w:pPr>
         <w:pStyle w:val="Heading2"/>
       </w:pPr>
-      <w:bookmarkStart w:id="346" w:name="_70778f1d8463281d343798cf0e564234b695bce"/>
+      <w:bookmarkStart w:id="362" w:name="_70778f1d8463281d343798cf0e564234b695bce"/>
       <w:r>
         <w:rPr>
           <w:rStyle w:val="SectionNumber"/>
           <w:lang w:val="en-CA"/>
         </w:rPr>
-        <w:t xml:space="preserve">26.23</w:t>
+        <w:t xml:space="preserve">27.23</w:t>
       </w:r>
       <w:r>
         <w:tab/>
@@ -46045,7 +47315,7 @@
         </w:rPr>
         <w:t xml:space="preserve">Flowers - conditional quality gate</w:t>
       </w:r>
-      <w:bookmarkEnd w:id="346"/>
+      <w:bookmarkEnd w:id="362"/>
     </w:p>
     <w:p>
       <w:pPr>
@@ -46287,13 +47557,13 @@
       <w:pPr>
         <w:pStyle w:val="Heading2"/>
       </w:pPr>
-      <w:bookmarkStart w:id="347" w:name="_d1fa91f12c85e035faea16f9886afd4c15c3390"/>
+      <w:bookmarkStart w:id="363" w:name="_d1fa91f12c85e035faea16f9886afd4c15c3390"/>
       <w:r>
         <w:rPr>
           <w:rStyle w:val="SectionNumber"/>
           <w:lang w:val="en-CA"/>
         </w:rPr>
-        <w:t xml:space="preserve">26.24</w:t>
+        <w:t xml:space="preserve">27.24</w:t>
       </w:r>
       <w:r>
         <w:tab/>
@@ -46304,7 +47574,7 @@
         </w:rPr>
         <w:t xml:space="preserve">Flowers - repeat by species</w:t>
       </w:r>
-      <w:bookmarkEnd w:id="347"/>
+      <w:bookmarkEnd w:id="363"/>
     </w:p>
     <w:p>
       <w:pPr>
@@ -46525,13 +47795,13 @@
       <w:pPr>
         <w:pStyle w:val="Heading2"/>
       </w:pPr>
-      <w:bookmarkStart w:id="348" w:name="_8908cf64df94c9bdbdaf8a540270b8a74acbf32"/>
+      <w:bookmarkStart w:id="364" w:name="_8908cf64df94c9bdbdaf8a540270b8a74acbf32"/>
       <w:r>
         <w:rPr>
           <w:rStyle w:val="SectionNumber"/>
           <w:lang w:val="en-CA"/>
         </w:rPr>
-        <w:t xml:space="preserve">26.25</w:t>
+        <w:t xml:space="preserve">27.25</w:t>
       </w:r>
       <w:r>
         <w:tab/>
@@ -46542,7 +47812,7 @@
         </w:rPr>
         <w:t xml:space="preserve">Cars - a report with an execution audit</w:t>
       </w:r>
-      <w:bookmarkEnd w:id="348"/>
+      <w:bookmarkEnd w:id="364"/>
     </w:p>
     <w:p>
       <w:pPr>
@@ -46763,13 +48033,13 @@
       <w:pPr>
         <w:pStyle w:val="Heading1"/>
       </w:pPr>
-      <w:bookmarkStart w:id="349" w:name="_5833ee26ef878f6420a537fe950547e75a3e473"/>
+      <w:bookmarkStart w:id="365" w:name="_5833ee26ef878f6420a537fe950547e75a3e473"/>
       <w:r>
         <w:rPr>
           <w:rStyle w:val="SectionNumber"/>
           <w:lang w:val="en-CA"/>
         </w:rPr>
-        <w:t xml:space="preserve">27</w:t>
+        <w:t xml:space="preserve">28</w:t>
       </w:r>
       <w:r>
         <w:tab/>
@@ -46780,7 +48050,7 @@
         </w:rPr>
         <w:t xml:space="preserve">Task finder</w:t>
       </w:r>
-      <w:bookmarkEnd w:id="349"/>
+      <w:bookmarkEnd w:id="365"/>
     </w:p>
     <w:p>
       <w:pPr>
@@ -50072,13 +51342,13 @@
       <w:pPr>
         <w:pStyle w:val="Heading1"/>
       </w:pPr>
-      <w:bookmarkStart w:id="350" w:name="_13322735ec75468257ef9e97ae4d15b5cbe9585"/>
+      <w:bookmarkStart w:id="366" w:name="_13322735ec75468257ef9e97ae4d15b5cbe9585"/>
       <w:r>
         <w:rPr>
           <w:rStyle w:val="SectionNumber"/>
           <w:lang w:val="en-CA"/>
         </w:rPr>
-        <w:t xml:space="preserve">28</w:t>
+        <w:t xml:space="preserve">29</w:t>
       </w:r>
       <w:r>
         <w:tab/>
@@ -50089,19 +51359,19 @@
         </w:rPr>
         <w:t xml:space="preserve">Shortcuts and everyday terms</w:t>
       </w:r>
-      <w:bookmarkEnd w:id="350"/>
+      <w:bookmarkEnd w:id="366"/>
     </w:p>
     <w:p>
       <w:pPr>
         <w:pStyle w:val="Heading2"/>
       </w:pPr>
-      <w:bookmarkStart w:id="351" w:name="_4e6cee15dc273795397785b8a92cb00a6fdb51b"/>
+      <w:bookmarkStart w:id="367" w:name="_4e6cee15dc273795397785b8a92cb00a6fdb51b"/>
       <w:r>
         <w:rPr>
           <w:rStyle w:val="SectionNumber"/>
           <w:lang w:val="en-CA"/>
         </w:rPr>
-        <w:t xml:space="preserve">28.1</w:t>
+        <w:t xml:space="preserve">29.1</w:t>
       </w:r>
       <w:r>
         <w:tab/>
@@ -50112,7 +51382,7 @@
         </w:rPr>
         <w:t xml:space="preserve">Useful Windows desktop shortcuts</w:t>
       </w:r>
-      <w:bookmarkEnd w:id="351"/>
+      <w:bookmarkEnd w:id="367"/>
     </w:p>
     <w:p>
       <w:pPr>
@@ -50164,6 +51434,66 @@
                 <w:lang w:val="en-CA"/>
               </w:rPr>
               <w:t xml:space="preserve">Action</w:t>
+            </w:r>
+          </w:p>
+        </w:tc>
+      </w:tr>
+      <w:tr>
+        <w:tc>
+          <w:tcPr/>
+          <w:p>
+            <w:pPr>
+              <w:pStyle w:val="Compact"/>
+            </w:pPr>
+            <w:r>
+              <w:rPr>
+                <w:lang w:val="en-CA"/>
+              </w:rPr>
+              <w:t xml:space="preserve">Ctrl+Shift+O</w:t>
+            </w:r>
+          </w:p>
+        </w:tc>
+        <w:tc>
+          <w:tcPr/>
+          <w:p>
+            <w:pPr>
+              <w:pStyle w:val="Compact"/>
+            </w:pPr>
+            <w:r>
+              <w:rPr>
+                <w:lang w:val="en-CA"/>
+              </w:rPr>
+              <w:t xml:space="preserve">Open Shiny app</w:t>
+            </w:r>
+          </w:p>
+        </w:tc>
+      </w:tr>
+      <w:tr>
+        <w:tc>
+          <w:tcPr/>
+          <w:p>
+            <w:pPr>
+              <w:pStyle w:val="Compact"/>
+            </w:pPr>
+            <w:r>
+              <w:rPr>
+                <w:lang w:val="en-CA"/>
+              </w:rPr>
+              <w:t xml:space="preserve">Ctrl+Alt+I</w:t>
+            </w:r>
+          </w:p>
+        </w:tc>
+        <w:tc>
+          <w:tcPr/>
+          <w:p>
+            <w:pPr>
+              <w:pStyle w:val="Compact"/>
+            </w:pPr>
+            <w:r>
+              <w:rPr>
+                <w:lang w:val="en-CA"/>
+              </w:rPr>
+              <w:t xml:space="preserve">Return to Individual Guide workspace</w:t>
             </w:r>
           </w:p>
         </w:tc>
@@ -50534,13 +51864,13 @@
       <w:pPr>
         <w:pStyle w:val="Heading2"/>
       </w:pPr>
-      <w:bookmarkStart w:id="352" w:name="_445e238603aeeb30630e7621db1108270355771"/>
+      <w:bookmarkStart w:id="368" w:name="_445e238603aeeb30630e7621db1108270355771"/>
       <w:r>
         <w:rPr>
           <w:rStyle w:val="SectionNumber"/>
           <w:lang w:val="en-CA"/>
         </w:rPr>
-        <w:t xml:space="preserve">28.2</w:t>
+        <w:t xml:space="preserve">29.2</w:t>
       </w:r>
       <w:r>
         <w:tab/>
@@ -50551,7 +51881,7 @@
         </w:rPr>
         <w:t xml:space="preserve">A few more terms</w:t>
       </w:r>
-      <w:bookmarkEnd w:id="352"/>
+      <w:bookmarkEnd w:id="368"/>
     </w:p>
     <w:tbl>
       <w:tblPr>
@@ -50962,13 +52292,13 @@
       <w:pPr>
         <w:pStyle w:val="Heading2"/>
       </w:pPr>
-      <w:bookmarkStart w:id="353" w:name="_f84d4da59a23e9cd06b6ddc741eb0a23ce45774"/>
+      <w:bookmarkStart w:id="369" w:name="_f84d4da59a23e9cd06b6ddc741eb0a23ce45774"/>
       <w:r>
         <w:rPr>
           <w:rStyle w:val="SectionNumber"/>
           <w:lang w:val="en-CA"/>
         </w:rPr>
-        <w:t xml:space="preserve">28.3</w:t>
+        <w:t xml:space="preserve">29.3</w:t>
       </w:r>
       <w:r>
         <w:tab/>
@@ -50979,14 +52309,14 @@
         </w:rPr>
         <w:t xml:space="preserve">Public downloads and help</w:t>
       </w:r>
-      <w:bookmarkEnd w:id="353"/>
+      <w:bookmarkEnd w:id="369"/>
     </w:p>
     <w:p>
       <w:pPr>
         <w:pStyle w:val="Compact"/>
         <w:numPr>
           <w:ilvl w:val="0"/>
-          <w:numId w:val="1093"/>
+          <w:numId w:val="1097"/>
         </w:numPr>
       </w:pPr>
       <w:hyperlink r:id="rId17">
@@ -51010,7 +52340,7 @@
         <w:pStyle w:val="Compact"/>
         <w:numPr>
           <w:ilvl w:val="0"/>
-          <w:numId w:val="1093"/>
+          <w:numId w:val="1097"/>
         </w:numPr>
       </w:pPr>
       <w:hyperlink r:id="rId21">
@@ -51034,7 +52364,7 @@
         <w:pStyle w:val="Compact"/>
         <w:numPr>
           <w:ilvl w:val="0"/>
-          <w:numId w:val="1093"/>
+          <w:numId w:val="1097"/>
         </w:numPr>
       </w:pPr>
       <w:hyperlink r:id="rId22">
@@ -51043,7 +52373,7 @@
             <w:rStyle w:val="Hyperlink"/>
             <w:lang w:val="en-CA"/>
           </w:rPr>
-          <w:t xml:space="preserve">Release 0.5.0</w:t>
+          <w:t xml:space="preserve">Release 0.6.0</w:t>
         </w:r>
       </w:hyperlink>
       <w:r>
@@ -51058,10 +52388,10 @@
         <w:pStyle w:val="Compact"/>
         <w:numPr>
           <w:ilvl w:val="0"/>
-          <w:numId w:val="1093"/>
+          <w:numId w:val="1097"/>
         </w:numPr>
       </w:pPr>
-      <w:hyperlink r:id="rId308">
+      <w:hyperlink r:id="rId324">
         <w:r>
           <w:rPr>
             <w:rStyle w:val="Hyperlink"/>
@@ -51082,10 +52412,10 @@
         <w:pStyle w:val="Compact"/>
         <w:numPr>
           <w:ilvl w:val="0"/>
-          <w:numId w:val="1093"/>
+          <w:numId w:val="1097"/>
         </w:numPr>
       </w:pPr>
-      <w:hyperlink r:id="rId311">
+      <w:hyperlink r:id="rId327">
         <w:r>
           <w:rPr>
             <w:rStyle w:val="Hyperlink"/>
@@ -51106,10 +52436,10 @@
         <w:pStyle w:val="Compact"/>
         <w:numPr>
           <w:ilvl w:val="0"/>
-          <w:numId w:val="1093"/>
+          <w:numId w:val="1097"/>
         </w:numPr>
       </w:pPr>
-      <w:hyperlink r:id="rId314">
+      <w:hyperlink r:id="rId330">
         <w:r>
           <w:rPr>
             <w:rStyle w:val="Hyperlink"/>
@@ -54166,34 +55496,7 @@
     </w:lvlOverride>
   </w:num>
   <w:num w:numId="1090">
-    <w:abstractNumId w:val="99411"/>
-    <w:lvlOverride w:ilvl="0">
-      <w:startOverride w:val="1"/>
-    </w:lvlOverride>
-    <w:lvlOverride w:ilvl="1">
-      <w:startOverride w:val="1"/>
-    </w:lvlOverride>
-    <w:lvlOverride w:ilvl="2">
-      <w:startOverride w:val="1"/>
-    </w:lvlOverride>
-    <w:lvlOverride w:ilvl="3">
-      <w:startOverride w:val="1"/>
-    </w:lvlOverride>
-    <w:lvlOverride w:ilvl="4">
-      <w:startOverride w:val="1"/>
-    </w:lvlOverride>
-    <w:lvlOverride w:ilvl="5">
-      <w:startOverride w:val="1"/>
-    </w:lvlOverride>
-    <w:lvlOverride w:ilvl="6">
-      <w:startOverride w:val="1"/>
-    </w:lvlOverride>
-    <w:lvlOverride w:ilvl="7">
-      <w:startOverride w:val="1"/>
-    </w:lvlOverride>
-    <w:lvlOverride w:ilvl="8">
-      <w:startOverride w:val="1"/>
-    </w:lvlOverride>
+    <w:abstractNumId w:val="991"/>
   </w:num>
   <w:num w:numId="1091">
     <w:abstractNumId w:val="99411"/>
@@ -54256,6 +55559,99 @@
     </w:lvlOverride>
   </w:num>
   <w:num w:numId="1093">
+    <w:abstractNumId w:val="991"/>
+  </w:num>
+  <w:num w:numId="1094">
+    <w:abstractNumId w:val="99411"/>
+    <w:lvlOverride w:ilvl="0">
+      <w:startOverride w:val="1"/>
+    </w:lvlOverride>
+    <w:lvlOverride w:ilvl="1">
+      <w:startOverride w:val="1"/>
+    </w:lvlOverride>
+    <w:lvlOverride w:ilvl="2">
+      <w:startOverride w:val="1"/>
+    </w:lvlOverride>
+    <w:lvlOverride w:ilvl="3">
+      <w:startOverride w:val="1"/>
+    </w:lvlOverride>
+    <w:lvlOverride w:ilvl="4">
+      <w:startOverride w:val="1"/>
+    </w:lvlOverride>
+    <w:lvlOverride w:ilvl="5">
+      <w:startOverride w:val="1"/>
+    </w:lvlOverride>
+    <w:lvlOverride w:ilvl="6">
+      <w:startOverride w:val="1"/>
+    </w:lvlOverride>
+    <w:lvlOverride w:ilvl="7">
+      <w:startOverride w:val="1"/>
+    </w:lvlOverride>
+    <w:lvlOverride w:ilvl="8">
+      <w:startOverride w:val="1"/>
+    </w:lvlOverride>
+  </w:num>
+  <w:num w:numId="1095">
+    <w:abstractNumId w:val="99411"/>
+    <w:lvlOverride w:ilvl="0">
+      <w:startOverride w:val="1"/>
+    </w:lvlOverride>
+    <w:lvlOverride w:ilvl="1">
+      <w:startOverride w:val="1"/>
+    </w:lvlOverride>
+    <w:lvlOverride w:ilvl="2">
+      <w:startOverride w:val="1"/>
+    </w:lvlOverride>
+    <w:lvlOverride w:ilvl="3">
+      <w:startOverride w:val="1"/>
+    </w:lvlOverride>
+    <w:lvlOverride w:ilvl="4">
+      <w:startOverride w:val="1"/>
+    </w:lvlOverride>
+    <w:lvlOverride w:ilvl="5">
+      <w:startOverride w:val="1"/>
+    </w:lvlOverride>
+    <w:lvlOverride w:ilvl="6">
+      <w:startOverride w:val="1"/>
+    </w:lvlOverride>
+    <w:lvlOverride w:ilvl="7">
+      <w:startOverride w:val="1"/>
+    </w:lvlOverride>
+    <w:lvlOverride w:ilvl="8">
+      <w:startOverride w:val="1"/>
+    </w:lvlOverride>
+  </w:num>
+  <w:num w:numId="1096">
+    <w:abstractNumId w:val="99411"/>
+    <w:lvlOverride w:ilvl="0">
+      <w:startOverride w:val="1"/>
+    </w:lvlOverride>
+    <w:lvlOverride w:ilvl="1">
+      <w:startOverride w:val="1"/>
+    </w:lvlOverride>
+    <w:lvlOverride w:ilvl="2">
+      <w:startOverride w:val="1"/>
+    </w:lvlOverride>
+    <w:lvlOverride w:ilvl="3">
+      <w:startOverride w:val="1"/>
+    </w:lvlOverride>
+    <w:lvlOverride w:ilvl="4">
+      <w:startOverride w:val="1"/>
+    </w:lvlOverride>
+    <w:lvlOverride w:ilvl="5">
+      <w:startOverride w:val="1"/>
+    </w:lvlOverride>
+    <w:lvlOverride w:ilvl="6">
+      <w:startOverride w:val="1"/>
+    </w:lvlOverride>
+    <w:lvlOverride w:ilvl="7">
+      <w:startOverride w:val="1"/>
+    </w:lvlOverride>
+    <w:lvlOverride w:ilvl="8">
+      <w:startOverride w:val="1"/>
+    </w:lvlOverride>
+  </w:num>
+  <w:num w:numId="1097">
     <w:abstractNumId w:val="991"/>
   </w:num>
 </w:numbering>

</xml_diff>

<commit_message>
Refresh verified bilingual handbooks for 0.7.0
</commit_message>
<xml_diff>
--- a/docs/handbook/Individual-Guide-Handbook.docx
+++ b/docs/handbook/Individual-Guide-Handbook.docx
@@ -43,7 +43,7 @@
         <w:rPr>
           <w:lang w:val="en-CA"/>
         </w:rPr>
-        <w:t xml:space="preserve">Beginner edition · Release 0.6.0 · 20 October 2026</w:t>
+        <w:t xml:space="preserve">Beginner edition · Release 0.7.0 · 23 October 2026</w:t>
       </w:r>
     </w:p>
     <w:sdt>
@@ -188,7 +188,7 @@
           <w:bCs/>
           <w:lang w:val="en-CA"/>
         </w:rPr>
-        <w:t xml:space="preserve">Individual Guide 0.6.0</w:t>
+        <w:t xml:space="preserve">Individual Guide 0.7.0</w:t>
       </w:r>
       <w:r>
         <w:rPr>
@@ -1293,7 +1293,7 @@
           <w:bCs/>
           <w:lang w:val="en-CA"/>
         </w:rPr>
-        <w:t xml:space="preserve">IndividualGuide-0.6.0-Setup-Windows-x64.exe</w:t>
+        <w:t xml:space="preserve">IndividualGuide-0.7.0-Setup-Windows-x64.exe</w:t>
       </w:r>
       <w:r>
         <w:rPr>
@@ -1319,7 +1319,7 @@
             <w:rStyle w:val="Hyperlink"/>
             <w:lang w:val="en-CA"/>
           </w:rPr>
-          <w:t xml:space="preserve">0.6.0 release page</w:t>
+          <w:t xml:space="preserve">0.7.0 release page</w:t>
         </w:r>
       </w:hyperlink>
       <w:r>
@@ -1588,7 +1588,7 @@
       <w:r>
         <w:drawing>
           <wp:inline>
-            <wp:extent cx="4319999" cy="4240799"/>
+            <wp:extent cx="4319999" cy="3398399"/>
             <wp:effectExtent b="0" l="0" r="0" t="0"/>
             <wp:docPr descr="Figure 2. At the welcome screen, choose Start with a blank canvas to reach the workspace and its Help menu." title="" id="25" name="Picture"/>
             <a:graphic>
@@ -1609,7 +1609,7 @@
                   <pic:spPr bwMode="auto">
                     <a:xfrm>
                       <a:off x="0" y="0"/>
-                      <a:ext cx="4319999" cy="4240799"/>
+                      <a:ext cx="4319999" cy="3398399"/>
                     </a:xfrm>
                     <a:prstGeom prst="rect">
                       <a:avLst/>
@@ -1837,33 +1837,99 @@
         <w:rPr>
           <w:lang w:val="en-CA"/>
         </w:rPr>
-        <w:t xml:space="preserve">menu.</w:t>
-      </w:r>
-      <w:r>
-        <w:rPr>
-          <w:lang w:val="en-CA"/>
-        </w:rPr>
-        <w:t xml:space="preserve"> </w:t>
-      </w:r>
-      <w:r>
-        <w:rPr>
-          <w:b/>
-          <w:bCs/>
-          <w:lang w:val="en-CA"/>
-        </w:rPr>
-        <w:t xml:space="preserve">Settings &gt; Language</w:t>
-      </w:r>
-      <w:r>
-        <w:rPr>
-          <w:lang w:val="en-CA"/>
-        </w:rPr>
-        <w:t xml:space="preserve"> </w:t>
-      </w:r>
-      <w:r>
-        <w:rPr>
-          <w:lang w:val="en-CA"/>
-        </w:rPr>
-        <w:t xml:space="preserve">offers the same choice.</w:t>
+        <w:t xml:space="preserve">menu. In</w:t>
+      </w:r>
+      <w:r>
+        <w:rPr>
+          <w:lang w:val="en-CA"/>
+        </w:rPr>
+        <w:t xml:space="preserve"> </w:t>
+      </w:r>
+      <w:r>
+        <w:rPr>
+          <w:b/>
+          <w:bCs/>
+          <w:lang w:val="en-CA"/>
+        </w:rPr>
+        <w:t xml:space="preserve">Settings</w:t>
+      </w:r>
+      <w:r>
+        <w:rPr>
+          <w:lang w:val="en-CA"/>
+        </w:rPr>
+        <w:t xml:space="preserve">, search for</w:t>
+      </w:r>
+      <w:r>
+        <w:rPr>
+          <w:lang w:val="en-CA"/>
+        </w:rPr>
+        <w:t xml:space="preserve"> </w:t>
+      </w:r>
+      <w:r>
+        <w:rPr>
+          <w:b/>
+          <w:bCs/>
+          <w:lang w:val="en-CA"/>
+        </w:rPr>
+        <w:t xml:space="preserve">Interface language</w:t>
+      </w:r>
+      <w:r>
+        <w:rPr>
+          <w:lang w:val="en-CA"/>
+        </w:rPr>
+        <w:t xml:space="preserve">, then select</w:t>
+      </w:r>
+      <w:r>
+        <w:rPr>
+          <w:lang w:val="en-CA"/>
+        </w:rPr>
+        <w:t xml:space="preserve"> </w:t>
+      </w:r>
+      <w:r>
+        <w:rPr>
+          <w:b/>
+          <w:bCs/>
+          <w:lang w:val="en-CA"/>
+        </w:rPr>
+        <w:t xml:space="preserve">Edit</w:t>
+      </w:r>
+      <w:r>
+        <w:rPr>
+          <w:lang w:val="en-CA"/>
+        </w:rPr>
+        <w:t xml:space="preserve"> </w:t>
+      </w:r>
+      <w:r>
+        <w:rPr>
+          <w:lang w:val="en-CA"/>
+        </w:rPr>
+        <w:t xml:space="preserve">and</w:t>
+      </w:r>
+      <w:r>
+        <w:rPr>
+          <w:lang w:val="en-CA"/>
+        </w:rPr>
+        <w:t xml:space="preserve"> </w:t>
+      </w:r>
+      <w:r>
+        <w:rPr>
+          <w:b/>
+          <w:bCs/>
+          <w:lang w:val="en-CA"/>
+        </w:rPr>
+        <w:t xml:space="preserve">Save option</w:t>
+      </w:r>
+      <w:r>
+        <w:rPr>
+          <w:lang w:val="en-CA"/>
+        </w:rPr>
+        <w:t xml:space="preserve"> </w:t>
+      </w:r>
+      <w:r>
+        <w:rPr>
+          <w:lang w:val="en-CA"/>
+        </w:rPr>
+        <w:t xml:space="preserve">for a global default or project override.</w:t>
       </w:r>
     </w:p>
     <w:p>
@@ -1889,7 +1955,7 @@
         <w:rPr>
           <w:lang w:val="en-CA"/>
         </w:rPr>
-        <w:t xml:space="preserve">Language is separate from the project. Opening another project does not change it. Your data, column names, file paths, formulas, and names you entered stay as you typed them. R commands and technical identifiers keep the spelling that R needs.</w:t>
+        <w:t xml:space="preserve">The Language menu sets your global language. A project can override it in Settings. Your data, column names, file paths, formulas, and names you entered stay as you typed them. R commands and technical identifiers keep the spelling that R needs.</w:t>
       </w:r>
     </w:p>
     <w:p>
@@ -3680,7 +3746,7 @@
       <w:r>
         <w:drawing>
           <wp:inline>
-            <wp:extent cx="5334000" cy="4599554"/>
+            <wp:extent cx="5334000" cy="4049888"/>
             <wp:effectExtent b="0" l="0" r="0" t="0"/>
             <wp:docPr descr="Figure 5. Start from these Scatter Plot settings and change Y / value to Petal.Width. Save Static ggplot image keeps a picture for the report." title="" id="44" name="Picture"/>
             <a:graphic>
@@ -3701,7 +3767,7 @@
                   <pic:spPr bwMode="auto">
                     <a:xfrm>
                       <a:off x="0" y="0"/>
-                      <a:ext cx="5334000" cy="4599554"/>
+                      <a:ext cx="5334000" cy="4049888"/>
                     </a:xfrm>
                     <a:prstGeom prst="rect">
                       <a:avLst/>
@@ -4611,7 +4677,7 @@
       <w:r>
         <w:drawing>
           <wp:inline>
-            <wp:extent cx="5334000" cy="1118962"/>
+            <wp:extent cx="5334000" cy="876912"/>
             <wp:effectExtent b="0" l="0" r="0" t="0"/>
             <wp:docPr descr="Figure 6. In Outputs, flowers: table declares the table to keep. Its name matches flowers in the copied code." title="" id="51" name="Picture"/>
             <a:graphic>
@@ -4632,7 +4698,7 @@
                   <pic:spPr bwMode="auto">
                     <a:xfrm>
                       <a:off x="0" y="0"/>
-                      <a:ext cx="5334000" cy="1118962"/>
+                      <a:ext cx="5334000" cy="876912"/>
                     </a:xfrm>
                     <a:prstGeom prst="rect">
                       <a:avLst/>
@@ -5162,7 +5228,7 @@
       <w:r>
         <w:drawing>
           <wp:inline>
-            <wp:extent cx="5334000" cy="4599554"/>
+            <wp:extent cx="5334000" cy="4049888"/>
             <wp:effectExtent b="0" l="0" r="0" t="0"/>
             <wp:docPr descr="Figure 7. Summary Statistics needs an input table and numeric columns. The Save checkbox keeps its Output table for later tasks." title="" id="56" name="Picture"/>
             <a:graphic>
@@ -5183,7 +5249,7 @@
                   <pic:spPr bwMode="auto">
                     <a:xfrm>
                       <a:off x="0" y="0"/>
-                      <a:ext cx="5334000" cy="4599554"/>
+                      <a:ext cx="5334000" cy="4049888"/>
                     </a:xfrm>
                     <a:prstGeom prst="rect">
                       <a:avLst/>
@@ -8124,7 +8190,7 @@
       <w:r>
         <w:drawing>
           <wp:inline>
-            <wp:extent cx="5334000" cy="4599554"/>
+            <wp:extent cx="5334000" cy="4049888"/>
             <wp:effectExtent b="0" l="0" r="0" t="0"/>
             <wp:docPr descr="Figure 8. Under Results, the Data tab shows one row per numeric measurement. Check the mean and missing count before using the table in a report." title="" id="69" name="Picture"/>
             <a:graphic>
@@ -8145,7 +8211,7 @@
                   <pic:spPr bwMode="auto">
                     <a:xfrm>
                       <a:off x="0" y="0"/>
-                      <a:ext cx="5334000" cy="4599554"/>
+                      <a:ext cx="5334000" cy="4049888"/>
                     </a:xfrm>
                     <a:prstGeom prst="rect">
                       <a:avLst/>
@@ -10201,7 +10267,7 @@
       <w:r>
         <w:drawing>
           <wp:inline>
-            <wp:extent cx="5334000" cy="4599554"/>
+            <wp:extent cx="5334000" cy="4190543"/>
             <wp:effectExtent b="0" l="0" r="0" t="0"/>
             <wp:docPr descr="Figure 11. Import Data detects the selected CSV and offers delimiter and header settings. Preview it before running the import." title="" id="95" name="Picture"/>
             <a:graphic>
@@ -10222,7 +10288,7 @@
                   <pic:spPr bwMode="auto">
                     <a:xfrm>
                       <a:off x="0" y="0"/>
-                      <a:ext cx="5334000" cy="4599554"/>
+                      <a:ext cx="5334000" cy="4190543"/>
                     </a:xfrm>
                     <a:prstGeom prst="rect">
                       <a:avLst/>
@@ -12035,7 +12101,7 @@
       <w:r>
         <w:drawing>
           <wp:inline>
-            <wp:extent cx="5334000" cy="4599554"/>
+            <wp:extent cx="5334000" cy="4190543"/>
             <wp:effectExtent b="0" l="0" r="0" t="0"/>
             <wp:docPr descr="Figure 12. Query Builder separates column selection, filters, sorting, and joins into tabs. Add wanted columns to Selected columns before previewing." title="" id="103" name="Picture"/>
             <a:graphic>
@@ -12056,7 +12122,7 @@
                   <pic:spPr bwMode="auto">
                     <a:xfrm>
                       <a:off x="0" y="0"/>
-                      <a:ext cx="5334000" cy="4599554"/>
+                      <a:ext cx="5334000" cy="4190543"/>
                     </a:xfrm>
                     <a:prstGeom prst="rect">
                       <a:avLst/>
@@ -14615,7 +14681,7 @@
       <w:r>
         <w:drawing>
           <wp:inline>
-            <wp:extent cx="5334000" cy="4792869"/>
+            <wp:extent cx="5334000" cy="4049888"/>
             <wp:effectExtent b="0" l="0" r="0" t="0"/>
             <wp:docPr descr="Figure 13. Stack Columns keeps unselected identifier columns and puts the selected measurements into two new columns: their names and values." title="" id="115" name="Picture"/>
             <a:graphic>
@@ -14636,7 +14702,7 @@
                   <pic:spPr bwMode="auto">
                     <a:xfrm>
                       <a:off x="0" y="0"/>
-                      <a:ext cx="5334000" cy="4792869"/>
+                      <a:ext cx="5334000" cy="4049888"/>
                     </a:xfrm>
                     <a:prstGeom prst="rect">
                       <a:avLst/>
@@ -16465,7 +16531,7 @@
       <w:r>
         <w:drawing>
           <wp:inline>
-            <wp:extent cx="5334000" cy="4599554"/>
+            <wp:extent cx="5334000" cy="4049888"/>
             <wp:effectExtent b="0" l="0" r="0" t="0"/>
             <wp:docPr descr="Figure 14. Remove Duplicates can compare complete rows or selected keys. Choose the scope before checking how many rows were removed." title="" id="125" name="Picture"/>
             <a:graphic>
@@ -16486,7 +16552,7 @@
                   <pic:spPr bwMode="auto">
                     <a:xfrm>
                       <a:off x="0" y="0"/>
-                      <a:ext cx="5334000" cy="4599554"/>
+                      <a:ext cx="5334000" cy="4049888"/>
                     </a:xfrm>
                     <a:prstGeom prst="rect">
                       <a:avLst/>
@@ -19136,7 +19202,7 @@
       <w:r>
         <w:drawing>
           <wp:inline>
-            <wp:extent cx="5334000" cy="4792869"/>
+            <wp:extent cx="5334000" cy="4049888"/>
             <wp:effectExtent b="0" l="0" r="0" t="0"/>
             <wp:docPr descr="Figure 15. One-Way Frequencies counts the selected Variable. Sort by frequency changes the order, while Results lets you check the counts." title="" id="139" name="Picture"/>
             <a:graphic>
@@ -19157,7 +19223,7 @@
                   <pic:spPr bwMode="auto">
                     <a:xfrm>
                       <a:off x="0" y="0"/>
-                      <a:ext cx="5334000" cy="4792869"/>
+                      <a:ext cx="5334000" cy="4049888"/>
                     </a:xfrm>
                     <a:prstGeom prst="rect">
                       <a:avLst/>
@@ -19990,7 +20056,7 @@
       <w:r>
         <w:drawing>
           <wp:inline>
-            <wp:extent cx="5334000" cy="4599554"/>
+            <wp:extent cx="5334000" cy="4049888"/>
             <wp:effectExtent b="0" l="0" r="0" t="0"/>
             <wp:docPr descr="Figure 16. Summary Tables groups a Value variable by the Row variable. Leave Column variable blank for one grouping column." title="" id="145" name="Picture"/>
             <a:graphic>
@@ -20011,7 +20077,7 @@
                   <pic:spPr bwMode="auto">
                     <a:xfrm>
                       <a:off x="0" y="0"/>
-                      <a:ext cx="5334000" cy="4599554"/>
+                      <a:ext cx="5334000" cy="4049888"/>
                     </a:xfrm>
                     <a:prstGeom prst="rect">
                       <a:avLst/>
@@ -21393,7 +21459,7 @@
       <w:r>
         <w:drawing>
           <wp:inline>
-            <wp:extent cx="5334000" cy="4792869"/>
+            <wp:extent cx="5334000" cy="4190543"/>
             <wp:effectExtent b="0" l="0" r="0" t="0"/>
             <wp:docPr descr="Figure 17. Leaving Value blank makes Bar Chart count observations. Select Species as Category / X to compare the three flower groups." title="" id="154" name="Picture"/>
             <a:graphic>
@@ -21414,7 +21480,7 @@
                   <pic:spPr bwMode="auto">
                     <a:xfrm>
                       <a:off x="0" y="0"/>
-                      <a:ext cx="5334000" cy="4792869"/>
+                      <a:ext cx="5334000" cy="4190543"/>
                     </a:xfrm>
                     <a:prstGeom prst="rect">
                       <a:avLst/>
@@ -25587,7 +25653,7 @@
       <w:r>
         <w:drawing>
           <wp:inline>
-            <wp:extent cx="5334000" cy="4599554"/>
+            <wp:extent cx="5334000" cy="4049888"/>
             <wp:effectExtent b="0" l="0" r="0" t="0"/>
             <wp:docPr descr="Figure 18. Linear Regression uses a response and selected predictors. Optional saved outputs include fitted values and a model object." title="" id="172" name="Picture"/>
             <a:graphic>
@@ -25608,7 +25674,7 @@
                   <pic:spPr bwMode="auto">
                     <a:xfrm>
                       <a:off x="0" y="0"/>
-                      <a:ext cx="5334000" cy="4599554"/>
+                      <a:ext cx="5334000" cy="4049888"/>
                     </a:xfrm>
                     <a:prstGeom prst="rect">
                       <a:avLst/>
@@ -28239,7 +28305,7 @@
       <w:r>
         <w:drawing>
           <wp:inline>
-            <wp:extent cx="5334000" cy="4599554"/>
+            <wp:extent cx="5334000" cy="4049888"/>
             <wp:effectExtent b="0" l="0" r="0" t="0"/>
             <wp:docPr descr="Figure 19. Control Charts uses the row order of the input. A blank Subgroup setting selects an individuals chart; run rules add pattern checks." title="" id="186" name="Picture"/>
             <a:graphic>
@@ -28260,7 +28326,7 @@
                   <pic:spPr bwMode="auto">
                     <a:xfrm>
                       <a:off x="0" y="0"/>
-                      <a:ext cx="5334000" cy="4599554"/>
+                      <a:ext cx="5334000" cy="4049888"/>
                     </a:xfrm>
                     <a:prstGeom prst="rect">
                       <a:avLst/>
@@ -28556,7 +28622,7 @@
       <w:r>
         <w:drawing>
           <wp:inline>
-            <wp:extent cx="5334000" cy="4792869"/>
+            <wp:extent cx="5334000" cy="4049888"/>
             <wp:effectExtent b="0" l="0" r="0" t="0"/>
             <wp:docPr descr="Figure 20. The forecasting form uses an ordered value column and a horizon measured in steps. It does not infer the calendar interval from a date column." title="" id="191" name="Picture"/>
             <a:graphic>
@@ -28577,7 +28643,7 @@
                   <pic:spPr bwMode="auto">
                     <a:xfrm>
                       <a:off x="0" y="0"/>
-                      <a:ext cx="5334000" cy="4792869"/>
+                      <a:ext cx="5334000" cy="4049888"/>
                     </a:xfrm>
                     <a:prstGeom prst="rect">
                       <a:avLst/>
@@ -29036,7 +29102,7 @@
       <w:r>
         <w:drawing>
           <wp:inline>
-            <wp:extent cx="5219999" cy="4501251"/>
+            <wp:extent cx="5219999" cy="3963333"/>
             <wp:effectExtent b="0" l="0" r="0" t="0"/>
             <wp:docPr descr="Figure 21. Life Tables separates follow-up time, event coding, and optional strata. Check the prepared event column before reading the curves." title="" id="197" name="Picture"/>
             <a:graphic>
@@ -29057,7 +29123,7 @@
                   <pic:spPr bwMode="auto">
                     <a:xfrm>
                       <a:off x="0" y="0"/>
-                      <a:ext cx="5219999" cy="4501251"/>
+                      <a:ext cx="5219999" cy="3963333"/>
                     </a:xfrm>
                     <a:prstGeom prst="rect">
                       <a:avLst/>
@@ -30073,7 +30139,7 @@
       <w:r>
         <w:drawing>
           <wp:inline>
-            <wp:extent cx="5334000" cy="4599554"/>
+            <wp:extent cx="5334000" cy="4049888"/>
             <wp:effectExtent b="0" l="0" r="0" t="0"/>
             <wp:docPr descr="Figure 22. Branch settings name each path and its condition. The following task must also select that path in Run after branch/loop path." title="" id="204" name="Picture"/>
             <a:graphic>
@@ -30094,7 +30160,7 @@
                   <pic:spPr bwMode="auto">
                     <a:xfrm>
                       <a:off x="0" y="0"/>
-                      <a:ext cx="5334000" cy="4599554"/>
+                      <a:ext cx="5334000" cy="4049888"/>
                     </a:xfrm>
                     <a:prstGeom prst="rect">
                       <a:avLst/>
@@ -30765,7 +30831,7 @@
       <w:r>
         <w:drawing>
           <wp:inline>
-            <wp:extent cx="5334000" cy="4792869"/>
+            <wp:extent cx="5334000" cy="4049888"/>
             <wp:effectExtent b="0" l="0" r="0" t="0"/>
             <wp:docPr descr="Figure 23. Loop settings choose the source of repeated work. Preview loop lets you check the planned groups before running the flow." title="" id="209" name="Picture"/>
             <a:graphic>
@@ -30786,7 +30852,7 @@
                   <pic:spPr bwMode="auto">
                     <a:xfrm>
                       <a:off x="0" y="0"/>
-                      <a:ext cx="5334000" cy="4792869"/>
+                      <a:ext cx="5334000" cy="4049888"/>
                     </a:xfrm>
                     <a:prstGeom prst="rect">
                       <a:avLst/>
@@ -31840,7 +31906,7 @@
       <w:r>
         <w:drawing>
           <wp:inline>
-            <wp:extent cx="5334000" cy="4831521"/>
+            <wp:extent cx="5334000" cy="3883201"/>
             <wp:effectExtent b="0" l="0" r="0" t="0"/>
             <wp:docPr descr="Figure 24. Task Logging lets you choose events, levels, and message fields. Test the wording in the preview before running the task." title="" id="218" name="Picture"/>
             <a:graphic>
@@ -31861,7 +31927,7 @@
                   <pic:spPr bwMode="auto">
                     <a:xfrm>
                       <a:off x="0" y="0"/>
-                      <a:ext cx="5334000" cy="4831521"/>
+                      <a:ext cx="5334000" cy="3883201"/>
                     </a:xfrm>
                     <a:prstGeom prst="rect">
                       <a:avLst/>
@@ -31934,7 +32000,7 @@
       <w:r>
         <w:drawing>
           <wp:inline>
-            <wp:extent cx="5334000" cy="3386414"/>
+            <wp:extent cx="5334000" cy="2506033"/>
             <wp:effectExtent b="0" l="0" r="0" t="0"/>
             <wp:docPr descr="Figure 25. Read the rendered entry before running the task. File output preview lets you inspect Text, CSV, or JSON without writing a file." title="" id="222" name="Picture"/>
             <a:graphic>
@@ -31955,7 +32021,7 @@
                   <pic:spPr bwMode="auto">
                     <a:xfrm>
                       <a:off x="0" y="0"/>
-                      <a:ext cx="5334000" cy="3386414"/>
+                      <a:ext cx="5334000" cy="2506033"/>
                     </a:xfrm>
                     <a:prstGeom prst="rect">
                       <a:avLst/>
@@ -32563,7 +32629,7 @@
       <w:r>
         <w:drawing>
           <wp:inline>
-            <wp:extent cx="5334000" cy="4599554"/>
+            <wp:extent cx="5334000" cy="4049888"/>
             <wp:effectExtent b="0" l="0" r="0" t="0"/>
             <wp:docPr descr="Figure 26. Export Log needs a complete file path, a format, and the tasks to wait for. Its severity filter applies to messages already retained by those tasks." title="" id="228" name="Picture"/>
             <a:graphic>
@@ -32584,7 +32650,7 @@
                   <pic:spPr bwMode="auto">
                     <a:xfrm>
                       <a:off x="0" y="0"/>
-                      <a:ext cx="5334000" cy="4599554"/>
+                      <a:ext cx="5334000" cy="4049888"/>
                     </a:xfrm>
                     <a:prstGeom prst="rect">
                       <a:avLst/>
@@ -32902,7 +32968,7 @@
       <w:r>
         <w:drawing>
           <wp:inline>
-            <wp:extent cx="5334000" cy="4599554"/>
+            <wp:extent cx="5334000" cy="4049888"/>
             <wp:effectExtent b="0" l="0" r="0" t="0"/>
             <wp:docPr descr="Figure 27. Report Appearance controls the log appendix and its minimum level. Generate the report again after changing this setting." title="" id="233" name="Picture"/>
             <a:graphic>
@@ -32923,7 +32989,7 @@
                   <pic:spPr bwMode="auto">
                     <a:xfrm>
                       <a:off x="0" y="0"/>
-                      <a:ext cx="5334000" cy="4599554"/>
+                      <a:ext cx="5334000" cy="4049888"/>
                     </a:xfrm>
                     <a:prstGeom prst="rect">
                       <a:avLst/>
@@ -33629,7 +33695,7 @@
       <w:r>
         <w:drawing>
           <wp:inline>
-            <wp:extent cx="5334000" cy="4599554"/>
+            <wp:extent cx="5334000" cy="4049888"/>
             <wp:effectExtent b="0" l="0" r="0" t="0"/>
             <wp:docPr descr="Figure 28. Add outputs on the left to build Report contents on the right. Each item can have its own heading, note, and render style." title="" id="241" name="Picture"/>
             <a:graphic>
@@ -33650,7 +33716,7 @@
                   <pic:spPr bwMode="auto">
                     <a:xfrm>
                       <a:off x="0" y="0"/>
-                      <a:ext cx="5334000" cy="4599554"/>
+                      <a:ext cx="5334000" cy="4049888"/>
                     </a:xfrm>
                     <a:prstGeom prst="rect">
                       <a:avLst/>
@@ -34303,7 +34369,7 @@
       <w:r>
         <w:drawing>
           <wp:inline>
-            <wp:extent cx="5334000" cy="4599554"/>
+            <wp:extent cx="5334000" cy="4049888"/>
             <wp:effectExtent b="0" l="0" r="0" t="0"/>
             <wp:docPr descr="Figure 29. Export separates the destination folder from the filename. Check the complete file address before writing or replacing a file." title="" id="248" name="Picture"/>
             <a:graphic>
@@ -34324,7 +34390,7 @@
                   <pic:spPr bwMode="auto">
                     <a:xfrm>
                       <a:off x="0" y="0"/>
-                      <a:ext cx="5334000" cy="4599554"/>
+                      <a:ext cx="5334000" cy="4049888"/>
                     </a:xfrm>
                     <a:prstGeom prst="rect">
                       <a:avLst/>
@@ -35082,7 +35148,7 @@
       <w:r>
         <w:drawing>
           <wp:inline>
-            <wp:extent cx="5334000" cy="4792869"/>
+            <wp:extent cx="5334000" cy="4049888"/>
             <wp:effectExtent b="0" l="0" r="0" t="0"/>
             <wp:docPr descr="Figure 30. The R Console has a command area and transcript. Project-data controls supply working copies for trials; they do not add a step to the flow." title="" id="256" name="Picture"/>
             <a:graphic>
@@ -35103,7 +35169,7 @@
                   <pic:spPr bwMode="auto">
                     <a:xfrm>
                       <a:off x="0" y="0"/>
-                      <a:ext cx="5334000" cy="4792869"/>
+                      <a:ext cx="5334000" cy="4049888"/>
                     </a:xfrm>
                     <a:prstGeom prst="rect">
                       <a:avLst/>
@@ -36107,7 +36173,7 @@
       <w:r>
         <w:drawing>
           <wp:inline>
-            <wp:extent cx="5334000" cy="4792869"/>
+            <wp:extent cx="5334000" cy="4049888"/>
             <wp:effectExtent b="0" l="0" r="0" t="0"/>
             <wp:docPr descr="Figure 31. The Code tab separates the pipeline from supporting functions. Download .R includes both in one file; Download bundle keeps them together in a ZIP." title="" id="266" name="Picture"/>
             <a:graphic>
@@ -36128,7 +36194,7 @@
                   <pic:spPr bwMode="auto">
                     <a:xfrm>
                       <a:off x="0" y="0"/>
-                      <a:ext cx="5334000" cy="4792869"/>
+                      <a:ext cx="5334000" cy="4049888"/>
                     </a:xfrm>
                     <a:prstGeom prst="rect">
                       <a:avLst/>
@@ -36976,7 +37042,7 @@
       <w:r>
         <w:drawing>
           <wp:inline>
-            <wp:extent cx="5334000" cy="3489973"/>
+            <wp:extent cx="5334000" cy="5262879"/>
             <wp:effectExtent b="0" l="0" r="0" t="0"/>
             <wp:docPr descr="Figure 33. Task list provides a searchable alternative to the flow diagram. Find a task by its name, type, status, or output." title="" id="278" name="Picture"/>
             <a:graphic>
@@ -36997,7 +37063,7 @@
                   <pic:spPr bwMode="auto">
                     <a:xfrm>
                       <a:off x="0" y="0"/>
-                      <a:ext cx="5334000" cy="3489973"/>
+                      <a:ext cx="5334000" cy="5262879"/>
                     </a:xfrm>
                     <a:prstGeom prst="rect">
                       <a:avLst/>
@@ -37269,7 +37335,53 @@
         <w:rPr>
           <w:lang w:val="en-CA"/>
         </w:rPr>
-        <w:t xml:space="preserve">Change one setting at a time. Start with</w:t>
+        <w:t xml:space="preserve">Choose</w:t>
+      </w:r>
+      <w:r>
+        <w:rPr>
+          <w:lang w:val="en-CA"/>
+        </w:rPr>
+        <w:t xml:space="preserve"> </w:t>
+      </w:r>
+      <w:r>
+        <w:rPr>
+          <w:b/>
+          <w:bCs/>
+          <w:lang w:val="en-CA"/>
+        </w:rPr>
+        <w:t xml:space="preserve">Global defaults</w:t>
+      </w:r>
+      <w:r>
+        <w:rPr>
+          <w:lang w:val="en-CA"/>
+        </w:rPr>
+        <w:t xml:space="preserve"> </w:t>
+      </w:r>
+      <w:r>
+        <w:rPr>
+          <w:lang w:val="en-CA"/>
+        </w:rPr>
+        <w:t xml:space="preserve">or</w:t>
+      </w:r>
+      <w:r>
+        <w:rPr>
+          <w:lang w:val="en-CA"/>
+        </w:rPr>
+        <w:t xml:space="preserve"> </w:t>
+      </w:r>
+      <w:r>
+        <w:rPr>
+          <w:b/>
+          <w:bCs/>
+          <w:lang w:val="en-CA"/>
+        </w:rPr>
+        <w:t xml:space="preserve">This project</w:t>
+      </w:r>
+      <w:r>
+        <w:rPr>
+          <w:lang w:val="en-CA"/>
+        </w:rPr>
+        <w:t xml:space="preserve">, then search for a setting or select a category. Start with</w:t>
       </w:r>
       <w:r>
         <w:rPr>
@@ -37350,13 +37462,39 @@
           <w:bCs/>
           <w:lang w:val="en-CA"/>
         </w:rPr>
-        <w:t xml:space="preserve">Apply</w:t>
-      </w:r>
-      <w:r>
-        <w:rPr>
-          <w:lang w:val="en-CA"/>
-        </w:rPr>
-        <w:t xml:space="preserve">. Check the workspace, then save the project to keep its settings.</w:t>
+        <w:t xml:space="preserve">Edit</w:t>
+      </w:r>
+      <w:r>
+        <w:rPr>
+          <w:lang w:val="en-CA"/>
+        </w:rPr>
+        <w:t xml:space="preserve"> </w:t>
+      </w:r>
+      <w:r>
+        <w:rPr>
+          <w:lang w:val="en-CA"/>
+        </w:rPr>
+        <w:t xml:space="preserve">beside the option, change its value, then select</w:t>
+      </w:r>
+      <w:r>
+        <w:rPr>
+          <w:lang w:val="en-CA"/>
+        </w:rPr>
+        <w:t xml:space="preserve"> </w:t>
+      </w:r>
+      <w:r>
+        <w:rPr>
+          <w:b/>
+          <w:bCs/>
+          <w:lang w:val="en-CA"/>
+        </w:rPr>
+        <w:t xml:space="preserve">Save option</w:t>
+      </w:r>
+      <w:r>
+        <w:rPr>
+          <w:lang w:val="en-CA"/>
+        </w:rPr>
+        <w:t xml:space="preserve">. Check the workspace. Save the project to keep project overrides.</w:t>
       </w:r>
     </w:p>
     <w:bookmarkStart w:id="286" w:name="_d4aa75b3cdae9aaa9fb41ebddebd7c97b1a4232"/>
@@ -37367,9 +37505,9 @@
       <w:r>
         <w:drawing>
           <wp:inline>
-            <wp:extent cx="5334000" cy="6676389"/>
+            <wp:extent cx="5334000" cy="3516974"/>
             <wp:effectExtent b="0" l="0" r="0" t="0"/>
-            <wp:docPr descr="Figure 34. Settings controls appearance, preview size, saved versions, and run behaviour. Apply a change, check it, and save the project." title="" id="284" name="Picture"/>
+            <wp:docPr descr="Figure 34. Options groups appearance, code editing, the console, execution and recovery settings. Choose a scope, find an option, then select Edit." title="" id="284" name="Picture"/>
             <a:graphic>
               <a:graphicData uri="http://schemas.openxmlformats.org/drawingml/2006/picture">
                 <pic:pic>
@@ -37388,7 +37526,7 @@
                   <pic:spPr bwMode="auto">
                     <a:xfrm>
                       <a:off x="0" y="0"/>
-                      <a:ext cx="5334000" cy="6676389"/>
+                      <a:ext cx="5334000" cy="3516974"/>
                     </a:xfrm>
                     <a:prstGeom prst="rect">
                       <a:avLst/>
@@ -37415,7 +37553,7 @@
         <w:rPr>
           <w:lang w:val="en-CA"/>
         </w:rPr>
-        <w:t xml:space="preserve">Figure 34. Settings controls appearance, preview size, saved versions, and run behaviour. Apply a change, check it, and save the project.</w:t>
+        <w:t xml:space="preserve">Figure 34. Options groups appearance, code editing, the console, execution and recovery settings. Choose a scope, find an option, then select Edit.</w:t>
       </w:r>
     </w:p>
     <w:bookmarkEnd w:id="286"/>
@@ -37423,7 +37561,7 @@
       <w:pPr>
         <w:pStyle w:val="Heading2"/>
       </w:pPr>
-      <w:bookmarkStart w:id="287" w:name="_aca9dd99f3836193fb4cc2f858cb1b537a17819"/>
+      <w:bookmarkStart w:id="287" w:name="_453fe9e796672c2cd62aba8c5e25ac473d0ae5a"/>
       <w:r>
         <w:rPr>
           <w:rStyle w:val="SectionNumber"/>
@@ -37438,9 +37576,303 @@
         <w:rPr>
           <w:lang w:val="en-CA"/>
         </w:rPr>
+        <w:t xml:space="preserve">Global defaults and project overrides</w:t>
+      </w:r>
+      <w:bookmarkEnd w:id="287"/>
+    </w:p>
+    <w:p>
+      <w:pPr>
+        <w:pStyle w:val="FirstParagraph"/>
+      </w:pPr>
+      <w:r>
+        <w:rPr>
+          <w:lang w:val="en-CA"/>
+        </w:rPr>
+        <w:t xml:space="preserve">Global defaults apply to projects that inherit them.</w:t>
+      </w:r>
+      <w:r>
+        <w:rPr>
+          <w:lang w:val="en-CA"/>
+        </w:rPr>
+        <w:t xml:space="preserve"> </w:t>
+      </w:r>
+      <w:r>
+        <w:rPr>
+          <w:b/>
+          <w:bCs/>
+          <w:lang w:val="en-CA"/>
+        </w:rPr>
+        <w:t xml:space="preserve">This project</w:t>
+      </w:r>
+      <w:r>
+        <w:rPr>
+          <w:lang w:val="en-CA"/>
+        </w:rPr>
+        <w:t xml:space="preserve"> </w:t>
+      </w:r>
+      <w:r>
+        <w:rPr>
+          <w:lang w:val="en-CA"/>
+        </w:rPr>
+        <w:t xml:space="preserve">saves only the values you override. Select</w:t>
+      </w:r>
+      <w:r>
+        <w:rPr>
+          <w:lang w:val="en-CA"/>
+        </w:rPr>
+        <w:t xml:space="preserve"> </w:t>
+      </w:r>
+      <w:r>
+        <w:rPr>
+          <w:b/>
+          <w:bCs/>
+          <w:lang w:val="en-CA"/>
+        </w:rPr>
+        <w:t xml:space="preserve">Use global default</w:t>
+      </w:r>
+      <w:r>
+        <w:rPr>
+          <w:lang w:val="en-CA"/>
+        </w:rPr>
+        <w:t xml:space="preserve"> </w:t>
+      </w:r>
+      <w:r>
+        <w:rPr>
+          <w:lang w:val="en-CA"/>
+        </w:rPr>
+        <w:t xml:space="preserve">to remove one project override. An explicit</w:t>
+      </w:r>
+      <w:r>
+        <w:rPr>
+          <w:lang w:val="en-CA"/>
+        </w:rPr>
+        <w:t xml:space="preserve"> </w:t>
+      </w:r>
+      <w:r>
+        <w:rPr>
+          <w:rStyle w:val="VerbatimChar"/>
+          <w:lang w:val="en-CA"/>
+        </w:rPr>
+        <w:t xml:space="preserve">NULL</w:t>
+      </w:r>
+      <w:r>
+        <w:rPr>
+          <w:lang w:val="en-CA"/>
+        </w:rPr>
+        <w:t xml:space="preserve"> </w:t>
+      </w:r>
+      <w:r>
+        <w:rPr>
+          <w:lang w:val="en-CA"/>
+        </w:rPr>
+        <w:t xml:space="preserve">R value removes an option; it does not mean inheritance. Older projects keep their saved preferences when opened.</w:t>
+      </w:r>
+    </w:p>
+    <w:p>
+      <w:pPr>
+        <w:pStyle w:val="BodyText"/>
+      </w:pPr>
+      <w:r>
+        <w:rPr>
+          <w:lang w:val="en-CA"/>
+        </w:rPr>
+        <w:t xml:space="preserve">The R-options categories list the bundled R reference and options registered by the app or console. Use</w:t>
+      </w:r>
+      <w:r>
+        <w:rPr>
+          <w:lang w:val="en-CA"/>
+        </w:rPr>
+        <w:t xml:space="preserve"> </w:t>
+      </w:r>
+      <w:r>
+        <w:rPr>
+          <w:b/>
+          <w:bCs/>
+          <w:lang w:val="en-CA"/>
+        </w:rPr>
+        <w:t xml:space="preserve">Add R option</w:t>
+      </w:r>
+      <w:r>
+        <w:rPr>
+          <w:lang w:val="en-CA"/>
+        </w:rPr>
+        <w:t xml:space="preserve"> </w:t>
+      </w:r>
+      <w:r>
+        <w:rPr>
+          <w:lang w:val="en-CA"/>
+        </w:rPr>
+        <w:t xml:space="preserve">for a package option that is not listed. Enter its name, choose a value type, and select</w:t>
+      </w:r>
+      <w:r>
+        <w:rPr>
+          <w:lang w:val="en-CA"/>
+        </w:rPr>
+        <w:t xml:space="preserve"> </w:t>
+      </w:r>
+      <w:r>
+        <w:rPr>
+          <w:b/>
+          <w:bCs/>
+          <w:lang w:val="en-CA"/>
+        </w:rPr>
+        <w:t xml:space="preserve">Save option</w:t>
+      </w:r>
+      <w:r>
+        <w:rPr>
+          <w:lang w:val="en-CA"/>
+        </w:rPr>
+        <w:t xml:space="preserve">. The expression editor accepts vectors, lists and functions; expressions run when you save. Use the option’s documentation to choose a valid value. Some R options need a restart. If a saved R setting prevents startup, choose</w:t>
+      </w:r>
+      <w:r>
+        <w:rPr>
+          <w:lang w:val="en-CA"/>
+        </w:rPr>
+        <w:t xml:space="preserve"> </w:t>
+      </w:r>
+      <w:r>
+        <w:rPr>
+          <w:b/>
+          <w:bCs/>
+          <w:lang w:val="en-CA"/>
+        </w:rPr>
+        <w:t xml:space="preserve">Session &gt; Restart with default R options…</w:t>
+      </w:r>
+      <w:r>
+        <w:rPr>
+          <w:lang w:val="en-CA"/>
+        </w:rPr>
+        <w:t xml:space="preserve">, repair the setting, then restart normally.</w:t>
+      </w:r>
+    </w:p>
+    <w:p>
+      <w:pPr>
+        <w:pStyle w:val="Heading2"/>
+      </w:pPr>
+      <w:bookmarkStart w:id="288" w:name="_3e611c4f56f0b34f8dafcc7bd9433489d424b8b"/>
+      <w:r>
+        <w:rPr>
+          <w:rStyle w:val="SectionNumber"/>
+          <w:lang w:val="en-CA"/>
+        </w:rPr>
+        <w:t xml:space="preserve">22.2</w:t>
+      </w:r>
+      <w:r>
+        <w:tab/>
+      </w:r>
+      <w:r>
+        <w:rPr>
+          <w:lang w:val="en-CA"/>
+        </w:rPr>
+        <w:t xml:space="preserve">Package versions</w:t>
+      </w:r>
+      <w:bookmarkEnd w:id="288"/>
+    </w:p>
+    <w:p>
+      <w:pPr>
+        <w:pStyle w:val="FirstParagraph"/>
+      </w:pPr>
+      <w:r>
+        <w:rPr>
+          <w:lang w:val="en-CA"/>
+        </w:rPr>
+        <w:t xml:space="preserve">Choose</w:t>
+      </w:r>
+      <w:r>
+        <w:rPr>
+          <w:lang w:val="en-CA"/>
+        </w:rPr>
+        <w:t xml:space="preserve"> </w:t>
+      </w:r>
+      <w:r>
+        <w:rPr>
+          <w:b/>
+          <w:bCs/>
+          <w:lang w:val="en-CA"/>
+        </w:rPr>
+        <w:t xml:space="preserve">Session &gt; R packages…</w:t>
+      </w:r>
+      <w:r>
+        <w:rPr>
+          <w:lang w:val="en-CA"/>
+        </w:rPr>
+        <w:t xml:space="preserve">, or</w:t>
+      </w:r>
+      <w:r>
+        <w:rPr>
+          <w:lang w:val="en-CA"/>
+        </w:rPr>
+        <w:t xml:space="preserve"> </w:t>
+      </w:r>
+      <w:r>
+        <w:rPr>
+          <w:b/>
+          <w:bCs/>
+          <w:lang w:val="en-CA"/>
+        </w:rPr>
+        <w:t xml:space="preserve">R package manager</w:t>
+      </w:r>
+      <w:r>
+        <w:rPr>
+          <w:lang w:val="en-CA"/>
+        </w:rPr>
+        <w:t xml:space="preserve"> </w:t>
+      </w:r>
+      <w:r>
+        <w:rPr>
+          <w:lang w:val="en-CA"/>
+        </w:rPr>
+        <w:t xml:space="preserve">in Options. IG uses its own library. Enter a package name and an exact version, or leave the version empty for the latest available version.</w:t>
+      </w:r>
+      <w:r>
+        <w:rPr>
+          <w:lang w:val="en-CA"/>
+        </w:rPr>
+        <w:t xml:space="preserve"> </w:t>
+      </w:r>
+      <w:r>
+        <w:rPr>
+          <w:b/>
+          <w:bCs/>
+          <w:lang w:val="en-CA"/>
+        </w:rPr>
+        <w:t xml:space="preserve">Pin installed version</w:t>
+      </w:r>
+      <w:r>
+        <w:rPr>
+          <w:lang w:val="en-CA"/>
+        </w:rPr>
+        <w:t xml:space="preserve"> </w:t>
+      </w:r>
+      <w:r>
+        <w:rPr>
+          <w:lang w:val="en-CA"/>
+        </w:rPr>
+        <w:t xml:space="preserve">keeps the selected version. Export a lockfile to record the package profile; restore it to request those versions again. Save your project and restart R after package changes. The manager can restore a previous profile or return to bundled packages.</w:t>
+      </w:r>
+    </w:p>
+    <w:p>
+      <w:pPr>
+        <w:pStyle w:val="Heading2"/>
+      </w:pPr>
+      <w:bookmarkStart w:id="289" w:name="_aca9dd99f3836193fb4cc2f858cb1b537a17819"/>
+      <w:r>
+        <w:rPr>
+          <w:rStyle w:val="SectionNumber"/>
+          <w:lang w:val="en-CA"/>
+        </w:rPr>
+        <w:t xml:space="preserve">22.3</w:t>
+      </w:r>
+      <w:r>
+        <w:tab/>
+      </w:r>
+      <w:r>
+        <w:rPr>
+          <w:lang w:val="en-CA"/>
+        </w:rPr>
         <w:t xml:space="preserve">Display and navigation</w:t>
       </w:r>
-      <w:bookmarkEnd w:id="287"/>
+      <w:bookmarkEnd w:id="289"/>
     </w:p>
     <w:p>
       <w:pPr>
@@ -37490,7 +37922,7 @@
           <w:bCs/>
           <w:lang w:val="en-CA"/>
         </w:rPr>
-        <w:t xml:space="preserve">Default plot theme (new graphs)</w:t>
+        <w:t xml:space="preserve">Default plot theme</w:t>
       </w:r>
       <w:r>
         <w:rPr>
@@ -37516,19 +37948,19 @@
           <w:bCs/>
           <w:lang w:val="en-CA"/>
         </w:rPr>
-        <w:t xml:space="preserve">Default palette (new graphs)</w:t>
-      </w:r>
-      <w:r>
-        <w:rPr>
-          <w:lang w:val="en-CA"/>
-        </w:rPr>
-        <w:t xml:space="preserve"> </w:t>
-      </w:r>
-      <w:r>
-        <w:rPr>
-          <w:lang w:val="en-CA"/>
-        </w:rPr>
-        <w:t xml:space="preserve">affect newly added charts; they do not restyle every existing chart. Use the desktop View menu’s zoom controls if text is too small. For a large flow, combine</w:t>
+        <w:t xml:space="preserve">Default plot palette</w:t>
+      </w:r>
+      <w:r>
+        <w:rPr>
+          <w:lang w:val="en-CA"/>
+        </w:rPr>
+        <w:t xml:space="preserve"> </w:t>
+      </w:r>
+      <w:r>
+        <w:rPr>
+          <w:lang w:val="en-CA"/>
+        </w:rPr>
+        <w:t xml:space="preserve">affect newly added charts; they do not restyle every existing chart. Code-editing and console categories control fonts, wrapping and other display choices. Use the desktop View menu’s zoom controls if text is too small. For a large flow, combine</w:t>
       </w:r>
       <w:r>
         <w:rPr>
@@ -37619,13 +38051,13 @@
       <w:pPr>
         <w:pStyle w:val="Heading2"/>
       </w:pPr>
-      <w:bookmarkStart w:id="288" w:name="_67a53a137307e10ca4594ae92931b21ab0065e6"/>
+      <w:bookmarkStart w:id="290" w:name="_67a53a137307e10ca4594ae92931b21ab0065e6"/>
       <w:r>
         <w:rPr>
           <w:rStyle w:val="SectionNumber"/>
           <w:lang w:val="en-CA"/>
         </w:rPr>
-        <w:t xml:space="preserve">22.2</w:t>
+        <w:t xml:space="preserve">22.4</w:t>
       </w:r>
       <w:r>
         <w:tab/>
@@ -37636,7 +38068,7 @@
         </w:rPr>
         <w:t xml:space="preserve">Saving and confirmation choices</w:t>
       </w:r>
-      <w:bookmarkEnd w:id="288"/>
+      <w:bookmarkEnd w:id="290"/>
     </w:p>
     <w:p>
       <w:pPr>
@@ -37671,47 +38103,47 @@
         <w:rPr>
           <w:lang w:val="en-CA"/>
         </w:rPr>
-        <w:t xml:space="preserve">Leave</w:t>
-      </w:r>
-      <w:r>
-        <w:rPr>
-          <w:lang w:val="en-CA"/>
-        </w:rPr>
-        <w:t xml:space="preserve"> </w:t>
-      </w:r>
-      <w:r>
-        <w:rPr>
-          <w:b/>
-          <w:bCs/>
-          <w:lang w:val="en-CA"/>
-        </w:rPr>
-        <w:t xml:space="preserve">Stop Run Flow at the first failing task</w:t>
-      </w:r>
-      <w:r>
-        <w:rPr>
-          <w:lang w:val="en-CA"/>
-        </w:rPr>
-        <w:t xml:space="preserve"> </w:t>
-      </w:r>
-      <w:r>
-        <w:rPr>
-          <w:lang w:val="en-CA"/>
-        </w:rPr>
-        <w:t xml:space="preserve">on while learning, so an error does not pass unnoticed.</w:t>
-      </w:r>
-      <w:r>
-        <w:rPr>
-          <w:lang w:val="en-CA"/>
-        </w:rPr>
-        <w:t xml:space="preserve"> </w:t>
-      </w:r>
-      <w:r>
-        <w:rPr>
-          <w:b/>
-          <w:bCs/>
-          <w:lang w:val="en-CA"/>
-        </w:rPr>
-        <w:t xml:space="preserve">Run supported tasks in the background</w:t>
+        <w:t xml:space="preserve">Enable</w:t>
+      </w:r>
+      <w:r>
+        <w:rPr>
+          <w:lang w:val="en-CA"/>
+        </w:rPr>
+        <w:t xml:space="preserve"> </w:t>
+      </w:r>
+      <w:r>
+        <w:rPr>
+          <w:b/>
+          <w:bCs/>
+          <w:lang w:val="en-CA"/>
+        </w:rPr>
+        <w:t xml:space="preserve">Stop the flow after the first error</w:t>
+      </w:r>
+      <w:r>
+        <w:rPr>
+          <w:lang w:val="en-CA"/>
+        </w:rPr>
+        <w:t xml:space="preserve"> </w:t>
+      </w:r>
+      <w:r>
+        <w:rPr>
+          <w:lang w:val="en-CA"/>
+        </w:rPr>
+        <w:t xml:space="preserve">while learning, so an error does not pass unnoticed.</w:t>
+      </w:r>
+      <w:r>
+        <w:rPr>
+          <w:lang w:val="en-CA"/>
+        </w:rPr>
+        <w:t xml:space="preserve"> </w:t>
+      </w:r>
+      <w:r>
+        <w:rPr>
+          <w:b/>
+          <w:bCs/>
+          <w:lang w:val="en-CA"/>
+        </w:rPr>
+        <w:t xml:space="preserve">Run supported tasks in background workers</w:t>
       </w:r>
       <w:r>
         <w:rPr>
@@ -37725,6 +38157,32 @@
         </w:rPr>
         <w:t xml:space="preserve">helps keep the interface available during supported work; it does not make every task run at once.</w:t>
       </w:r>
+      <w:r>
+        <w:rPr>
+          <w:lang w:val="en-CA"/>
+        </w:rPr>
+        <w:t xml:space="preserve"> </w:t>
+      </w:r>
+      <w:r>
+        <w:rPr>
+          <w:b/>
+          <w:bCs/>
+          <w:lang w:val="en-CA"/>
+        </w:rPr>
+        <w:t xml:space="preserve">Recovery autosave interval (seconds)</w:t>
+      </w:r>
+      <w:r>
+        <w:rPr>
+          <w:lang w:val="en-CA"/>
+        </w:rPr>
+        <w:t xml:space="preserve"> </w:t>
+      </w:r>
+      <w:r>
+        <w:rPr>
+          <w:lang w:val="en-CA"/>
+        </w:rPr>
+        <w:t xml:space="preserve">defaults to 30.</w:t>
+      </w:r>
     </w:p>
     <w:p>
       <w:pPr>
@@ -37741,13 +38199,13 @@
       <w:pPr>
         <w:pStyle w:val="Heading2"/>
       </w:pPr>
-      <w:bookmarkStart w:id="289" w:name="_4065d8d2374fa10c0d309aff795e1794a965029"/>
+      <w:bookmarkStart w:id="291" w:name="_4065d8d2374fa10c0d309aff795e1794a965029"/>
       <w:r>
         <w:rPr>
           <w:rStyle w:val="SectionNumber"/>
           <w:lang w:val="en-CA"/>
         </w:rPr>
-        <w:t xml:space="preserve">22.3</w:t>
+        <w:t xml:space="preserve">22.5</w:t>
       </w:r>
       <w:r>
         <w:tab/>
@@ -37758,7 +38216,7 @@
         </w:rPr>
         <w:t xml:space="preserve">Trust and private information</w:t>
       </w:r>
-      <w:bookmarkEnd w:id="289"/>
+      <w:bookmarkEnd w:id="291"/>
     </w:p>
     <w:p>
       <w:pPr>
@@ -37786,7 +38244,7 @@
       <w:pPr>
         <w:pStyle w:val="Heading1"/>
       </w:pPr>
-      <w:bookmarkStart w:id="290" w:name="_d7446b71cfcb430df49d33749f78a202c4fc9b8"/>
+      <w:bookmarkStart w:id="292" w:name="_d7446b71cfcb430df49d33749f78a202c4fc9b8"/>
       <w:r>
         <w:rPr>
           <w:rStyle w:val="SectionNumber"/>
@@ -37803,7 +38261,7 @@
         </w:rPr>
         <w:t xml:space="preserve">Open other Shiny apps</w:t>
       </w:r>
-      <w:bookmarkEnd w:id="290"/>
+      <w:bookmarkEnd w:id="292"/>
     </w:p>
     <w:p>
       <w:pPr>
@@ -37831,7 +38289,7 @@
       <w:pPr>
         <w:pStyle w:val="Heading2"/>
       </w:pPr>
-      <w:bookmarkStart w:id="291" w:name="_3b1a859b6741dfbc5762e571121795b31225f24"/>
+      <w:bookmarkStart w:id="293" w:name="_3b1a859b6741dfbc5762e571121795b31225f24"/>
       <w:r>
         <w:rPr>
           <w:rStyle w:val="SectionNumber"/>
@@ -37848,7 +38306,7 @@
         </w:rPr>
         <w:t xml:space="preserve">What you need</w:t>
       </w:r>
-      <w:bookmarkEnd w:id="291"/>
+      <w:bookmarkEnd w:id="293"/>
     </w:p>
     <w:p>
       <w:pPr>
@@ -37978,7 +38436,7 @@
       <w:pPr>
         <w:pStyle w:val="Heading2"/>
       </w:pPr>
-      <w:bookmarkStart w:id="292" w:name="_29ae360ae6e948183496a3ff05aab1575157d71"/>
+      <w:bookmarkStart w:id="294" w:name="_29ae360ae6e948183496a3ff05aab1575157d71"/>
       <w:r>
         <w:rPr>
           <w:rStyle w:val="SectionNumber"/>
@@ -37995,7 +38453,7 @@
         </w:rPr>
         <w:t xml:space="preserve">Try the practice apps</w:t>
       </w:r>
-      <w:bookmarkEnd w:id="292"/>
+      <w:bookmarkEnd w:id="294"/>
     </w:p>
     <w:p>
       <w:pPr>
@@ -38017,7 +38475,7 @@
         </w:rPr>
         <w:t xml:space="preserve"> </w:t>
       </w:r>
-      <w:hyperlink r:id="rId293">
+      <w:hyperlink r:id="rId295">
         <w:r>
           <w:rPr>
             <w:rStyle w:val="Hyperlink"/>
@@ -38202,7 +38660,7 @@
       <w:pPr>
         <w:pStyle w:val="Heading2"/>
       </w:pPr>
-      <w:bookmarkStart w:id="294" w:name="_e5b1f98f9d048705c5948025eafd99d120149eb"/>
+      <w:bookmarkStart w:id="296" w:name="_e5b1f98f9d048705c5948025eafd99d120149eb"/>
       <w:r>
         <w:rPr>
           <w:rStyle w:val="SectionNumber"/>
@@ -38219,9 +38677,9 @@
         </w:rPr>
         <w:t xml:space="preserve">Open and run an app</w:t>
       </w:r>
-      <w:bookmarkEnd w:id="294"/>
-    </w:p>
-    <w:bookmarkStart w:id="298" w:name="_4ad829aa092ea5da191cef59950112c3610d9d0"/>
+      <w:bookmarkEnd w:id="296"/>
+    </w:p>
+    <w:bookmarkStart w:id="300" w:name="_4ad829aa092ea5da191cef59950112c3610d9d0"/>
     <w:p>
       <w:pPr>
         <w:pStyle w:val="CaptionedFigure"/>
@@ -38231,18 +38689,18 @@
           <wp:inline>
             <wp:extent cx="5334000" cy="3655116"/>
             <wp:effectExtent b="0" l="0" r="0" t="0"/>
-            <wp:docPr descr="Figure 35. Choose a single app.R file or a folder containing both ui.R and server.R. Your Individual Guide project stays open behind this view." title="" id="296" name="Picture"/>
+            <wp:docPr descr="Figure 35. Choose a single app.R file or a folder containing both ui.R and server.R. Your Individual Guide project stays open behind this view." title="" id="298" name="Picture"/>
             <a:graphic>
               <a:graphicData uri="http://schemas.openxmlformats.org/drawingml/2006/picture">
                 <pic:pic>
                   <pic:nvPicPr>
-                    <pic:cNvPr descr="assets/ui-shiny-app-picker.png" id="297" name="Picture"/>
+                    <pic:cNvPr descr="assets/ui-shiny-app-picker.png" id="299" name="Picture"/>
                     <pic:cNvPicPr>
                       <a:picLocks noChangeArrowheads="1" noChangeAspect="1"/>
                     </pic:cNvPicPr>
                   </pic:nvPicPr>
                   <pic:blipFill>
-                    <a:blip r:embed="rId295"/>
+                    <a:blip r:embed="rId297"/>
                     <a:stretch>
                       <a:fillRect/>
                     </a:stretch>
@@ -38280,7 +38738,7 @@
         <w:t xml:space="preserve">Figure 35. Choose a single app.R file or a folder containing both ui.R and server.R. Your Individual Guide project stays open behind this view.</w:t>
       </w:r>
     </w:p>
-    <w:bookmarkEnd w:id="298"/>
+    <w:bookmarkEnd w:id="300"/>
     <w:p>
       <w:pPr>
         <w:pStyle w:val="Compact"/>
@@ -38524,7 +38982,7 @@
       <w:pPr>
         <w:pStyle w:val="Heading2"/>
       </w:pPr>
-      <w:bookmarkStart w:id="299" w:name="_811c5088e32268b256b6f64a481164f452a3aba"/>
+      <w:bookmarkStart w:id="301" w:name="_811c5088e32268b256b6f64a481164f452a3aba"/>
       <w:r>
         <w:rPr>
           <w:rStyle w:val="SectionNumber"/>
@@ -38541,9 +38999,9 @@
         </w:rPr>
         <w:t xml:space="preserve">Return to your project</w:t>
       </w:r>
-      <w:bookmarkEnd w:id="299"/>
-    </w:p>
-    <w:bookmarkStart w:id="303" w:name="_25792172c3d369c12517d351fb2c92381441bb3"/>
+      <w:bookmarkEnd w:id="301"/>
+    </w:p>
+    <w:bookmarkStart w:id="305" w:name="_25792172c3d369c12517d351fb2c92381441bb3"/>
     <w:p>
       <w:pPr>
         <w:pStyle w:val="CaptionedFigure"/>
@@ -38553,18 +39011,18 @@
           <wp:inline>
             <wp:extent cx="5334000" cy="3655116"/>
             <wp:effectExtent b="0" l="0" r="0" t="0"/>
-            <wp:docPr descr="Figure 36. The loaded app fills most of the window. The Individual Guide bar keeps the workspace, app switcher, log and close controls within reach." title="" id="301" name="Picture"/>
+            <wp:docPr descr="Figure 36. The loaded app fills most of the window. The Individual Guide bar keeps the workspace, app switcher, log and close controls within reach." title="" id="303" name="Picture"/>
             <a:graphic>
               <a:graphicData uri="http://schemas.openxmlformats.org/drawingml/2006/picture">
                 <pic:pic>
                   <pic:nvPicPr>
-                    <pic:cNvPr descr="assets/ui-shiny-app-running.png" id="302" name="Picture"/>
+                    <pic:cNvPr descr="assets/ui-shiny-app-running.png" id="304" name="Picture"/>
                     <pic:cNvPicPr>
                       <a:picLocks noChangeArrowheads="1" noChangeAspect="1"/>
                     </pic:cNvPicPr>
                   </pic:nvPicPr>
                   <pic:blipFill>
-                    <a:blip r:embed="rId300"/>
+                    <a:blip r:embed="rId302"/>
                     <a:stretch>
                       <a:fillRect/>
                     </a:stretch>
@@ -38602,7 +39060,7 @@
         <w:t xml:space="preserve">Figure 36. The loaded app fills most of the window. The Individual Guide bar keeps the workspace, app switcher, log and close controls within reach.</w:t>
       </w:r>
     </w:p>
-    <w:bookmarkEnd w:id="303"/>
+    <w:bookmarkEnd w:id="305"/>
     <w:p>
       <w:pPr>
         <w:pStyle w:val="FirstParagraph"/>
@@ -38692,7 +39150,7 @@
       <w:pPr>
         <w:pStyle w:val="Heading2"/>
       </w:pPr>
-      <w:bookmarkStart w:id="304" w:name="_c67d8c1b968ba0ef4a3b3a5f60c9916269960b2"/>
+      <w:bookmarkStart w:id="306" w:name="_c67d8c1b968ba0ef4a3b3a5f60c9916269960b2"/>
       <w:r>
         <w:rPr>
           <w:rStyle w:val="SectionNumber"/>
@@ -38709,7 +39167,7 @@
         </w:rPr>
         <w:t xml:space="preserve">Close an app or open another</w:t>
       </w:r>
-      <w:bookmarkEnd w:id="304"/>
+      <w:bookmarkEnd w:id="306"/>
     </w:p>
     <w:p>
       <w:pPr>
@@ -38929,7 +39387,7 @@
       <w:pPr>
         <w:pStyle w:val="Heading2"/>
       </w:pPr>
-      <w:bookmarkStart w:id="305" w:name="_d14e65a8989d00b1265618fc2206b32825c5120"/>
+      <w:bookmarkStart w:id="307" w:name="_d14e65a8989d00b1265618fc2206b32825c5120"/>
       <w:r>
         <w:rPr>
           <w:rStyle w:val="SectionNumber"/>
@@ -38946,7 +39404,7 @@
         </w:rPr>
         <w:t xml:space="preserve">If an app will not start</w:t>
       </w:r>
-      <w:bookmarkEnd w:id="305"/>
+      <w:bookmarkEnd w:id="307"/>
     </w:p>
     <w:p>
       <w:pPr>
@@ -39056,7 +39514,7 @@
       <w:pPr>
         <w:pStyle w:val="Heading1"/>
       </w:pPr>
-      <w:bookmarkStart w:id="306" w:name="_performance"/>
+      <w:bookmarkStart w:id="308" w:name="_performance"/>
       <w:r>
         <w:rPr>
           <w:rStyle w:val="SectionNumber"/>
@@ -39073,7 +39531,7 @@
         </w:rPr>
         <w:t xml:space="preserve">Keep work running smoothly</w:t>
       </w:r>
-      <w:bookmarkEnd w:id="306"/>
+      <w:bookmarkEnd w:id="308"/>
     </w:p>
     <w:p>
       <w:pPr>
@@ -39090,7 +39548,7 @@
       <w:pPr>
         <w:pStyle w:val="Heading2"/>
       </w:pPr>
-      <w:bookmarkStart w:id="307" w:name="_db1f62276df68210f4c9963a369001fc6459fd1"/>
+      <w:bookmarkStart w:id="309" w:name="_db1f62276df68210f4c9963a369001fc6459fd1"/>
       <w:r>
         <w:rPr>
           <w:rStyle w:val="SectionNumber"/>
@@ -39107,7 +39565,7 @@
         </w:rPr>
         <w:t xml:space="preserve">When editing feels slow</w:t>
       </w:r>
-      <w:bookmarkEnd w:id="307"/>
+      <w:bookmarkEnd w:id="309"/>
     </w:p>
     <w:p>
       <w:pPr>
@@ -39181,7 +39639,7 @@
       <w:pPr>
         <w:pStyle w:val="Heading1"/>
       </w:pPr>
-      <w:bookmarkStart w:id="308" w:name="_troubleshooting"/>
+      <w:bookmarkStart w:id="310" w:name="_troubleshooting"/>
       <w:r>
         <w:rPr>
           <w:rStyle w:val="SectionNumber"/>
@@ -39198,7 +39656,7 @@
         </w:rPr>
         <w:t xml:space="preserve">Troubleshooting</w:t>
       </w:r>
-      <w:bookmarkEnd w:id="308"/>
+      <w:bookmarkEnd w:id="310"/>
     </w:p>
     <w:p>
       <w:pPr>
@@ -39215,7 +39673,7 @@
       <w:pPr>
         <w:pStyle w:val="Heading2"/>
       </w:pPr>
-      <w:bookmarkStart w:id="309" w:name="_e5495e6e6ea6ce07271bfcc11c785fafe89b5c0"/>
+      <w:bookmarkStart w:id="311" w:name="_e5495e6e6ea6ce07271bfcc11c785fafe89b5c0"/>
       <w:r>
         <w:rPr>
           <w:rStyle w:val="SectionNumber"/>
@@ -39232,7 +39690,7 @@
         </w:rPr>
         <w:t xml:space="preserve">The app seems not to open</w:t>
       </w:r>
-      <w:bookmarkEnd w:id="309"/>
+      <w:bookmarkEnd w:id="311"/>
     </w:p>
     <w:p>
       <w:pPr>
@@ -39287,7 +39745,7 @@
       <w:pPr>
         <w:pStyle w:val="Heading2"/>
       </w:pPr>
-      <w:bookmarkStart w:id="310" w:name="_96baa00e4d923e5583237b886548965da170e61"/>
+      <w:bookmarkStart w:id="312" w:name="_96baa00e4d923e5583237b886548965da170e61"/>
       <w:r>
         <w:rPr>
           <w:rStyle w:val="SectionNumber"/>
@@ -39304,7 +39762,7 @@
         </w:rPr>
         <w:t xml:space="preserve">The app disconnects or the R server stops</w:t>
       </w:r>
-      <w:bookmarkEnd w:id="310"/>
+      <w:bookmarkEnd w:id="312"/>
     </w:p>
     <w:p>
       <w:pPr>
@@ -39479,7 +39937,7 @@
         <w:t xml:space="preserve">Check the input paths and results before running the flow again.</w:t>
       </w:r>
     </w:p>
-    <w:bookmarkStart w:id="314" w:name="_bbb89eaaa9ba192022a0b81f45da67fcfc3764a"/>
+    <w:bookmarkStart w:id="316" w:name="_bbb89eaaa9ba192022a0b81f45da67fcfc3764a"/>
     <w:p>
       <w:pPr>
         <w:pStyle w:val="CaptionedFigure"/>
@@ -39487,20 +39945,20 @@
       <w:r>
         <w:drawing>
           <wp:inline>
-            <wp:extent cx="3959999" cy="2810322"/>
+            <wp:extent cx="3959999" cy="3959999"/>
             <wp:effectExtent b="0" l="0" r="0" t="0"/>
-            <wp:docPr descr="Figure 37. The desktop Session menu provides server restart and startup diagnostics. Use task logs instead when investigating an analysis result." title="" id="312" name="Picture"/>
+            <wp:docPr descr="Figure 37. The desktop Session menu provides server restart and startup diagnostics. Use task logs instead when investigating an analysis result." title="" id="314" name="Picture"/>
             <a:graphic>
               <a:graphicData uri="http://schemas.openxmlformats.org/drawingml/2006/picture">
                 <pic:pic>
                   <pic:nvPicPr>
-                    <pic:cNvPr descr="assets/ui-session-menu.png" id="313" name="Picture"/>
+                    <pic:cNvPr descr="assets/ui-session-menu.png" id="315" name="Picture"/>
                     <pic:cNvPicPr>
                       <a:picLocks noChangeArrowheads="1" noChangeAspect="1"/>
                     </pic:cNvPicPr>
                   </pic:nvPicPr>
                   <pic:blipFill>
-                    <a:blip r:embed="rId311"/>
+                    <a:blip r:embed="rId313"/>
                     <a:stretch>
                       <a:fillRect/>
                     </a:stretch>
@@ -39508,7 +39966,7 @@
                   <pic:spPr bwMode="auto">
                     <a:xfrm>
                       <a:off x="0" y="0"/>
-                      <a:ext cx="3959999" cy="2810322"/>
+                      <a:ext cx="3959999" cy="3959999"/>
                     </a:xfrm>
                     <a:prstGeom prst="rect">
                       <a:avLst/>
@@ -39538,7 +39996,7 @@
         <w:t xml:space="preserve">Figure 37. The desktop Session menu provides server restart and startup diagnostics. Use task logs instead when investigating an analysis result.</w:t>
       </w:r>
     </w:p>
-    <w:bookmarkEnd w:id="314"/>
+    <w:bookmarkEnd w:id="316"/>
     <w:p>
       <w:pPr>
         <w:pStyle w:val="FirstParagraph"/>
@@ -39575,7 +40033,7 @@
       <w:pPr>
         <w:pStyle w:val="Heading2"/>
       </w:pPr>
-      <w:bookmarkStart w:id="315" w:name="_82e06af1aff5a5e21deb90712fc0f610b42cc44"/>
+      <w:bookmarkStart w:id="317" w:name="_82e06af1aff5a5e21deb90712fc0f610b42cc44"/>
       <w:r>
         <w:rPr>
           <w:rStyle w:val="SectionNumber"/>
@@ -39592,7 +40050,7 @@
         </w:rPr>
         <w:t xml:space="preserve">A button or menu item is disabled</w:t>
       </w:r>
-      <w:bookmarkEnd w:id="315"/>
+      <w:bookmarkEnd w:id="317"/>
     </w:p>
     <w:p>
       <w:pPr>
@@ -39609,7 +40067,7 @@
       <w:pPr>
         <w:pStyle w:val="Heading2"/>
       </w:pPr>
-      <w:bookmarkStart w:id="316" w:name="_a00129cde15cb7d7a4c13b6883deac076cb12b3"/>
+      <w:bookmarkStart w:id="318" w:name="_a00129cde15cb7d7a4c13b6883deac076cb12b3"/>
       <w:r>
         <w:rPr>
           <w:rStyle w:val="SectionNumber"/>
@@ -39626,7 +40084,7 @@
         </w:rPr>
         <w:t xml:space="preserve">A file will not import</w:t>
       </w:r>
-      <w:bookmarkEnd w:id="316"/>
+      <w:bookmarkEnd w:id="318"/>
     </w:p>
     <w:p>
       <w:pPr>
@@ -39675,7 +40133,7 @@
       <w:pPr>
         <w:pStyle w:val="Heading2"/>
       </w:pPr>
-      <w:bookmarkStart w:id="317" w:name="_02eec9c2fdfb94311e9bebb72282f2ee8d79354"/>
+      <w:bookmarkStart w:id="319" w:name="_02eec9c2fdfb94311e9bebb72282f2ee8d79354"/>
       <w:r>
         <w:rPr>
           <w:rStyle w:val="SectionNumber"/>
@@ -39692,7 +40150,7 @@
         </w:rPr>
         <w:t xml:space="preserve">A table or column is missing from a choice list</w:t>
       </w:r>
-      <w:bookmarkEnd w:id="317"/>
+      <w:bookmarkEnd w:id="319"/>
     </w:p>
     <w:p>
       <w:pPr>
@@ -39709,7 +40167,7 @@
       <w:pPr>
         <w:pStyle w:val="Heading2"/>
       </w:pPr>
-      <w:bookmarkStart w:id="318" w:name="_c021d42d6a470de52446e7e69c678153025beb8"/>
+      <w:bookmarkStart w:id="320" w:name="_c021d42d6a470de52446e7e69c678153025beb8"/>
       <w:r>
         <w:rPr>
           <w:rStyle w:val="SectionNumber"/>
@@ -39726,7 +40184,7 @@
         </w:rPr>
         <w:t xml:space="preserve">A result is old, empty, or different from the preview</w:t>
       </w:r>
-      <w:bookmarkEnd w:id="318"/>
+      <w:bookmarkEnd w:id="320"/>
     </w:p>
     <w:p>
       <w:pPr>
@@ -39754,7 +40212,7 @@
       <w:pPr>
         <w:pStyle w:val="Heading2"/>
       </w:pPr>
-      <w:bookmarkStart w:id="319" w:name="_a7936bae1d0dae09fa18baebd700d25fc09e1f5"/>
+      <w:bookmarkStart w:id="321" w:name="_a7936bae1d0dae09fa18baebd700d25fc09e1f5"/>
       <w:r>
         <w:rPr>
           <w:rStyle w:val="SectionNumber"/>
@@ -39771,7 +40229,7 @@
         </w:rPr>
         <w:t xml:space="preserve">A model fails or looks strange</w:t>
       </w:r>
-      <w:bookmarkEnd w:id="319"/>
+      <w:bookmarkEnd w:id="321"/>
     </w:p>
     <w:p>
       <w:pPr>
@@ -39788,7 +40246,7 @@
       <w:pPr>
         <w:pStyle w:val="Heading2"/>
       </w:pPr>
-      <w:bookmarkStart w:id="320" w:name="_e5b9409a1fe8fe07056593210d6f8947414da6c"/>
+      <w:bookmarkStart w:id="322" w:name="_e5b9409a1fe8fe07056593210d6f8947414da6c"/>
       <w:r>
         <w:rPr>
           <w:rStyle w:val="SectionNumber"/>
@@ -39805,7 +40263,7 @@
         </w:rPr>
         <w:t xml:space="preserve">A report is missing a chart</w:t>
       </w:r>
-      <w:bookmarkEnd w:id="320"/>
+      <w:bookmarkEnd w:id="322"/>
     </w:p>
     <w:p>
       <w:pPr>
@@ -39833,7 +40291,7 @@
       <w:pPr>
         <w:pStyle w:val="Heading2"/>
       </w:pPr>
-      <w:bookmarkStart w:id="321" w:name="_43337f50d002d35b7bc91a45b94b7f07b333566"/>
+      <w:bookmarkStart w:id="323" w:name="_43337f50d002d35b7bc91a45b94b7f07b333566"/>
       <w:r>
         <w:rPr>
           <w:rStyle w:val="SectionNumber"/>
@@ -39850,7 +40308,7 @@
         </w:rPr>
         <w:t xml:space="preserve">An exported file is missing or will not update</w:t>
       </w:r>
-      <w:bookmarkEnd w:id="321"/>
+      <w:bookmarkEnd w:id="323"/>
     </w:p>
     <w:p>
       <w:pPr>
@@ -39867,7 +40325,7 @@
       <w:pPr>
         <w:pStyle w:val="Heading2"/>
       </w:pPr>
-      <w:bookmarkStart w:id="322" w:name="_d4733c4e5425e712869378169aab27100a2fa17"/>
+      <w:bookmarkStart w:id="324" w:name="_d4733c4e5425e712869378169aab27100a2fa17"/>
       <w:r>
         <w:rPr>
           <w:rStyle w:val="SectionNumber"/>
@@ -39884,7 +40342,7 @@
         </w:rPr>
         <w:t xml:space="preserve">A log seems empty</w:t>
       </w:r>
-      <w:bookmarkEnd w:id="322"/>
+      <w:bookmarkEnd w:id="324"/>
     </w:p>
     <w:p>
       <w:pPr>
@@ -39912,7 +40370,7 @@
       <w:pPr>
         <w:pStyle w:val="Heading2"/>
       </w:pPr>
-      <w:bookmarkStart w:id="323" w:name="_6a893ea35fd65a58eb741093f9b37da95db71d9"/>
+      <w:bookmarkStart w:id="325" w:name="_6a893ea35fd65a58eb741093f9b37da95db71d9"/>
       <w:r>
         <w:rPr>
           <w:rStyle w:val="SectionNumber"/>
@@ -39929,7 +40387,7 @@
         </w:rPr>
         <w:t xml:space="preserve">Ask for help</w:t>
       </w:r>
-      <w:bookmarkEnd w:id="323"/>
+      <w:bookmarkEnd w:id="325"/>
     </w:p>
     <w:p>
       <w:pPr>
@@ -39947,7 +40405,7 @@
         </w:rPr>
         <w:t xml:space="preserve"> </w:t>
       </w:r>
-      <w:hyperlink r:id="rId324">
+      <w:hyperlink r:id="rId326">
         <w:r>
           <w:rPr>
             <w:rStyle w:val="Hyperlink"/>
@@ -40010,7 +40468,7 @@
       <w:pPr>
         <w:pStyle w:val="Heading1"/>
       </w:pPr>
-      <w:bookmarkStart w:id="325" w:name="_a1499d0f1071ab6f4bd103a6d3c009c0626ab5b"/>
+      <w:bookmarkStart w:id="327" w:name="_a1499d0f1071ab6f4bd103a6d3c009c0626ab5b"/>
       <w:r>
         <w:rPr>
           <w:rStyle w:val="SectionNumber"/>
@@ -40027,7 +40485,7 @@
         </w:rPr>
         <w:t xml:space="preserve">Optional: install with R</w:t>
       </w:r>
-      <w:bookmarkEnd w:id="325"/>
+      <w:bookmarkEnd w:id="327"/>
     </w:p>
     <w:p>
       <w:pPr>
@@ -40095,7 +40553,7 @@
       <w:pPr>
         <w:pStyle w:val="Heading2"/>
       </w:pPr>
-      <w:bookmarkStart w:id="326" w:name="_e84a9b7d06d0136aff5c644ad21d0cd170e9840"/>
+      <w:bookmarkStart w:id="328" w:name="_e84a9b7d06d0136aff5c644ad21d0cd170e9840"/>
       <w:r>
         <w:rPr>
           <w:rStyle w:val="SectionNumber"/>
@@ -40112,7 +40570,7 @@
         </w:rPr>
         <w:t xml:space="preserve">Step 1: install R from its public website</w:t>
       </w:r>
-      <w:bookmarkEnd w:id="326"/>
+      <w:bookmarkEnd w:id="328"/>
     </w:p>
     <w:p>
       <w:pPr>
@@ -40134,7 +40592,7 @@
         </w:rPr>
         <w:t xml:space="preserve"> </w:t>
       </w:r>
-      <w:hyperlink r:id="rId327">
+      <w:hyperlink r:id="rId329">
         <w:r>
           <w:rPr>
             <w:rStyle w:val="Hyperlink"/>
@@ -40322,7 +40780,7 @@
       <w:pPr>
         <w:pStyle w:val="Heading2"/>
       </w:pPr>
-      <w:bookmarkStart w:id="328" w:name="_57da420e24f6bb4133bb0c38b569af410aa3bbd"/>
+      <w:bookmarkStart w:id="330" w:name="_57da420e24f6bb4133bb0c38b569af410aa3bbd"/>
       <w:r>
         <w:rPr>
           <w:rStyle w:val="SectionNumber"/>
@@ -40339,7 +40797,7 @@
         </w:rPr>
         <w:t xml:space="preserve">Step 2: install the app from GitHub</w:t>
       </w:r>
-      <w:bookmarkEnd w:id="328"/>
+      <w:bookmarkEnd w:id="330"/>
     </w:p>
     <w:p>
       <w:pPr>
@@ -40541,7 +40999,7 @@
         <w:rPr>
           <w:rStyle w:val="StringTok"/>
         </w:rPr>
-        <w:t xml:space="preserve">"v0.6.0"</w:t>
+        <w:t xml:space="preserve">"v0.7.0"</w:t>
       </w:r>
       <w:r>
         <w:rPr>
@@ -40645,7 +41103,7 @@
       <w:pPr>
         <w:pStyle w:val="Heading2"/>
       </w:pPr>
-      <w:bookmarkStart w:id="329" w:name="_039ecb01ea617f0d4bbc0524b6f12a2faa22484"/>
+      <w:bookmarkStart w:id="331" w:name="_039ecb01ea617f0d4bbc0524b6f12a2faa22484"/>
       <w:r>
         <w:rPr>
           <w:rStyle w:val="SectionNumber"/>
@@ -40662,7 +41120,7 @@
         </w:rPr>
         <w:t xml:space="preserve">Step 3: add the features you need</w:t>
       </w:r>
-      <w:bookmarkEnd w:id="329"/>
+      <w:bookmarkEnd w:id="331"/>
     </w:p>
     <w:p>
       <w:pPr>
@@ -40813,7 +41271,7 @@
         </w:rPr>
         <w:t xml:space="preserve"> </w:t>
       </w:r>
-      <w:hyperlink r:id="rId330">
+      <w:hyperlink r:id="rId332">
         <w:r>
           <w:rPr>
             <w:rStyle w:val="Hyperlink"/>
@@ -41025,7 +41483,7 @@
       <w:pPr>
         <w:pStyle w:val="Heading2"/>
       </w:pPr>
-      <w:bookmarkStart w:id="331" w:name="_8bb412bbeb9abe7687d3b1b7f8b7944c9e70455"/>
+      <w:bookmarkStart w:id="333" w:name="_8bb412bbeb9abe7687d3b1b7f8b7944c9e70455"/>
       <w:r>
         <w:rPr>
           <w:rStyle w:val="SectionNumber"/>
@@ -41042,7 +41500,7 @@
         </w:rPr>
         <w:t xml:space="preserve">Step 4: open the app</w:t>
       </w:r>
-      <w:bookmarkEnd w:id="331"/>
+      <w:bookmarkEnd w:id="333"/>
     </w:p>
     <w:p>
       <w:pPr>
@@ -41121,7 +41579,7 @@
       <w:pPr>
         <w:pStyle w:val="Heading2"/>
       </w:pPr>
-      <w:bookmarkStart w:id="332" w:name="_c9902a1ecadf5a80036b9c8f4634ac8a440c0d9"/>
+      <w:bookmarkStart w:id="334" w:name="_c9902a1ecadf5a80036b9c8f4634ac8a440c0d9"/>
       <w:r>
         <w:rPr>
           <w:rStyle w:val="SectionNumber"/>
@@ -41138,7 +41596,7 @@
         </w:rPr>
         <w:t xml:space="preserve">Open it next time</w:t>
       </w:r>
-      <w:bookmarkEnd w:id="332"/>
+      <w:bookmarkEnd w:id="334"/>
     </w:p>
     <w:p>
       <w:pPr>
@@ -41191,7 +41649,7 @@
           <w:rStyle w:val="VerbatimChar"/>
           <w:lang w:val="en-CA"/>
         </w:rPr>
-        <w:t xml:space="preserve">v0.6.0</w:t>
+        <w:t xml:space="preserve">v0.7.0</w:t>
       </w:r>
       <w:r>
         <w:rPr>
@@ -41210,7 +41668,7 @@
       <w:pPr>
         <w:pStyle w:val="Heading2"/>
       </w:pPr>
-      <w:bookmarkStart w:id="333" w:name="_a66ef44638838a32a702e83c86a7707916e06f4"/>
+      <w:bookmarkStart w:id="335" w:name="_a66ef44638838a32a702e83c86a7707916e06f4"/>
       <w:r>
         <w:rPr>
           <w:rStyle w:val="SectionNumber"/>
@@ -41227,7 +41685,7 @@
         </w:rPr>
         <w:t xml:space="preserve">If package installation fails</w:t>
       </w:r>
-      <w:bookmarkEnd w:id="333"/>
+      <w:bookmarkEnd w:id="335"/>
     </w:p>
     <w:p>
       <w:pPr>
@@ -41267,7 +41725,7 @@
         </w:rPr>
         <w:t xml:space="preserve"> </w:t>
       </w:r>
-      <w:hyperlink r:id="rId334">
+      <w:hyperlink r:id="rId336">
         <w:r>
           <w:rPr>
             <w:rStyle w:val="Hyperlink"/>
@@ -41287,7 +41745,7 @@
       <w:pPr>
         <w:pStyle w:val="Heading1"/>
       </w:pPr>
-      <w:bookmarkStart w:id="335" w:name="_examples"/>
+      <w:bookmarkStart w:id="337" w:name="_examples"/>
       <w:r>
         <w:rPr>
           <w:rStyle w:val="SectionNumber"/>
@@ -41304,7 +41762,7 @@
         </w:rPr>
         <w:t xml:space="preserve">Choose an example project</w:t>
       </w:r>
-      <w:bookmarkEnd w:id="335"/>
+      <w:bookmarkEnd w:id="337"/>
     </w:p>
     <w:p>
       <w:pPr>
@@ -41321,7 +41779,7 @@
       <w:pPr>
         <w:pStyle w:val="Heading2"/>
       </w:pPr>
-      <w:bookmarkStart w:id="336" w:name="_1161df807543c9811f88b6e377f5dac2203ec6f"/>
+      <w:bookmarkStart w:id="338" w:name="_1161df807543c9811f88b6e377f5dac2203ec6f"/>
       <w:r>
         <w:rPr>
           <w:rStyle w:val="SectionNumber"/>
@@ -41338,7 +41796,7 @@
         </w:rPr>
         <w:t xml:space="preserve">Find an example by task</w:t>
       </w:r>
-      <w:bookmarkEnd w:id="336"/>
+      <w:bookmarkEnd w:id="338"/>
     </w:p>
     <w:p>
       <w:pPr>
@@ -41653,7 +42111,7 @@
         <w:t xml:space="preserve">If nothing appears, clear the search and filters, then try just one filter. You can also use the Task finder at the end of this guide to see which projects contain a task.</w:t>
       </w:r>
     </w:p>
-    <w:bookmarkStart w:id="340" w:name="_9036caf9fae7b328fd74a83d567b5b48ab233d4"/>
+    <w:bookmarkStart w:id="342" w:name="_9036caf9fae7b328fd74a83d567b5b48ab233d4"/>
     <w:p>
       <w:pPr>
         <w:pStyle w:val="CaptionedFigure"/>
@@ -41663,18 +42121,18 @@
           <wp:inline>
             <wp:extent cx="5334000" cy="6507479"/>
             <wp:effectExtent b="0" l="0" r="0" t="0"/>
-            <wp:docPr descr="Figure 38. The Task type filter finds example projects that contain Summary Statistics. Clear a filter to return to the full list." title="" id="338" name="Picture"/>
+            <wp:docPr descr="Figure 38. The Task type filter finds example projects that contain Summary Statistics. Clear a filter to return to the full list." title="" id="340" name="Picture"/>
             <a:graphic>
               <a:graphicData uri="http://schemas.openxmlformats.org/drawingml/2006/picture">
                 <pic:pic>
                   <pic:nvPicPr>
-                    <pic:cNvPr descr="assets/ui-examples.png" id="339" name="Picture"/>
+                    <pic:cNvPr descr="assets/ui-examples.png" id="341" name="Picture"/>
                     <pic:cNvPicPr>
                       <a:picLocks noChangeArrowheads="1" noChangeAspect="1"/>
                     </pic:cNvPicPr>
                   </pic:nvPicPr>
                   <pic:blipFill>
-                    <a:blip r:embed="rId337"/>
+                    <a:blip r:embed="rId339"/>
                     <a:stretch>
                       <a:fillRect/>
                     </a:stretch>
@@ -41712,12 +42170,12 @@
         <w:t xml:space="preserve">Figure 38. The Task type filter finds example projects that contain Summary Statistics. Clear a filter to return to the full list.</w:t>
       </w:r>
     </w:p>
-    <w:bookmarkEnd w:id="340"/>
+    <w:bookmarkEnd w:id="342"/>
     <w:p>
       <w:pPr>
         <w:pStyle w:val="Heading2"/>
       </w:pPr>
-      <w:bookmarkStart w:id="341" w:name="_31555209e5ce0218bc47d1e81094beccdf2f150"/>
+      <w:bookmarkStart w:id="343" w:name="_31555209e5ce0218bc47d1e81094beccdf2f150"/>
       <w:r>
         <w:rPr>
           <w:rStyle w:val="SectionNumber"/>
@@ -41734,7 +42192,7 @@
         </w:rPr>
         <w:t xml:space="preserve">A simple learning route</w:t>
       </w:r>
-      <w:bookmarkEnd w:id="341"/>
+      <w:bookmarkEnd w:id="343"/>
     </w:p>
     <w:p>
       <w:pPr>
@@ -41849,7 +42307,7 @@
       <w:pPr>
         <w:pStyle w:val="Heading2"/>
       </w:pPr>
-      <w:bookmarkStart w:id="342" w:name="_1e992ae5d47d8c7e7aba951d07e6a2145646eb4"/>
+      <w:bookmarkStart w:id="344" w:name="_1e992ae5d47d8c7e7aba951d07e6a2145646eb4"/>
       <w:r>
         <w:rPr>
           <w:rStyle w:val="SectionNumber"/>
@@ -41866,7 +42324,7 @@
         </w:rPr>
         <w:t xml:space="preserve">Before you rerun an example</w:t>
       </w:r>
-      <w:bookmarkEnd w:id="342"/>
+      <w:bookmarkEnd w:id="344"/>
     </w:p>
     <w:p>
       <w:pPr>
@@ -41894,7 +42352,7 @@
       <w:pPr>
         <w:pStyle w:val="Heading2"/>
       </w:pPr>
-      <w:bookmarkStart w:id="343" w:name="_21bd78632142afcd25484709307580c6d6c6d3a"/>
+      <w:bookmarkStart w:id="345" w:name="_21bd78632142afcd25484709307580c6d6c6d3a"/>
       <w:r>
         <w:rPr>
           <w:rStyle w:val="SectionNumber"/>
@@ -41911,7 +42369,7 @@
         </w:rPr>
         <w:t xml:space="preserve">Iris exploration</w:t>
       </w:r>
-      <w:bookmarkEnd w:id="343"/>
+      <w:bookmarkEnd w:id="345"/>
     </w:p>
     <w:p>
       <w:pPr>
@@ -42174,7 +42632,7 @@
       <w:pPr>
         <w:pStyle w:val="Heading2"/>
       </w:pPr>
-      <w:bookmarkStart w:id="344" w:name="_d3b62668685501de97beecafc9cd547dc14a656"/>
+      <w:bookmarkStart w:id="346" w:name="_d3b62668685501de97beecafc9cd547dc14a656"/>
       <w:r>
         <w:rPr>
           <w:rStyle w:val="SectionNumber"/>
@@ -42191,7 +42649,7 @@
         </w:rPr>
         <w:t xml:space="preserve">Air quality - clean and compare</w:t>
       </w:r>
-      <w:bookmarkEnd w:id="344"/>
+      <w:bookmarkEnd w:id="346"/>
     </w:p>
     <w:p>
       <w:pPr>
@@ -42454,7 +42912,7 @@
       <w:pPr>
         <w:pStyle w:val="Heading2"/>
       </w:pPr>
-      <w:bookmarkStart w:id="345" w:name="_dcfa5c34d6d37ee3b76e8b0ea5e5fc39240e133"/>
+      <w:bookmarkStart w:id="347" w:name="_dcfa5c34d6d37ee3b76e8b0ea5e5fc39240e133"/>
       <w:r>
         <w:rPr>
           <w:rStyle w:val="SectionNumber"/>
@@ -42471,7 +42929,7 @@
         </w:rPr>
         <w:t xml:space="preserve">Fuel economy model</w:t>
       </w:r>
-      <w:bookmarkEnd w:id="345"/>
+      <w:bookmarkEnd w:id="347"/>
     </w:p>
     <w:p>
       <w:pPr>
@@ -42734,7 +43192,7 @@
       <w:pPr>
         <w:pStyle w:val="Heading2"/>
       </w:pPr>
-      <w:bookmarkStart w:id="346" w:name="_7470bfd0df99295531e08b3c6e271fcadd99d5d"/>
+      <w:bookmarkStart w:id="348" w:name="_7470bfd0df99295531e08b3c6e271fcadd99d5d"/>
       <w:r>
         <w:rPr>
           <w:rStyle w:val="SectionNumber"/>
@@ -42751,7 +43209,7 @@
         </w:rPr>
         <w:t xml:space="preserve">Cars - prepare an analysis table</w:t>
       </w:r>
-      <w:bookmarkEnd w:id="346"/>
+      <w:bookmarkEnd w:id="348"/>
     </w:p>
     <w:p>
       <w:pPr>
@@ -43119,7 +43577,7 @@
       <w:pPr>
         <w:pStyle w:val="Heading2"/>
       </w:pPr>
-      <w:bookmarkStart w:id="347" w:name="_026277d2e33159d8419b6c3d75e98cd8ffe7800"/>
+      <w:bookmarkStart w:id="349" w:name="_026277d2e33159d8419b6c3d75e98cd8ffe7800"/>
       <w:r>
         <w:rPr>
           <w:rStyle w:val="SectionNumber"/>
@@ -43136,7 +43594,7 @@
         </w:rPr>
         <w:t xml:space="preserve">US states - import, join and filter</w:t>
       </w:r>
-      <w:bookmarkEnd w:id="347"/>
+      <w:bookmarkEnd w:id="349"/>
     </w:p>
     <w:p>
       <w:pPr>
@@ -43399,7 +43857,7 @@
       <w:pPr>
         <w:pStyle w:val="Heading2"/>
       </w:pPr>
-      <w:bookmarkStart w:id="348" w:name="_ca5e74b165e062aa30c877b129b60a2936d6cbd"/>
+      <w:bookmarkStart w:id="350" w:name="_ca5e74b165e062aa30c877b129b60a2936d6cbd"/>
       <w:r>
         <w:rPr>
           <w:rStyle w:val="SectionNumber"/>
@@ -43416,7 +43874,7 @@
         </w:rPr>
         <w:t xml:space="preserve">Iris - reshape and compare</w:t>
       </w:r>
-      <w:bookmarkEnd w:id="348"/>
+      <w:bookmarkEnd w:id="350"/>
     </w:p>
     <w:p>
       <w:pPr>
@@ -43721,7 +44179,7 @@
       <w:pPr>
         <w:pStyle w:val="Heading2"/>
       </w:pPr>
-      <w:bookmarkStart w:id="349" w:name="_2f95c19651bc388bebc1375c415a903a447b927"/>
+      <w:bookmarkStart w:id="351" w:name="_2f95c19651bc388bebc1375c415a903a447b927"/>
       <w:r>
         <w:rPr>
           <w:rStyle w:val="SectionNumber"/>
@@ -43738,7 +44196,7 @@
         </w:rPr>
         <w:t xml:space="preserve">Cars - rank, scale and sample</w:t>
       </w:r>
-      <w:bookmarkEnd w:id="349"/>
+      <w:bookmarkEnd w:id="351"/>
     </w:p>
     <w:p>
       <w:pPr>
@@ -44001,7 +44459,7 @@
       <w:pPr>
         <w:pStyle w:val="Heading2"/>
       </w:pPr>
-      <w:bookmarkStart w:id="350" w:name="_b987ac423c466eb2f7ed60496b3aea5071fbd45"/>
+      <w:bookmarkStart w:id="352" w:name="_b987ac423c466eb2f7ed60496b3aea5071fbd45"/>
       <w:r>
         <w:rPr>
           <w:rStyle w:val="SectionNumber"/>
@@ -44018,7 +44476,7 @@
         </w:rPr>
         <w:t xml:space="preserve">Tooth growth - descriptive analysis</w:t>
       </w:r>
-      <w:bookmarkEnd w:id="350"/>
+      <w:bookmarkEnd w:id="352"/>
     </w:p>
     <w:p>
       <w:pPr>
@@ -44365,7 +44823,7 @@
       <w:pPr>
         <w:pStyle w:val="Heading2"/>
       </w:pPr>
-      <w:bookmarkStart w:id="351" w:name="_d11b25457f88aed00a9f208d2cb5a615935a493"/>
+      <w:bookmarkStart w:id="353" w:name="_d11b25457f88aed00a9f208d2cb5a615935a493"/>
       <w:r>
         <w:rPr>
           <w:rStyle w:val="SectionNumber"/>
@@ -44382,7 +44840,7 @@
         </w:rPr>
         <w:t xml:space="preserve">Flowers - categorical chart gallery</w:t>
       </w:r>
-      <w:bookmarkEnd w:id="351"/>
+      <w:bookmarkEnd w:id="353"/>
     </w:p>
     <w:p>
       <w:pPr>
@@ -44645,7 +45103,7 @@
       <w:pPr>
         <w:pStyle w:val="Heading2"/>
       </w:pPr>
-      <w:bookmarkStart w:id="352" w:name="_f0a542b3a462c8592703810518f326ac31b23a0"/>
+      <w:bookmarkStart w:id="354" w:name="_f0a542b3a462c8592703810518f326ac31b23a0"/>
       <w:r>
         <w:rPr>
           <w:rStyle w:val="SectionNumber"/>
@@ -44662,7 +45120,7 @@
         </w:rPr>
         <w:t xml:space="preserve">Flowers - numeric chart gallery</w:t>
       </w:r>
-      <w:bookmarkEnd w:id="352"/>
+      <w:bookmarkEnd w:id="354"/>
     </w:p>
     <w:p>
       <w:pPr>
@@ -44967,7 +45425,7 @@
       <w:pPr>
         <w:pStyle w:val="Heading2"/>
       </w:pPr>
-      <w:bookmarkStart w:id="353" w:name="_3cd953742c59855a7d11034bc307f64ad2dd0b2"/>
+      <w:bookmarkStart w:id="355" w:name="_3cd953742c59855a7d11034bc307f64ad2dd0b2"/>
       <w:r>
         <w:rPr>
           <w:rStyle w:val="SectionNumber"/>
@@ -44984,7 +45442,7 @@
         </w:rPr>
         <w:t xml:space="preserve">Nottingham temperatures - time charts</w:t>
       </w:r>
-      <w:bookmarkEnd w:id="353"/>
+      <w:bookmarkEnd w:id="355"/>
     </w:p>
     <w:p>
       <w:pPr>
@@ -45226,7 +45684,7 @@
       <w:pPr>
         <w:pStyle w:val="Heading2"/>
       </w:pPr>
-      <w:bookmarkStart w:id="354" w:name="_4e8700d2bf07bb1fd6d6ff0e2a4b3da02ec4b73"/>
+      <w:bookmarkStart w:id="356" w:name="_4e8700d2bf07bb1fd6d6ff0e2a4b3da02ec4b73"/>
       <w:r>
         <w:rPr>
           <w:rStyle w:val="SectionNumber"/>
@@ -45243,7 +45701,7 @@
         </w:rPr>
         <w:t xml:space="preserve">Plant growth - compare experimental groups</w:t>
       </w:r>
-      <w:bookmarkEnd w:id="354"/>
+      <w:bookmarkEnd w:id="356"/>
     </w:p>
     <w:p>
       <w:pPr>
@@ -45506,7 +45964,7 @@
       <w:pPr>
         <w:pStyle w:val="Heading2"/>
       </w:pPr>
-      <w:bookmarkStart w:id="355" w:name="_1a5ce5e1f719502d5a4018090c6019ea0ab394f"/>
+      <w:bookmarkStart w:id="357" w:name="_1a5ce5e1f719502d5a4018090c6019ea0ab394f"/>
       <w:r>
         <w:rPr>
           <w:rStyle w:val="SectionNumber"/>
@@ -45523,7 +45981,7 @@
         </w:rPr>
         <w:t xml:space="preserve">Cars - binary outcome model</w:t>
       </w:r>
-      <w:bookmarkEnd w:id="355"/>
+      <w:bookmarkEnd w:id="357"/>
     </w:p>
     <w:p>
       <w:pPr>
@@ -45744,7 +46202,7 @@
       <w:pPr>
         <w:pStyle w:val="Heading2"/>
       </w:pPr>
-      <w:bookmarkStart w:id="356" w:name="_832ea193a7cc05b426520cab723a7144e862a2b"/>
+      <w:bookmarkStart w:id="358" w:name="_832ea193a7cc05b426520cab723a7144e862a2b"/>
       <w:r>
         <w:rPr>
           <w:rStyle w:val="SectionNumber"/>
@@ -45761,7 +46219,7 @@
         </w:rPr>
         <w:t xml:space="preserve">Loom breaks - a count model</w:t>
       </w:r>
-      <w:bookmarkEnd w:id="356"/>
+      <w:bookmarkEnd w:id="358"/>
     </w:p>
     <w:p>
       <w:pPr>
@@ -45982,7 +46440,7 @@
       <w:pPr>
         <w:pStyle w:val="Heading2"/>
       </w:pPr>
-      <w:bookmarkStart w:id="357" w:name="_4f7330b7639faf28d79d7140f2c04ba04b95e6f"/>
+      <w:bookmarkStart w:id="359" w:name="_4f7330b7639faf28d79d7140f2c04ba04b95e6f"/>
       <w:r>
         <w:rPr>
           <w:rStyle w:val="SectionNumber"/>
@@ -45999,7 +46457,7 @@
         </w:rPr>
         <w:t xml:space="preserve">Puromycin - fit a nonlinear curve</w:t>
       </w:r>
-      <w:bookmarkEnd w:id="357"/>
+      <w:bookmarkEnd w:id="359"/>
     </w:p>
     <w:p>
       <w:pPr>
@@ -46241,7 +46699,7 @@
       <w:pPr>
         <w:pStyle w:val="Heading2"/>
       </w:pPr>
-      <w:bookmarkStart w:id="358" w:name="_a8fbc4d0256962de451d24f0e7a31943b6dfff1"/>
+      <w:bookmarkStart w:id="360" w:name="_a8fbc4d0256962de451d24f0e7a31943b6dfff1"/>
       <w:r>
         <w:rPr>
           <w:rStyle w:val="SectionNumber"/>
@@ -46258,7 +46716,7 @@
         </w:rPr>
         <w:t xml:space="preserve">Flowers - multivariate structure</w:t>
       </w:r>
-      <w:bookmarkEnd w:id="358"/>
+      <w:bookmarkEnd w:id="360"/>
     </w:p>
     <w:p>
       <w:pPr>
@@ -46521,7 +46979,7 @@
       <w:pPr>
         <w:pStyle w:val="Heading2"/>
       </w:pPr>
-      <w:bookmarkStart w:id="359" w:name="_6cc249a99454fee10ba506f19ae7106e9c5dd1f"/>
+      <w:bookmarkStart w:id="361" w:name="_6cc249a99454fee10ba506f19ae7106e9c5dd1f"/>
       <w:r>
         <w:rPr>
           <w:rStyle w:val="SectionNumber"/>
@@ -46538,7 +46996,7 @@
         </w:rPr>
         <w:t xml:space="preserve">Lung cancer - survival analysis</w:t>
       </w:r>
-      <w:bookmarkEnd w:id="359"/>
+      <w:bookmarkEnd w:id="361"/>
     </w:p>
     <w:p>
       <w:pPr>
@@ -46780,7 +47238,7 @@
       <w:pPr>
         <w:pStyle w:val="Heading2"/>
       </w:pPr>
-      <w:bookmarkStart w:id="360" w:name="_cbe2f34be92d7e3bc3f13f0aa6a7860a9e25176"/>
+      <w:bookmarkStart w:id="362" w:name="_cbe2f34be92d7e3bc3f13f0aa6a7860a9e25176"/>
       <w:r>
         <w:rPr>
           <w:rStyle w:val="SectionNumber"/>
@@ -46797,7 +47255,7 @@
         </w:rPr>
         <w:t xml:space="preserve">Air passengers - forecast a monthly series</w:t>
       </w:r>
-      <w:bookmarkEnd w:id="360"/>
+      <w:bookmarkEnd w:id="362"/>
     </w:p>
     <w:p>
       <w:pPr>
@@ -47018,7 +47476,7 @@
       <w:pPr>
         <w:pStyle w:val="Heading2"/>
       </w:pPr>
-      <w:bookmarkStart w:id="361" w:name="_e40fb31b66e496f3977fc632e1d1ff4f8a62c48"/>
+      <w:bookmarkStart w:id="363" w:name="_e40fb31b66e496f3977fc632e1d1ff4f8a62c48"/>
       <w:r>
         <w:rPr>
           <w:rStyle w:val="SectionNumber"/>
@@ -47035,7 +47493,7 @@
         </w:rPr>
         <w:t xml:space="preserve">Nile flow - distribution and stability</w:t>
       </w:r>
-      <w:bookmarkEnd w:id="361"/>
+      <w:bookmarkEnd w:id="363"/>
     </w:p>
     <w:p>
       <w:pPr>
@@ -47298,7 +47756,7 @@
       <w:pPr>
         <w:pStyle w:val="Heading2"/>
       </w:pPr>
-      <w:bookmarkStart w:id="362" w:name="_70778f1d8463281d343798cf0e564234b695bce"/>
+      <w:bookmarkStart w:id="364" w:name="_70778f1d8463281d343798cf0e564234b695bce"/>
       <w:r>
         <w:rPr>
           <w:rStyle w:val="SectionNumber"/>
@@ -47315,7 +47773,7 @@
         </w:rPr>
         <w:t xml:space="preserve">Flowers - conditional quality gate</w:t>
       </w:r>
-      <w:bookmarkEnd w:id="362"/>
+      <w:bookmarkEnd w:id="364"/>
     </w:p>
     <w:p>
       <w:pPr>
@@ -47557,7 +48015,7 @@
       <w:pPr>
         <w:pStyle w:val="Heading2"/>
       </w:pPr>
-      <w:bookmarkStart w:id="363" w:name="_d1fa91f12c85e035faea16f9886afd4c15c3390"/>
+      <w:bookmarkStart w:id="365" w:name="_d1fa91f12c85e035faea16f9886afd4c15c3390"/>
       <w:r>
         <w:rPr>
           <w:rStyle w:val="SectionNumber"/>
@@ -47574,7 +48032,7 @@
         </w:rPr>
         <w:t xml:space="preserve">Flowers - repeat by species</w:t>
       </w:r>
-      <w:bookmarkEnd w:id="363"/>
+      <w:bookmarkEnd w:id="365"/>
     </w:p>
     <w:p>
       <w:pPr>
@@ -47795,7 +48253,7 @@
       <w:pPr>
         <w:pStyle w:val="Heading2"/>
       </w:pPr>
-      <w:bookmarkStart w:id="364" w:name="_8908cf64df94c9bdbdaf8a540270b8a74acbf32"/>
+      <w:bookmarkStart w:id="366" w:name="_8908cf64df94c9bdbdaf8a540270b8a74acbf32"/>
       <w:r>
         <w:rPr>
           <w:rStyle w:val="SectionNumber"/>
@@ -47812,7 +48270,7 @@
         </w:rPr>
         <w:t xml:space="preserve">Cars - a report with an execution audit</w:t>
       </w:r>
-      <w:bookmarkEnd w:id="364"/>
+      <w:bookmarkEnd w:id="366"/>
     </w:p>
     <w:p>
       <w:pPr>
@@ -48033,7 +48491,7 @@
       <w:pPr>
         <w:pStyle w:val="Heading1"/>
       </w:pPr>
-      <w:bookmarkStart w:id="365" w:name="_5833ee26ef878f6420a537fe950547e75a3e473"/>
+      <w:bookmarkStart w:id="367" w:name="_5833ee26ef878f6420a537fe950547e75a3e473"/>
       <w:r>
         <w:rPr>
           <w:rStyle w:val="SectionNumber"/>
@@ -48050,7 +48508,7 @@
         </w:rPr>
         <w:t xml:space="preserve">Task finder</w:t>
       </w:r>
-      <w:bookmarkEnd w:id="365"/>
+      <w:bookmarkEnd w:id="367"/>
     </w:p>
     <w:p>
       <w:pPr>
@@ -51342,7 +51800,7 @@
       <w:pPr>
         <w:pStyle w:val="Heading1"/>
       </w:pPr>
-      <w:bookmarkStart w:id="366" w:name="_13322735ec75468257ef9e97ae4d15b5cbe9585"/>
+      <w:bookmarkStart w:id="368" w:name="_13322735ec75468257ef9e97ae4d15b5cbe9585"/>
       <w:r>
         <w:rPr>
           <w:rStyle w:val="SectionNumber"/>
@@ -51359,13 +51817,13 @@
         </w:rPr>
         <w:t xml:space="preserve">Shortcuts and everyday terms</w:t>
       </w:r>
-      <w:bookmarkEnd w:id="366"/>
+      <w:bookmarkEnd w:id="368"/>
     </w:p>
     <w:p>
       <w:pPr>
         <w:pStyle w:val="Heading2"/>
       </w:pPr>
-      <w:bookmarkStart w:id="367" w:name="_4e6cee15dc273795397785b8a92cb00a6fdb51b"/>
+      <w:bookmarkStart w:id="369" w:name="_4e6cee15dc273795397785b8a92cb00a6fdb51b"/>
       <w:r>
         <w:rPr>
           <w:rStyle w:val="SectionNumber"/>
@@ -51382,7 +51840,7 @@
         </w:rPr>
         <w:t xml:space="preserve">Useful Windows desktop shortcuts</w:t>
       </w:r>
-      <w:bookmarkEnd w:id="367"/>
+      <w:bookmarkEnd w:id="369"/>
     </w:p>
     <w:p>
       <w:pPr>
@@ -51864,7 +52322,7 @@
       <w:pPr>
         <w:pStyle w:val="Heading2"/>
       </w:pPr>
-      <w:bookmarkStart w:id="368" w:name="_445e238603aeeb30630e7621db1108270355771"/>
+      <w:bookmarkStart w:id="370" w:name="_445e238603aeeb30630e7621db1108270355771"/>
       <w:r>
         <w:rPr>
           <w:rStyle w:val="SectionNumber"/>
@@ -51881,7 +52339,7 @@
         </w:rPr>
         <w:t xml:space="preserve">A few more terms</w:t>
       </w:r>
-      <w:bookmarkEnd w:id="368"/>
+      <w:bookmarkEnd w:id="370"/>
     </w:p>
     <w:tbl>
       <w:tblPr>
@@ -52292,7 +52750,7 @@
       <w:pPr>
         <w:pStyle w:val="Heading2"/>
       </w:pPr>
-      <w:bookmarkStart w:id="369" w:name="_f84d4da59a23e9cd06b6ddc741eb0a23ce45774"/>
+      <w:bookmarkStart w:id="371" w:name="_f84d4da59a23e9cd06b6ddc741eb0a23ce45774"/>
       <w:r>
         <w:rPr>
           <w:rStyle w:val="SectionNumber"/>
@@ -52309,7 +52767,7 @@
         </w:rPr>
         <w:t xml:space="preserve">Public downloads and help</w:t>
       </w:r>
-      <w:bookmarkEnd w:id="369"/>
+      <w:bookmarkEnd w:id="371"/>
     </w:p>
     <w:p>
       <w:pPr>
@@ -52373,7 +52831,7 @@
             <w:rStyle w:val="Hyperlink"/>
             <w:lang w:val="en-CA"/>
           </w:rPr>
-          <w:t xml:space="preserve">Release 0.6.0</w:t>
+          <w:t xml:space="preserve">Release 0.7.0</w:t>
         </w:r>
       </w:hyperlink>
       <w:r>
@@ -52391,7 +52849,7 @@
           <w:numId w:val="1097"/>
         </w:numPr>
       </w:pPr>
-      <w:hyperlink r:id="rId324">
+      <w:hyperlink r:id="rId326">
         <w:r>
           <w:rPr>
             <w:rStyle w:val="Hyperlink"/>
@@ -52415,7 +52873,7 @@
           <w:numId w:val="1097"/>
         </w:numPr>
       </w:pPr>
-      <w:hyperlink r:id="rId327">
+      <w:hyperlink r:id="rId329">
         <w:r>
           <w:rPr>
             <w:rStyle w:val="Hyperlink"/>
@@ -52439,7 +52897,7 @@
           <w:numId w:val="1097"/>
         </w:numPr>
       </w:pPr>
-      <w:hyperlink r:id="rId330">
+      <w:hyperlink r:id="rId332">
         <w:r>
           <w:rPr>
             <w:rStyle w:val="Hyperlink"/>

</xml_diff>